<commit_message>
suzukis doksi utolsó módosítás
</commit_message>
<xml_diff>
--- a/public/images/Suzuki menedzser tajekoztato 45 alattiaknak.docx
+++ b/public/images/Suzuki menedzser tajekoztato 45 alattiaknak.docx
@@ -15,20 +15,103 @@
       </w:pPr>
       <w:r>
         <w:rPr>
+          <w:noProof/>
+        </w:rPr>
+        <w:pict w14:anchorId="6ECE8870">
+          <v:shapetype id="_x0000_t75" coordsize="21600,21600" o:spt="75" o:preferrelative="t" path="m@4@5l@4@11@9@11@9@5xe" filled="f" stroked="f">
+            <v:stroke joinstyle="miter"/>
+            <v:formulas>
+              <v:f eqn="if lineDrawn pixelLineWidth 0"/>
+              <v:f eqn="sum @0 1 0"/>
+              <v:f eqn="sum 0 0 @1"/>
+              <v:f eqn="prod @2 1 2"/>
+              <v:f eqn="prod @3 21600 pixelWidth"/>
+              <v:f eqn="prod @3 21600 pixelHeight"/>
+              <v:f eqn="sum @0 0 1"/>
+              <v:f eqn="prod @6 1 2"/>
+              <v:f eqn="prod @7 21600 pixelWidth"/>
+              <v:f eqn="sum @8 21600 0"/>
+              <v:f eqn="prod @7 21600 pixelHeight"/>
+              <v:f eqn="sum @10 21600 0"/>
+            </v:formulas>
+            <v:path o:extrusionok="f" gradientshapeok="t" o:connecttype="rect"/>
+            <o:lock v:ext="edit" aspectratio="t"/>
+          </v:shapetype>
+          <v:shape id="_x0000_s1028" type="#_x0000_t75" style="position:absolute;left:0;text-align:left;margin-left:218.55pt;margin-top:7pt;width:223.5pt;height:49.5pt;z-index:-251657216">
+            <v:imagedata r:id="rId7" o:title="horizontal"/>
+          </v:shape>
+        </w:pict>
+      </w:r>
+      <w:r>
+        <w:rPr>
+          <w:noProof/>
+        </w:rPr>
+        <w:pict w14:anchorId="3A19C9EA">
+          <v:shape id="_x0000_s1031" type="#_x0000_t75" style="position:absolute;left:0;text-align:left;margin-left:33.3pt;margin-top:-2.75pt;width:176.25pt;height:71.25pt;z-index:-251651072">
+            <v:imagedata r:id="rId8" o:title="HMM_logo (11)"/>
+          </v:shape>
+        </w:pict>
+      </w:r>
+    </w:p>
+    <w:p>
+      <w:pPr>
+        <w:pStyle w:val="Szvegtrzs"/>
+        <w:spacing w:line="276" w:lineRule="auto"/>
+        <w:ind w:left="0" w:firstLine="0"/>
+        <w:jc w:val="center"/>
+        <w:rPr>
           <w:rFonts w:asciiTheme="minorHAnsi" w:hAnsiTheme="minorHAnsi" w:cstheme="minorHAnsi"/>
           <w:b/>
-        </w:rPr>
-        <w:t>Tisztelt (hívja meg a nevet</w:t>
-      </w:r>
-      <w:proofErr w:type="gramStart"/>
-      <w:r>
+          <w:sz w:val="32"/>
+        </w:rPr>
+      </w:pPr>
+    </w:p>
+    <w:p>
+      <w:pPr>
+        <w:pStyle w:val="Szvegtrzs"/>
+        <w:spacing w:line="276" w:lineRule="auto"/>
+        <w:ind w:left="0" w:firstLine="0"/>
+        <w:jc w:val="center"/>
         <w:rPr>
           <w:rFonts w:asciiTheme="minorHAnsi" w:hAnsiTheme="minorHAnsi" w:cstheme="minorHAnsi"/>
           <w:b/>
-        </w:rPr>
-        <w:t>) !</w:t>
-      </w:r>
-      <w:proofErr w:type="gramEnd"/>
+          <w:sz w:val="32"/>
+        </w:rPr>
+      </w:pPr>
+    </w:p>
+    <w:p>
+      <w:pPr>
+        <w:pStyle w:val="Szvegtrzs"/>
+        <w:spacing w:line="276" w:lineRule="auto"/>
+        <w:ind w:left="0" w:firstLine="0"/>
+        <w:jc w:val="center"/>
+        <w:rPr>
+          <w:rFonts w:asciiTheme="minorHAnsi" w:hAnsiTheme="minorHAnsi" w:cstheme="minorHAnsi"/>
+          <w:b/>
+          <w:sz w:val="32"/>
+        </w:rPr>
+      </w:pPr>
+    </w:p>
+    <w:p>
+      <w:pPr>
+        <w:pStyle w:val="Szvegtrzs"/>
+        <w:spacing w:line="276" w:lineRule="auto"/>
+        <w:ind w:left="0" w:firstLine="0"/>
+        <w:jc w:val="center"/>
+        <w:rPr>
+          <w:rFonts w:asciiTheme="minorHAnsi" w:hAnsiTheme="minorHAnsi" w:cstheme="minorHAnsi"/>
+          <w:b/>
+          <w:sz w:val="32"/>
+        </w:rPr>
+      </w:pPr>
+      <w:r>
+        <w:rPr>
+          <w:rFonts w:asciiTheme="minorHAnsi" w:hAnsiTheme="minorHAnsi" w:cstheme="minorHAnsi"/>
+          <w:b/>
+          <w:sz w:val="32"/>
+        </w:rPr>
+        <w:t>Tisztelt Hölgyem/Uram!</w:t>
+      </w:r>
     </w:p>
     <w:p>
       <w:pPr>
@@ -45,7 +128,7 @@
     <w:p>
       <w:pPr>
         <w:spacing w:line="276" w:lineRule="auto"/>
-        <w:jc w:val="both"/>
+        <w:jc w:val="center"/>
         <w:rPr>
           <w:rFonts w:asciiTheme="minorHAnsi" w:hAnsiTheme="minorHAnsi" w:cstheme="minorHAnsi"/>
           <w:sz w:val="24"/>
@@ -60,7 +143,16 @@
           <w:szCs w:val="24"/>
           <w:shd w:val="clear" w:color="auto" w:fill="FFFFFF"/>
         </w:rPr>
-        <w:t xml:space="preserve">Köszönjük, hogy a Hungária </w:t>
+        <w:t>K</w:t>
+      </w:r>
+      <w:r>
+        <w:rPr>
+          <w:rFonts w:asciiTheme="minorHAnsi" w:hAnsiTheme="minorHAnsi" w:cstheme="minorHAnsi"/>
+          <w:sz w:val="24"/>
+          <w:szCs w:val="24"/>
+          <w:shd w:val="clear" w:color="auto" w:fill="FFFFFF"/>
+        </w:rPr>
+        <w:t xml:space="preserve">öszönjük, hogy a Hungária </w:t>
       </w:r>
       <w:proofErr w:type="spellStart"/>
       <w:r>
@@ -80,13 +172,22 @@
           <w:szCs w:val="24"/>
           <w:shd w:val="clear" w:color="auto" w:fill="FFFFFF"/>
         </w:rPr>
-        <w:t xml:space="preserve">-M. szolgáltatását választotta.  </w:t>
+        <w:t>-M Kft.</w:t>
+      </w:r>
+      <w:r>
+        <w:rPr>
+          <w:rFonts w:asciiTheme="minorHAnsi" w:hAnsiTheme="minorHAnsi" w:cstheme="minorHAnsi"/>
+          <w:sz w:val="24"/>
+          <w:szCs w:val="24"/>
+          <w:shd w:val="clear" w:color="auto" w:fill="FFFFFF"/>
+        </w:rPr>
+        <w:t xml:space="preserve"> szolgáltatását választotta.</w:t>
       </w:r>
     </w:p>
     <w:p>
       <w:pPr>
         <w:spacing w:line="276" w:lineRule="auto"/>
-        <w:jc w:val="both"/>
+        <w:jc w:val="center"/>
         <w:rPr>
           <w:rFonts w:asciiTheme="minorHAnsi" w:hAnsiTheme="minorHAnsi" w:cstheme="minorHAnsi"/>
           <w:sz w:val="24"/>
@@ -98,7 +199,7 @@
     <w:p>
       <w:pPr>
         <w:spacing w:line="276" w:lineRule="auto"/>
-        <w:jc w:val="both"/>
+        <w:jc w:val="center"/>
         <w:rPr>
           <w:rFonts w:asciiTheme="minorHAnsi" w:hAnsiTheme="minorHAnsi" w:cstheme="minorHAnsi"/>
           <w:sz w:val="24"/>
@@ -113,8 +214,10 @@
           <w:szCs w:val="24"/>
           <w:shd w:val="clear" w:color="auto" w:fill="FFFFFF"/>
         </w:rPr>
-        <w:t xml:space="preserve">Ezúton tájékoztatjuk, hogy időpontfoglalása sikeresen megtörtént. </w:t>
-      </w:r>
+        <w:t>Ezúton tájékoztatjuk, hogy időpontfoglalása sikeresen megtörtént.</w:t>
+      </w:r>
+      <w:bookmarkStart w:id="0" w:name="_GoBack"/>
+      <w:bookmarkEnd w:id="0"/>
     </w:p>
     <w:p>
       <w:pPr>
@@ -189,17 +292,8 @@
           <w:rFonts w:asciiTheme="minorHAnsi" w:hAnsiTheme="minorHAnsi" w:cstheme="minorHAnsi"/>
           <w:sz w:val="24"/>
           <w:szCs w:val="24"/>
-          <w:shd w:val="clear" w:color="auto" w:fill="FFFFFF"/>
-        </w:rPr>
-      </w:pPr>
-      <w:r>
-        <w:rPr>
-          <w:rFonts w:asciiTheme="minorHAnsi" w:hAnsiTheme="minorHAnsi" w:cstheme="minorHAnsi"/>
-          <w:sz w:val="24"/>
-          <w:szCs w:val="24"/>
-        </w:rPr>
-        <w:br/>
-      </w:r>
+        </w:rPr>
+      </w:pPr>
       <w:r>
         <w:rPr>
           <w:rFonts w:asciiTheme="minorHAnsi" w:hAnsiTheme="minorHAnsi" w:cstheme="minorHAnsi"/>
@@ -240,14 +334,6 @@
           <w:shd w:val="clear" w:color="auto" w:fill="FFFFFF"/>
         </w:rPr>
       </w:pPr>
-      <w:r>
-        <w:rPr>
-          <w:rFonts w:asciiTheme="minorHAnsi" w:hAnsiTheme="minorHAnsi" w:cstheme="minorHAnsi"/>
-          <w:sz w:val="24"/>
-          <w:szCs w:val="24"/>
-        </w:rPr>
-        <w:br/>
-      </w:r>
     </w:p>
     <w:p>
       <w:pPr>
@@ -740,18 +826,7 @@
           <w:szCs w:val="24"/>
           <w:shd w:val="clear" w:color="auto" w:fill="FFFFFF"/>
         </w:rPr>
-        <w:t>A bejelentkezést követően a foglalásról egy megerősítő e-mailt küld a rendszer, mely tartalmazza a foglalássa</w:t>
-      </w:r>
-      <w:bookmarkStart w:id="0" w:name="_GoBack"/>
-      <w:bookmarkEnd w:id="0"/>
-      <w:r>
-        <w:rPr>
-          <w:rFonts w:asciiTheme="minorHAnsi" w:hAnsiTheme="minorHAnsi" w:cstheme="minorHAnsi"/>
-          <w:sz w:val="24"/>
-          <w:szCs w:val="24"/>
-          <w:shd w:val="clear" w:color="auto" w:fill="FFFFFF"/>
-        </w:rPr>
-        <w:t xml:space="preserve">l és a vizsgálatokkal kapcsolatos </w:t>
+        <w:t xml:space="preserve">A bejelentkezést követően a foglalásról egy megerősítő e-mailt küld a rendszer, mely tartalmazza a foglalással és a vizsgálatokkal kapcsolatos </w:t>
       </w:r>
       <w:proofErr w:type="gramStart"/>
       <w:r>
@@ -1421,7 +1496,7 @@
         </w:rPr>
         <w:t xml:space="preserve"> jelezzen a </w:t>
       </w:r>
-      <w:hyperlink r:id="rId5" w:history="1">
+      <w:hyperlink r:id="rId9" w:history="1">
         <w:r>
           <w:rPr>
             <w:rStyle w:val="Hiperhivatkozs"/>
@@ -1536,9 +1611,10 @@
           <w:szCs w:val="24"/>
         </w:rPr>
         <w:sectPr>
+          <w:headerReference w:type="default" r:id="rId10"/>
           <w:type w:val="continuous"/>
           <w:pgSz w:w="11910" w:h="16840"/>
-          <w:pgMar w:top="940" w:right="1280" w:bottom="280" w:left="1134" w:header="708" w:footer="708" w:gutter="0"/>
+          <w:pgMar w:top="940" w:right="1280" w:bottom="280" w:left="1134" w:header="0" w:footer="708" w:gutter="0"/>
           <w:cols w:space="708"/>
         </w:sectPr>
       </w:pPr>
@@ -2140,55 +2216,114 @@
         <w:tabs>
           <w:tab w:val="left" w:pos="856"/>
         </w:tabs>
+        <w:spacing w:before="9" w:line="355" w:lineRule="auto"/>
+        <w:ind w:right="136"/>
+        <w:rPr>
+          <w:rFonts w:asciiTheme="minorHAnsi" w:hAnsiTheme="minorHAnsi" w:cstheme="minorHAnsi"/>
+          <w:sz w:val="24"/>
+          <w:szCs w:val="24"/>
+        </w:rPr>
+      </w:pPr>
+      <w:r>
+        <w:rPr>
+          <w:rFonts w:asciiTheme="minorHAnsi" w:hAnsiTheme="minorHAnsi" w:cstheme="minorHAnsi"/>
+          <w:sz w:val="24"/>
+          <w:szCs w:val="24"/>
+        </w:rPr>
+        <w:t>Laborcsomagja tartalmaz vizeletvizsgálatot. A minta</w:t>
+      </w:r>
+      <w:r>
+        <w:rPr>
+          <w:rFonts w:asciiTheme="minorHAnsi" w:hAnsiTheme="minorHAnsi" w:cstheme="minorHAnsi"/>
+          <w:sz w:val="24"/>
+          <w:szCs w:val="24"/>
+        </w:rPr>
+        <w:t xml:space="preserve"> leadása a rendelőben csak az ultrahang vizsgálatok elvégzését követően</w:t>
+      </w:r>
+      <w:r>
+        <w:rPr>
+          <w:rFonts w:asciiTheme="minorHAnsi" w:hAnsiTheme="minorHAnsi" w:cstheme="minorHAnsi"/>
+          <w:spacing w:val="1"/>
+          <w:sz w:val="24"/>
+          <w:szCs w:val="24"/>
+        </w:rPr>
+        <w:t xml:space="preserve"> </w:t>
+      </w:r>
+      <w:r>
+        <w:rPr>
+          <w:rFonts w:asciiTheme="minorHAnsi" w:hAnsiTheme="minorHAnsi" w:cstheme="minorHAnsi"/>
+          <w:sz w:val="24"/>
+          <w:szCs w:val="24"/>
+        </w:rPr>
+        <w:t>lehetséges</w:t>
+      </w:r>
+      <w:r>
+        <w:rPr>
+          <w:rFonts w:asciiTheme="minorHAnsi" w:hAnsiTheme="minorHAnsi" w:cstheme="minorHAnsi"/>
+          <w:sz w:val="24"/>
+          <w:szCs w:val="24"/>
+        </w:rPr>
+        <w:t xml:space="preserve">, az ehhez szükséges eszközöket laboros kolléganőink adják át a vérvételt követően. </w:t>
+      </w:r>
+      <w:r>
+        <w:rPr>
+          <w:rFonts w:asciiTheme="minorHAnsi" w:hAnsiTheme="minorHAnsi" w:cstheme="minorHAnsi"/>
+          <w:sz w:val="24"/>
+          <w:szCs w:val="24"/>
+        </w:rPr>
+        <w:t xml:space="preserve">Vizeletes csövet ezen felül </w:t>
+      </w:r>
+      <w:proofErr w:type="spellStart"/>
+      <w:r>
+        <w:rPr>
+          <w:rFonts w:asciiTheme="minorHAnsi" w:hAnsiTheme="minorHAnsi" w:cstheme="minorHAnsi"/>
+          <w:sz w:val="24"/>
+          <w:szCs w:val="24"/>
+        </w:rPr>
+        <w:t>Teberi</w:t>
+      </w:r>
+      <w:proofErr w:type="spellEnd"/>
+      <w:r>
+        <w:rPr>
+          <w:rFonts w:asciiTheme="minorHAnsi" w:hAnsiTheme="minorHAnsi" w:cstheme="minorHAnsi"/>
+          <w:sz w:val="24"/>
+          <w:szCs w:val="24"/>
+        </w:rPr>
+        <w:t xml:space="preserve"> Andrea </w:t>
+      </w:r>
+      <w:proofErr w:type="gramStart"/>
+      <w:r>
+        <w:rPr>
+          <w:rFonts w:asciiTheme="minorHAnsi" w:hAnsiTheme="minorHAnsi" w:cstheme="minorHAnsi"/>
+          <w:sz w:val="24"/>
+          <w:szCs w:val="24"/>
+        </w:rPr>
+        <w:t>kolléga</w:t>
+      </w:r>
+      <w:proofErr w:type="gramEnd"/>
+      <w:r>
+        <w:rPr>
+          <w:rFonts w:asciiTheme="minorHAnsi" w:hAnsiTheme="minorHAnsi" w:cstheme="minorHAnsi"/>
+          <w:sz w:val="24"/>
+          <w:szCs w:val="24"/>
+        </w:rPr>
+        <w:t>nőjétől, a HR osztályon tud kérni.</w:t>
+      </w:r>
+    </w:p>
+    <w:p>
+      <w:pPr>
+        <w:pStyle w:val="Listaszerbekezds"/>
+        <w:tabs>
+          <w:tab w:val="left" w:pos="856"/>
+        </w:tabs>
         <w:spacing w:before="9" w:line="276" w:lineRule="auto"/>
-        <w:ind w:right="136"/>
-        <w:rPr>
-          <w:rFonts w:asciiTheme="minorHAnsi" w:hAnsiTheme="minorHAnsi" w:cstheme="minorHAnsi"/>
-          <w:sz w:val="24"/>
-          <w:szCs w:val="24"/>
-        </w:rPr>
-      </w:pPr>
-      <w:r>
-        <w:rPr>
-          <w:rFonts w:asciiTheme="minorHAnsi" w:hAnsiTheme="minorHAnsi" w:cstheme="minorHAnsi"/>
-          <w:sz w:val="24"/>
-          <w:szCs w:val="24"/>
-        </w:rPr>
-        <w:t>Laborcsomagja tartalmaz vizeletvizsgálatot. A minta</w:t>
-      </w:r>
-      <w:r>
-        <w:rPr>
-          <w:rFonts w:asciiTheme="minorHAnsi" w:hAnsiTheme="minorHAnsi" w:cstheme="minorHAnsi"/>
-          <w:sz w:val="24"/>
-          <w:szCs w:val="24"/>
-        </w:rPr>
-        <w:t xml:space="preserve"> leadása a rendelőben csak az ultrahang vizsgálatok elvégzését követően</w:t>
-      </w:r>
-      <w:r>
-        <w:rPr>
-          <w:rFonts w:asciiTheme="minorHAnsi" w:hAnsiTheme="minorHAnsi" w:cstheme="minorHAnsi"/>
-          <w:spacing w:val="1"/>
-          <w:sz w:val="24"/>
-          <w:szCs w:val="24"/>
-        </w:rPr>
-        <w:t xml:space="preserve"> </w:t>
-      </w:r>
-      <w:r>
-        <w:rPr>
-          <w:rFonts w:asciiTheme="minorHAnsi" w:hAnsiTheme="minorHAnsi" w:cstheme="minorHAnsi"/>
-          <w:sz w:val="24"/>
-          <w:szCs w:val="24"/>
-        </w:rPr>
-        <w:t>lehetséges</w:t>
-      </w:r>
-      <w:r>
-        <w:rPr>
-          <w:rFonts w:asciiTheme="minorHAnsi" w:hAnsiTheme="minorHAnsi" w:cstheme="minorHAnsi"/>
-          <w:sz w:val="24"/>
-          <w:szCs w:val="24"/>
-        </w:rPr>
-        <w:t xml:space="preserve">, az ehhez szükséges eszközöket laboros kolléganőink adják át a vérvételt követően. </w:t>
-      </w:r>
+        <w:ind w:left="720" w:right="136" w:firstLine="0"/>
+        <w:rPr>
+          <w:rFonts w:asciiTheme="minorHAnsi" w:hAnsiTheme="minorHAnsi" w:cstheme="minorHAnsi"/>
+          <w:sz w:val="24"/>
+          <w:szCs w:val="24"/>
+        </w:rPr>
+      </w:pPr>
     </w:p>
     <w:p>
       <w:pPr>
@@ -2847,6 +2982,16 @@
           <w:szCs w:val="24"/>
         </w:rPr>
       </w:pPr>
+      <w:r>
+        <w:rPr>
+          <w:noProof/>
+        </w:rPr>
+        <w:pict w14:anchorId="6F6E3C90">
+          <v:shape id="_x0000_s1030" type="#_x0000_t75" style="position:absolute;left:0;text-align:left;margin-left:-55.95pt;margin-top:161.4pt;width:251.15pt;height:348pt;z-index:-251653120">
+            <v:imagedata r:id="rId11" o:title="HMM_piktogram_red"/>
+          </v:shape>
+        </w:pict>
+      </w:r>
     </w:p>
     <w:sectPr>
       <w:pgSz w:w="11910" w:h="16840"/>
@@ -2857,9 +3002,253 @@
 </w:document>
 </file>
 
+<file path=word/endnotes.xml><?xml version="1.0" encoding="utf-8"?>
+<w:endnotes xmlns:wpc="http://schemas.microsoft.com/office/word/2010/wordprocessingCanvas" xmlns:cx="http://schemas.microsoft.com/office/drawing/2014/chartex" xmlns:mc="http://schemas.openxmlformats.org/markup-compatibility/2006" xmlns:o="urn:schemas-microsoft-com:office:office" xmlns:r="http://schemas.openxmlformats.org/officeDocument/2006/relationships" xmlns:m="http://schemas.openxmlformats.org/officeDocument/2006/math" xmlns:v="urn:schemas-microsoft-com:vml" xmlns:wp14="http://schemas.microsoft.com/office/word/2010/wordprocessingDrawing" xmlns:wp="http://schemas.openxmlformats.org/drawingml/2006/wordprocessingDrawing" xmlns:w10="urn:schemas-microsoft-com:office:word" xmlns:w="http://schemas.openxmlformats.org/wordprocessingml/2006/main" xmlns:w14="http://schemas.microsoft.com/office/word/2010/wordml" xmlns:w15="http://schemas.microsoft.com/office/word/2012/wordml" xmlns:w16se="http://schemas.microsoft.com/office/word/2015/wordml/symex" xmlns:wpg="http://schemas.microsoft.com/office/word/2010/wordprocessingGroup" xmlns:wpi="http://schemas.microsoft.com/office/word/2010/wordprocessingInk" xmlns:wne="http://schemas.microsoft.com/office/word/2006/wordml" xmlns:wps="http://schemas.microsoft.com/office/word/2010/wordprocessingShape" mc:Ignorable="w14 w15 w16se wp14">
+  <w:endnote w:type="separator" w:id="-1">
+    <w:p>
+      <w:r>
+        <w:separator/>
+      </w:r>
+    </w:p>
+  </w:endnote>
+  <w:endnote w:type="continuationSeparator" w:id="0">
+    <w:p>
+      <w:r>
+        <w:continuationSeparator/>
+      </w:r>
+    </w:p>
+  </w:endnote>
+</w:endnotes>
+</file>
+
+<file path=word/footnotes.xml><?xml version="1.0" encoding="utf-8"?>
+<w:footnotes xmlns:wpc="http://schemas.microsoft.com/office/word/2010/wordprocessingCanvas" xmlns:cx="http://schemas.microsoft.com/office/drawing/2014/chartex" xmlns:mc="http://schemas.openxmlformats.org/markup-compatibility/2006" xmlns:o="urn:schemas-microsoft-com:office:office" xmlns:r="http://schemas.openxmlformats.org/officeDocument/2006/relationships" xmlns:m="http://schemas.openxmlformats.org/officeDocument/2006/math" xmlns:v="urn:schemas-microsoft-com:vml" xmlns:wp14="http://schemas.microsoft.com/office/word/2010/wordprocessingDrawing" xmlns:wp="http://schemas.openxmlformats.org/drawingml/2006/wordprocessingDrawing" xmlns:w10="urn:schemas-microsoft-com:office:word" xmlns:w="http://schemas.openxmlformats.org/wordprocessingml/2006/main" xmlns:w14="http://schemas.microsoft.com/office/word/2010/wordml" xmlns:w15="http://schemas.microsoft.com/office/word/2012/wordml" xmlns:w16se="http://schemas.microsoft.com/office/word/2015/wordml/symex" xmlns:wpg="http://schemas.microsoft.com/office/word/2010/wordprocessingGroup" xmlns:wpi="http://schemas.microsoft.com/office/word/2010/wordprocessingInk" xmlns:wne="http://schemas.microsoft.com/office/word/2006/wordml" xmlns:wps="http://schemas.microsoft.com/office/word/2010/wordprocessingShape" mc:Ignorable="w14 w15 w16se wp14">
+  <w:footnote w:type="separator" w:id="-1">
+    <w:p>
+      <w:r>
+        <w:separator/>
+      </w:r>
+    </w:p>
+  </w:footnote>
+  <w:footnote w:type="continuationSeparator" w:id="0">
+    <w:p>
+      <w:r>
+        <w:continuationSeparator/>
+      </w:r>
+    </w:p>
+  </w:footnote>
+</w:footnotes>
+</file>
+
+<file path=word/header1.xml><?xml version="1.0" encoding="utf-8"?>
+<w:hdr xmlns:wpc="http://schemas.microsoft.com/office/word/2010/wordprocessingCanvas" xmlns:cx="http://schemas.microsoft.com/office/drawing/2014/chartex" xmlns:mc="http://schemas.openxmlformats.org/markup-compatibility/2006" xmlns:o="urn:schemas-microsoft-com:office:office" xmlns:r="http://schemas.openxmlformats.org/officeDocument/2006/relationships" xmlns:m="http://schemas.openxmlformats.org/officeDocument/2006/math" xmlns:v="urn:schemas-microsoft-com:vml" xmlns:wp14="http://schemas.microsoft.com/office/word/2010/wordprocessingDrawing" xmlns:wp="http://schemas.openxmlformats.org/drawingml/2006/wordprocessingDrawing" xmlns:w10="urn:schemas-microsoft-com:office:word" xmlns:w="http://schemas.openxmlformats.org/wordprocessingml/2006/main" xmlns:w14="http://schemas.microsoft.com/office/word/2010/wordml" xmlns:w15="http://schemas.microsoft.com/office/word/2012/wordml" xmlns:w16se="http://schemas.microsoft.com/office/word/2015/wordml/symex" xmlns:wpg="http://schemas.microsoft.com/office/word/2010/wordprocessingGroup" xmlns:wpi="http://schemas.microsoft.com/office/word/2010/wordprocessingInk" xmlns:wne="http://schemas.microsoft.com/office/word/2006/wordml" xmlns:wps="http://schemas.microsoft.com/office/word/2010/wordprocessingShape" mc:Ignorable="w14 w15 w16se wp14">
+  <w:p>
+    <w:pPr>
+      <w:pStyle w:val="lfej"/>
+      <w:ind w:left="-1134"/>
+    </w:pPr>
+  </w:p>
+</w:hdr>
+</file>
+
 <file path=word/numbering.xml><?xml version="1.0" encoding="utf-8"?>
 <w:numbering xmlns:wpc="http://schemas.microsoft.com/office/word/2010/wordprocessingCanvas" xmlns:cx="http://schemas.microsoft.com/office/drawing/2014/chartex" xmlns:mc="http://schemas.openxmlformats.org/markup-compatibility/2006" xmlns:o="urn:schemas-microsoft-com:office:office" xmlns:r="http://schemas.openxmlformats.org/officeDocument/2006/relationships" xmlns:m="http://schemas.openxmlformats.org/officeDocument/2006/math" xmlns:v="urn:schemas-microsoft-com:vml" xmlns:wp14="http://schemas.microsoft.com/office/word/2010/wordprocessingDrawing" xmlns:wp="http://schemas.openxmlformats.org/drawingml/2006/wordprocessingDrawing" xmlns:w10="urn:schemas-microsoft-com:office:word" xmlns:w="http://schemas.openxmlformats.org/wordprocessingml/2006/main" xmlns:w14="http://schemas.microsoft.com/office/word/2010/wordml" xmlns:w15="http://schemas.microsoft.com/office/word/2012/wordml" xmlns:w16se="http://schemas.microsoft.com/office/word/2015/wordml/symex" xmlns:wpg="http://schemas.microsoft.com/office/word/2010/wordprocessingGroup" xmlns:wpi="http://schemas.microsoft.com/office/word/2010/wordprocessingInk" xmlns:wne="http://schemas.microsoft.com/office/word/2006/wordml" xmlns:wps="http://schemas.microsoft.com/office/word/2010/wordprocessingShape" mc:Ignorable="w14 w15 w16se wp14">
   <w:abstractNum w:abstractNumId="0" w15:restartNumberingAfterBreak="0">
+    <w:nsid w:val="FFFFFF7C"/>
+    <w:multiLevelType w:val="singleLevel"/>
+    <w:tmpl w:val="091CEECE"/>
+    <w:lvl w:ilvl="0">
+      <w:start w:val="1"/>
+      <w:numFmt w:val="decimal"/>
+      <w:pStyle w:val="Szmozottlista5"/>
+      <w:lvlText w:val="%1."/>
+      <w:lvlJc w:val="left"/>
+      <w:pPr>
+        <w:tabs>
+          <w:tab w:val="num" w:pos="1492"/>
+        </w:tabs>
+        <w:ind w:left="1492" w:hanging="360"/>
+      </w:pPr>
+    </w:lvl>
+  </w:abstractNum>
+  <w:abstractNum w:abstractNumId="1" w15:restartNumberingAfterBreak="0">
+    <w:nsid w:val="FFFFFF7D"/>
+    <w:multiLevelType w:val="singleLevel"/>
+    <w:tmpl w:val="186EB704"/>
+    <w:lvl w:ilvl="0">
+      <w:start w:val="1"/>
+      <w:numFmt w:val="decimal"/>
+      <w:pStyle w:val="Szmozottlista4"/>
+      <w:lvlText w:val="%1."/>
+      <w:lvlJc w:val="left"/>
+      <w:pPr>
+        <w:tabs>
+          <w:tab w:val="num" w:pos="1209"/>
+        </w:tabs>
+        <w:ind w:left="1209" w:hanging="360"/>
+      </w:pPr>
+    </w:lvl>
+  </w:abstractNum>
+  <w:abstractNum w:abstractNumId="2" w15:restartNumberingAfterBreak="0">
+    <w:nsid w:val="FFFFFF7E"/>
+    <w:multiLevelType w:val="singleLevel"/>
+    <w:tmpl w:val="7D883EE8"/>
+    <w:lvl w:ilvl="0">
+      <w:start w:val="1"/>
+      <w:numFmt w:val="decimal"/>
+      <w:pStyle w:val="Szmozottlista3"/>
+      <w:lvlText w:val="%1."/>
+      <w:lvlJc w:val="left"/>
+      <w:pPr>
+        <w:tabs>
+          <w:tab w:val="num" w:pos="926"/>
+        </w:tabs>
+        <w:ind w:left="926" w:hanging="360"/>
+      </w:pPr>
+    </w:lvl>
+  </w:abstractNum>
+  <w:abstractNum w:abstractNumId="3" w15:restartNumberingAfterBreak="0">
+    <w:nsid w:val="FFFFFF7F"/>
+    <w:multiLevelType w:val="singleLevel"/>
+    <w:tmpl w:val="46406C36"/>
+    <w:lvl w:ilvl="0">
+      <w:start w:val="1"/>
+      <w:numFmt w:val="decimal"/>
+      <w:pStyle w:val="Szmozottlista2"/>
+      <w:lvlText w:val="%1."/>
+      <w:lvlJc w:val="left"/>
+      <w:pPr>
+        <w:tabs>
+          <w:tab w:val="num" w:pos="643"/>
+        </w:tabs>
+        <w:ind w:left="643" w:hanging="360"/>
+      </w:pPr>
+    </w:lvl>
+  </w:abstractNum>
+  <w:abstractNum w:abstractNumId="4" w15:restartNumberingAfterBreak="0">
+    <w:nsid w:val="FFFFFF80"/>
+    <w:multiLevelType w:val="singleLevel"/>
+    <w:tmpl w:val="6C045BF0"/>
+    <w:lvl w:ilvl="0">
+      <w:start w:val="1"/>
+      <w:numFmt w:val="bullet"/>
+      <w:pStyle w:val="Felsorols5"/>
+      <w:lvlText w:val=""/>
+      <w:lvlJc w:val="left"/>
+      <w:pPr>
+        <w:tabs>
+          <w:tab w:val="num" w:pos="1492"/>
+        </w:tabs>
+        <w:ind w:left="1492" w:hanging="360"/>
+      </w:pPr>
+      <w:rPr>
+        <w:rFonts w:ascii="Symbol" w:hAnsi="Symbol" w:hint="default"/>
+      </w:rPr>
+    </w:lvl>
+  </w:abstractNum>
+  <w:abstractNum w:abstractNumId="5" w15:restartNumberingAfterBreak="0">
+    <w:nsid w:val="FFFFFF81"/>
+    <w:multiLevelType w:val="singleLevel"/>
+    <w:tmpl w:val="0E8EBA96"/>
+    <w:lvl w:ilvl="0">
+      <w:start w:val="1"/>
+      <w:numFmt w:val="bullet"/>
+      <w:pStyle w:val="Felsorols4"/>
+      <w:lvlText w:val=""/>
+      <w:lvlJc w:val="left"/>
+      <w:pPr>
+        <w:tabs>
+          <w:tab w:val="num" w:pos="1209"/>
+        </w:tabs>
+        <w:ind w:left="1209" w:hanging="360"/>
+      </w:pPr>
+      <w:rPr>
+        <w:rFonts w:ascii="Symbol" w:hAnsi="Symbol" w:hint="default"/>
+      </w:rPr>
+    </w:lvl>
+  </w:abstractNum>
+  <w:abstractNum w:abstractNumId="6" w15:restartNumberingAfterBreak="0">
+    <w:nsid w:val="FFFFFF82"/>
+    <w:multiLevelType w:val="singleLevel"/>
+    <w:tmpl w:val="58B6C650"/>
+    <w:lvl w:ilvl="0">
+      <w:start w:val="1"/>
+      <w:numFmt w:val="bullet"/>
+      <w:pStyle w:val="Felsorols3"/>
+      <w:lvlText w:val=""/>
+      <w:lvlJc w:val="left"/>
+      <w:pPr>
+        <w:tabs>
+          <w:tab w:val="num" w:pos="926"/>
+        </w:tabs>
+        <w:ind w:left="926" w:hanging="360"/>
+      </w:pPr>
+      <w:rPr>
+        <w:rFonts w:ascii="Symbol" w:hAnsi="Symbol" w:hint="default"/>
+      </w:rPr>
+    </w:lvl>
+  </w:abstractNum>
+  <w:abstractNum w:abstractNumId="7" w15:restartNumberingAfterBreak="0">
+    <w:nsid w:val="FFFFFF83"/>
+    <w:multiLevelType w:val="singleLevel"/>
+    <w:tmpl w:val="B3822988"/>
+    <w:lvl w:ilvl="0">
+      <w:start w:val="1"/>
+      <w:numFmt w:val="bullet"/>
+      <w:pStyle w:val="Felsorols2"/>
+      <w:lvlText w:val=""/>
+      <w:lvlJc w:val="left"/>
+      <w:pPr>
+        <w:tabs>
+          <w:tab w:val="num" w:pos="643"/>
+        </w:tabs>
+        <w:ind w:left="643" w:hanging="360"/>
+      </w:pPr>
+      <w:rPr>
+        <w:rFonts w:ascii="Symbol" w:hAnsi="Symbol" w:hint="default"/>
+      </w:rPr>
+    </w:lvl>
+  </w:abstractNum>
+  <w:abstractNum w:abstractNumId="8" w15:restartNumberingAfterBreak="0">
+    <w:nsid w:val="FFFFFF88"/>
+    <w:multiLevelType w:val="singleLevel"/>
+    <w:tmpl w:val="3FFE80DE"/>
+    <w:lvl w:ilvl="0">
+      <w:start w:val="1"/>
+      <w:numFmt w:val="decimal"/>
+      <w:pStyle w:val="Szmozottlista"/>
+      <w:lvlText w:val="%1."/>
+      <w:lvlJc w:val="left"/>
+      <w:pPr>
+        <w:tabs>
+          <w:tab w:val="num" w:pos="360"/>
+        </w:tabs>
+        <w:ind w:left="360" w:hanging="360"/>
+      </w:pPr>
+    </w:lvl>
+  </w:abstractNum>
+  <w:abstractNum w:abstractNumId="9" w15:restartNumberingAfterBreak="0">
+    <w:nsid w:val="FFFFFF89"/>
+    <w:multiLevelType w:val="singleLevel"/>
+    <w:tmpl w:val="9B28F598"/>
+    <w:lvl w:ilvl="0">
+      <w:start w:val="1"/>
+      <w:numFmt w:val="bullet"/>
+      <w:pStyle w:val="Felsorols"/>
+      <w:lvlText w:val=""/>
+      <w:lvlJc w:val="left"/>
+      <w:pPr>
+        <w:tabs>
+          <w:tab w:val="num" w:pos="360"/>
+        </w:tabs>
+        <w:ind w:left="360" w:hanging="360"/>
+      </w:pPr>
+      <w:rPr>
+        <w:rFonts w:ascii="Symbol" w:hAnsi="Symbol" w:hint="default"/>
+      </w:rPr>
+    </w:lvl>
+  </w:abstractNum>
+  <w:abstractNum w:abstractNumId="10" w15:restartNumberingAfterBreak="0">
     <w:nsid w:val="199815CC"/>
     <w:multiLevelType w:val="hybridMultilevel"/>
     <w:tmpl w:val="AC94509A"/>
@@ -2972,7 +3361,7 @@
       </w:rPr>
     </w:lvl>
   </w:abstractNum>
-  <w:abstractNum w:abstractNumId="1" w15:restartNumberingAfterBreak="0">
+  <w:abstractNum w:abstractNumId="11" w15:restartNumberingAfterBreak="0">
     <w:nsid w:val="1ED21839"/>
     <w:multiLevelType w:val="hybridMultilevel"/>
     <w:tmpl w:val="60284BEE"/>
@@ -3085,7 +3474,7 @@
       </w:rPr>
     </w:lvl>
   </w:abstractNum>
-  <w:abstractNum w:abstractNumId="2" w15:restartNumberingAfterBreak="0">
+  <w:abstractNum w:abstractNumId="12" w15:restartNumberingAfterBreak="0">
     <w:nsid w:val="2761672F"/>
     <w:multiLevelType w:val="hybridMultilevel"/>
     <w:tmpl w:val="8C12F048"/>
@@ -3199,7 +3588,7 @@
       </w:rPr>
     </w:lvl>
   </w:abstractNum>
-  <w:abstractNum w:abstractNumId="3" w15:restartNumberingAfterBreak="0">
+  <w:abstractNum w:abstractNumId="13" w15:restartNumberingAfterBreak="0">
     <w:nsid w:val="3F014F04"/>
     <w:multiLevelType w:val="hybridMultilevel"/>
     <w:tmpl w:val="1F50C110"/>
@@ -3312,7 +3701,7 @@
       </w:rPr>
     </w:lvl>
   </w:abstractNum>
-  <w:abstractNum w:abstractNumId="4" w15:restartNumberingAfterBreak="0">
+  <w:abstractNum w:abstractNumId="14" w15:restartNumberingAfterBreak="0">
     <w:nsid w:val="409265E9"/>
     <w:multiLevelType w:val="hybridMultilevel"/>
     <w:tmpl w:val="F2B0D830"/>
@@ -3425,7 +3814,7 @@
       </w:rPr>
     </w:lvl>
   </w:abstractNum>
-  <w:abstractNum w:abstractNumId="5" w15:restartNumberingAfterBreak="0">
+  <w:abstractNum w:abstractNumId="15" w15:restartNumberingAfterBreak="0">
     <w:nsid w:val="4A30604F"/>
     <w:multiLevelType w:val="hybridMultilevel"/>
     <w:tmpl w:val="51E6602E"/>
@@ -3538,7 +3927,7 @@
       </w:rPr>
     </w:lvl>
   </w:abstractNum>
-  <w:abstractNum w:abstractNumId="6" w15:restartNumberingAfterBreak="0">
+  <w:abstractNum w:abstractNumId="16" w15:restartNumberingAfterBreak="0">
     <w:nsid w:val="4D643C76"/>
     <w:multiLevelType w:val="hybridMultilevel"/>
     <w:tmpl w:val="9A10E040"/>
@@ -3651,7 +4040,7 @@
       </w:rPr>
     </w:lvl>
   </w:abstractNum>
-  <w:abstractNum w:abstractNumId="7" w15:restartNumberingAfterBreak="0">
+  <w:abstractNum w:abstractNumId="17" w15:restartNumberingAfterBreak="0">
     <w:nsid w:val="67851727"/>
     <w:multiLevelType w:val="hybridMultilevel"/>
     <w:tmpl w:val="E7AC4244"/>
@@ -3764,7 +4153,7 @@
       </w:rPr>
     </w:lvl>
   </w:abstractNum>
-  <w:abstractNum w:abstractNumId="8" w15:restartNumberingAfterBreak="0">
+  <w:abstractNum w:abstractNumId="18" w15:restartNumberingAfterBreak="0">
     <w:nsid w:val="68431A04"/>
     <w:multiLevelType w:val="hybridMultilevel"/>
     <w:tmpl w:val="5D7E183A"/>
@@ -3877,7 +4266,7 @@
       </w:rPr>
     </w:lvl>
   </w:abstractNum>
-  <w:abstractNum w:abstractNumId="9" w15:restartNumberingAfterBreak="0">
+  <w:abstractNum w:abstractNumId="19" w15:restartNumberingAfterBreak="0">
     <w:nsid w:val="7890058A"/>
     <w:multiLevelType w:val="hybridMultilevel"/>
     <w:tmpl w:val="83746BFE"/>
@@ -3990,7 +4379,7 @@
       </w:rPr>
     </w:lvl>
   </w:abstractNum>
-  <w:abstractNum w:abstractNumId="10" w15:restartNumberingAfterBreak="0">
+  <w:abstractNum w:abstractNumId="20" w15:restartNumberingAfterBreak="0">
     <w:nsid w:val="78D71ACE"/>
     <w:multiLevelType w:val="hybridMultilevel"/>
     <w:tmpl w:val="EADED69A"/>
@@ -4104,37 +4493,67 @@
     </w:lvl>
   </w:abstractNum>
   <w:num w:numId="1">
+    <w:abstractNumId w:val="12"/>
+  </w:num>
+  <w:num w:numId="2">
+    <w:abstractNumId w:val="17"/>
+  </w:num>
+  <w:num w:numId="3">
+    <w:abstractNumId w:val="15"/>
+  </w:num>
+  <w:num w:numId="4">
+    <w:abstractNumId w:val="13"/>
+  </w:num>
+  <w:num w:numId="5">
+    <w:abstractNumId w:val="16"/>
+  </w:num>
+  <w:num w:numId="6">
+    <w:abstractNumId w:val="18"/>
+  </w:num>
+  <w:num w:numId="7">
+    <w:abstractNumId w:val="14"/>
+  </w:num>
+  <w:num w:numId="8">
+    <w:abstractNumId w:val="19"/>
+  </w:num>
+  <w:num w:numId="9">
+    <w:abstractNumId w:val="10"/>
+  </w:num>
+  <w:num w:numId="10">
+    <w:abstractNumId w:val="11"/>
+  </w:num>
+  <w:num w:numId="11">
+    <w:abstractNumId w:val="20"/>
+  </w:num>
+  <w:num w:numId="12">
+    <w:abstractNumId w:val="9"/>
+  </w:num>
+  <w:num w:numId="13">
+    <w:abstractNumId w:val="7"/>
+  </w:num>
+  <w:num w:numId="14">
+    <w:abstractNumId w:val="6"/>
+  </w:num>
+  <w:num w:numId="15">
+    <w:abstractNumId w:val="5"/>
+  </w:num>
+  <w:num w:numId="16">
+    <w:abstractNumId w:val="4"/>
+  </w:num>
+  <w:num w:numId="17">
+    <w:abstractNumId w:val="8"/>
+  </w:num>
+  <w:num w:numId="18">
+    <w:abstractNumId w:val="3"/>
+  </w:num>
+  <w:num w:numId="19">
     <w:abstractNumId w:val="2"/>
   </w:num>
-  <w:num w:numId="2">
-    <w:abstractNumId w:val="7"/>
-  </w:num>
-  <w:num w:numId="3">
-    <w:abstractNumId w:val="5"/>
-  </w:num>
-  <w:num w:numId="4">
-    <w:abstractNumId w:val="3"/>
-  </w:num>
-  <w:num w:numId="5">
-    <w:abstractNumId w:val="6"/>
-  </w:num>
-  <w:num w:numId="6">
-    <w:abstractNumId w:val="8"/>
-  </w:num>
-  <w:num w:numId="7">
-    <w:abstractNumId w:val="4"/>
-  </w:num>
-  <w:num w:numId="8">
-    <w:abstractNumId w:val="9"/>
-  </w:num>
-  <w:num w:numId="9">
-    <w:abstractNumId w:val="0"/>
-  </w:num>
-  <w:num w:numId="10">
+  <w:num w:numId="20">
     <w:abstractNumId w:val="1"/>
   </w:num>
-  <w:num w:numId="11">
-    <w:abstractNumId w:val="10"/>
+  <w:num w:numId="21">
+    <w:abstractNumId w:val="0"/>
   </w:num>
 </w:numbering>
 </file>
@@ -4555,6 +4974,188 @@
       <w:szCs w:val="28"/>
     </w:rPr>
   </w:style>
+  <w:style w:type="paragraph" w:styleId="Cmsor2">
+    <w:name w:val="heading 2"/>
+    <w:basedOn w:val="Norml"/>
+    <w:next w:val="Norml"/>
+    <w:link w:val="Cmsor2Char"/>
+    <w:uiPriority w:val="9"/>
+    <w:semiHidden/>
+    <w:unhideWhenUsed/>
+    <w:qFormat/>
+    <w:rsid w:val="000A20B0"/>
+    <w:pPr>
+      <w:keepNext/>
+      <w:keepLines/>
+      <w:spacing w:before="40"/>
+      <w:outlineLvl w:val="1"/>
+    </w:pPr>
+    <w:rPr>
+      <w:rFonts w:asciiTheme="majorHAnsi" w:eastAsiaTheme="majorEastAsia" w:hAnsiTheme="majorHAnsi" w:cstheme="majorBidi"/>
+      <w:color w:val="365F91" w:themeColor="accent1" w:themeShade="BF"/>
+      <w:sz w:val="26"/>
+      <w:szCs w:val="26"/>
+    </w:rPr>
+  </w:style>
+  <w:style w:type="paragraph" w:styleId="Cmsor3">
+    <w:name w:val="heading 3"/>
+    <w:basedOn w:val="Norml"/>
+    <w:next w:val="Norml"/>
+    <w:link w:val="Cmsor3Char"/>
+    <w:uiPriority w:val="9"/>
+    <w:semiHidden/>
+    <w:unhideWhenUsed/>
+    <w:qFormat/>
+    <w:rsid w:val="000A20B0"/>
+    <w:pPr>
+      <w:keepNext/>
+      <w:keepLines/>
+      <w:spacing w:before="40"/>
+      <w:outlineLvl w:val="2"/>
+    </w:pPr>
+    <w:rPr>
+      <w:rFonts w:asciiTheme="majorHAnsi" w:eastAsiaTheme="majorEastAsia" w:hAnsiTheme="majorHAnsi" w:cstheme="majorBidi"/>
+      <w:color w:val="243F60" w:themeColor="accent1" w:themeShade="7F"/>
+      <w:sz w:val="24"/>
+      <w:szCs w:val="24"/>
+    </w:rPr>
+  </w:style>
+  <w:style w:type="paragraph" w:styleId="Cmsor4">
+    <w:name w:val="heading 4"/>
+    <w:basedOn w:val="Norml"/>
+    <w:next w:val="Norml"/>
+    <w:link w:val="Cmsor4Char"/>
+    <w:uiPriority w:val="9"/>
+    <w:semiHidden/>
+    <w:unhideWhenUsed/>
+    <w:qFormat/>
+    <w:rsid w:val="000A20B0"/>
+    <w:pPr>
+      <w:keepNext/>
+      <w:keepLines/>
+      <w:spacing w:before="40"/>
+      <w:outlineLvl w:val="3"/>
+    </w:pPr>
+    <w:rPr>
+      <w:rFonts w:asciiTheme="majorHAnsi" w:eastAsiaTheme="majorEastAsia" w:hAnsiTheme="majorHAnsi" w:cstheme="majorBidi"/>
+      <w:i/>
+      <w:iCs/>
+      <w:color w:val="365F91" w:themeColor="accent1" w:themeShade="BF"/>
+    </w:rPr>
+  </w:style>
+  <w:style w:type="paragraph" w:styleId="Cmsor5">
+    <w:name w:val="heading 5"/>
+    <w:basedOn w:val="Norml"/>
+    <w:next w:val="Norml"/>
+    <w:link w:val="Cmsor5Char"/>
+    <w:uiPriority w:val="9"/>
+    <w:semiHidden/>
+    <w:unhideWhenUsed/>
+    <w:qFormat/>
+    <w:rsid w:val="000A20B0"/>
+    <w:pPr>
+      <w:keepNext/>
+      <w:keepLines/>
+      <w:spacing w:before="40"/>
+      <w:outlineLvl w:val="4"/>
+    </w:pPr>
+    <w:rPr>
+      <w:rFonts w:asciiTheme="majorHAnsi" w:eastAsiaTheme="majorEastAsia" w:hAnsiTheme="majorHAnsi" w:cstheme="majorBidi"/>
+      <w:color w:val="365F91" w:themeColor="accent1" w:themeShade="BF"/>
+    </w:rPr>
+  </w:style>
+  <w:style w:type="paragraph" w:styleId="Cmsor6">
+    <w:name w:val="heading 6"/>
+    <w:basedOn w:val="Norml"/>
+    <w:next w:val="Norml"/>
+    <w:link w:val="Cmsor6Char"/>
+    <w:uiPriority w:val="9"/>
+    <w:semiHidden/>
+    <w:unhideWhenUsed/>
+    <w:qFormat/>
+    <w:rsid w:val="000A20B0"/>
+    <w:pPr>
+      <w:keepNext/>
+      <w:keepLines/>
+      <w:spacing w:before="40"/>
+      <w:outlineLvl w:val="5"/>
+    </w:pPr>
+    <w:rPr>
+      <w:rFonts w:asciiTheme="majorHAnsi" w:eastAsiaTheme="majorEastAsia" w:hAnsiTheme="majorHAnsi" w:cstheme="majorBidi"/>
+      <w:color w:val="243F60" w:themeColor="accent1" w:themeShade="7F"/>
+    </w:rPr>
+  </w:style>
+  <w:style w:type="paragraph" w:styleId="Cmsor7">
+    <w:name w:val="heading 7"/>
+    <w:basedOn w:val="Norml"/>
+    <w:next w:val="Norml"/>
+    <w:link w:val="Cmsor7Char"/>
+    <w:uiPriority w:val="9"/>
+    <w:semiHidden/>
+    <w:unhideWhenUsed/>
+    <w:qFormat/>
+    <w:rsid w:val="000A20B0"/>
+    <w:pPr>
+      <w:keepNext/>
+      <w:keepLines/>
+      <w:spacing w:before="40"/>
+      <w:outlineLvl w:val="6"/>
+    </w:pPr>
+    <w:rPr>
+      <w:rFonts w:asciiTheme="majorHAnsi" w:eastAsiaTheme="majorEastAsia" w:hAnsiTheme="majorHAnsi" w:cstheme="majorBidi"/>
+      <w:i/>
+      <w:iCs/>
+      <w:color w:val="243F60" w:themeColor="accent1" w:themeShade="7F"/>
+    </w:rPr>
+  </w:style>
+  <w:style w:type="paragraph" w:styleId="Cmsor8">
+    <w:name w:val="heading 8"/>
+    <w:basedOn w:val="Norml"/>
+    <w:next w:val="Norml"/>
+    <w:link w:val="Cmsor8Char"/>
+    <w:uiPriority w:val="9"/>
+    <w:semiHidden/>
+    <w:unhideWhenUsed/>
+    <w:qFormat/>
+    <w:rsid w:val="000A20B0"/>
+    <w:pPr>
+      <w:keepNext/>
+      <w:keepLines/>
+      <w:spacing w:before="40"/>
+      <w:outlineLvl w:val="7"/>
+    </w:pPr>
+    <w:rPr>
+      <w:rFonts w:asciiTheme="majorHAnsi" w:eastAsiaTheme="majorEastAsia" w:hAnsiTheme="majorHAnsi" w:cstheme="majorBidi"/>
+      <w:color w:val="272727" w:themeColor="text1" w:themeTint="D8"/>
+      <w:sz w:val="21"/>
+      <w:szCs w:val="21"/>
+    </w:rPr>
+  </w:style>
+  <w:style w:type="paragraph" w:styleId="Cmsor9">
+    <w:name w:val="heading 9"/>
+    <w:basedOn w:val="Norml"/>
+    <w:next w:val="Norml"/>
+    <w:link w:val="Cmsor9Char"/>
+    <w:uiPriority w:val="9"/>
+    <w:semiHidden/>
+    <w:unhideWhenUsed/>
+    <w:qFormat/>
+    <w:rsid w:val="000A20B0"/>
+    <w:pPr>
+      <w:keepNext/>
+      <w:keepLines/>
+      <w:spacing w:before="40"/>
+      <w:outlineLvl w:val="8"/>
+    </w:pPr>
+    <w:rPr>
+      <w:rFonts w:asciiTheme="majorHAnsi" w:eastAsiaTheme="majorEastAsia" w:hAnsiTheme="majorHAnsi" w:cstheme="majorBidi"/>
+      <w:i/>
+      <w:iCs/>
+      <w:color w:val="272727" w:themeColor="text1" w:themeTint="D8"/>
+      <w:sz w:val="21"/>
+      <w:szCs w:val="21"/>
+    </w:rPr>
+  </w:style>
   <w:style w:type="character" w:default="1" w:styleId="Bekezdsalapbettpusa">
     <w:name w:val="Default Paragraph Font"/>
     <w:uiPriority w:val="1"/>
@@ -4601,6 +5202,7 @@
   <w:style w:type="paragraph" w:styleId="Szvegtrzs">
     <w:name w:val="Body Text"/>
     <w:basedOn w:val="Norml"/>
+    <w:link w:val="SzvegtrzsChar"/>
     <w:uiPriority w:val="1"/>
     <w:qFormat/>
     <w:pPr>
@@ -4664,6 +5266,1647 @@
     <w:rPr>
       <w:color w:val="605E5C"/>
       <w:shd w:val="clear" w:color="auto" w:fill="E1DFDD"/>
+    </w:rPr>
+  </w:style>
+  <w:style w:type="paragraph" w:styleId="lfej">
+    <w:name w:val="header"/>
+    <w:basedOn w:val="Norml"/>
+    <w:link w:val="lfejChar"/>
+    <w:uiPriority w:val="99"/>
+    <w:unhideWhenUsed/>
+    <w:rsid w:val="00740030"/>
+    <w:pPr>
+      <w:tabs>
+        <w:tab w:val="center" w:pos="4536"/>
+        <w:tab w:val="right" w:pos="9072"/>
+      </w:tabs>
+    </w:pPr>
+  </w:style>
+  <w:style w:type="character" w:customStyle="1" w:styleId="lfejChar">
+    <w:name w:val="Élőfej Char"/>
+    <w:basedOn w:val="Bekezdsalapbettpusa"/>
+    <w:link w:val="lfej"/>
+    <w:uiPriority w:val="99"/>
+    <w:rsid w:val="00740030"/>
+    <w:rPr>
+      <w:rFonts w:ascii="Calibri" w:eastAsia="Calibri" w:hAnsi="Calibri" w:cs="Calibri"/>
+      <w:lang w:val="hu-HU"/>
+    </w:rPr>
+  </w:style>
+  <w:style w:type="paragraph" w:styleId="llb">
+    <w:name w:val="footer"/>
+    <w:basedOn w:val="Norml"/>
+    <w:link w:val="llbChar"/>
+    <w:uiPriority w:val="99"/>
+    <w:unhideWhenUsed/>
+    <w:rsid w:val="00740030"/>
+    <w:pPr>
+      <w:tabs>
+        <w:tab w:val="center" w:pos="4536"/>
+        <w:tab w:val="right" w:pos="9072"/>
+      </w:tabs>
+    </w:pPr>
+  </w:style>
+  <w:style w:type="character" w:customStyle="1" w:styleId="llbChar">
+    <w:name w:val="Élőláb Char"/>
+    <w:basedOn w:val="Bekezdsalapbettpusa"/>
+    <w:link w:val="llb"/>
+    <w:uiPriority w:val="99"/>
+    <w:rsid w:val="00740030"/>
+    <w:rPr>
+      <w:rFonts w:ascii="Calibri" w:eastAsia="Calibri" w:hAnsi="Calibri" w:cs="Calibri"/>
+      <w:lang w:val="hu-HU"/>
+    </w:rPr>
+  </w:style>
+  <w:style w:type="paragraph" w:styleId="brajegyzk">
+    <w:name w:val="table of figures"/>
+    <w:basedOn w:val="Norml"/>
+    <w:next w:val="Norml"/>
+    <w:uiPriority w:val="99"/>
+    <w:semiHidden/>
+    <w:unhideWhenUsed/>
+    <w:rsid w:val="000A20B0"/>
+  </w:style>
+  <w:style w:type="paragraph" w:styleId="Alrs">
+    <w:name w:val="Signature"/>
+    <w:basedOn w:val="Norml"/>
+    <w:link w:val="AlrsChar"/>
+    <w:uiPriority w:val="99"/>
+    <w:semiHidden/>
+    <w:unhideWhenUsed/>
+    <w:rsid w:val="000A20B0"/>
+    <w:pPr>
+      <w:ind w:left="4252"/>
+    </w:pPr>
+  </w:style>
+  <w:style w:type="character" w:customStyle="1" w:styleId="AlrsChar">
+    <w:name w:val="Aláírás Char"/>
+    <w:basedOn w:val="Bekezdsalapbettpusa"/>
+    <w:link w:val="Alrs"/>
+    <w:uiPriority w:val="99"/>
+    <w:semiHidden/>
+    <w:rsid w:val="000A20B0"/>
+    <w:rPr>
+      <w:rFonts w:ascii="Calibri" w:eastAsia="Calibri" w:hAnsi="Calibri" w:cs="Calibri"/>
+      <w:lang w:val="hu-HU"/>
+    </w:rPr>
+  </w:style>
+  <w:style w:type="paragraph" w:styleId="Alcm">
+    <w:name w:val="Subtitle"/>
+    <w:basedOn w:val="Norml"/>
+    <w:next w:val="Norml"/>
+    <w:link w:val="AlcmChar"/>
+    <w:uiPriority w:val="11"/>
+    <w:qFormat/>
+    <w:rsid w:val="000A20B0"/>
+    <w:pPr>
+      <w:numPr>
+        <w:ilvl w:val="1"/>
+      </w:numPr>
+      <w:spacing w:after="160"/>
+    </w:pPr>
+    <w:rPr>
+      <w:rFonts w:asciiTheme="minorHAnsi" w:eastAsiaTheme="minorEastAsia" w:hAnsiTheme="minorHAnsi" w:cstheme="minorBidi"/>
+      <w:color w:val="5A5A5A" w:themeColor="text1" w:themeTint="A5"/>
+      <w:spacing w:val="15"/>
+    </w:rPr>
+  </w:style>
+  <w:style w:type="character" w:customStyle="1" w:styleId="AlcmChar">
+    <w:name w:val="Alcím Char"/>
+    <w:basedOn w:val="Bekezdsalapbettpusa"/>
+    <w:link w:val="Alcm"/>
+    <w:uiPriority w:val="11"/>
+    <w:rsid w:val="000A20B0"/>
+    <w:rPr>
+      <w:rFonts w:eastAsiaTheme="minorEastAsia"/>
+      <w:color w:val="5A5A5A" w:themeColor="text1" w:themeTint="A5"/>
+      <w:spacing w:val="15"/>
+      <w:lang w:val="hu-HU"/>
+    </w:rPr>
+  </w:style>
+  <w:style w:type="paragraph" w:styleId="Befejezs">
+    <w:name w:val="Closing"/>
+    <w:basedOn w:val="Norml"/>
+    <w:link w:val="BefejezsChar"/>
+    <w:uiPriority w:val="99"/>
+    <w:semiHidden/>
+    <w:unhideWhenUsed/>
+    <w:rsid w:val="000A20B0"/>
+    <w:pPr>
+      <w:ind w:left="4252"/>
+    </w:pPr>
+  </w:style>
+  <w:style w:type="character" w:customStyle="1" w:styleId="BefejezsChar">
+    <w:name w:val="Befejezés Char"/>
+    <w:basedOn w:val="Bekezdsalapbettpusa"/>
+    <w:link w:val="Befejezs"/>
+    <w:uiPriority w:val="99"/>
+    <w:semiHidden/>
+    <w:rsid w:val="000A20B0"/>
+    <w:rPr>
+      <w:rFonts w:ascii="Calibri" w:eastAsia="Calibri" w:hAnsi="Calibri" w:cs="Calibri"/>
+      <w:lang w:val="hu-HU"/>
+    </w:rPr>
+  </w:style>
+  <w:style w:type="paragraph" w:styleId="Bortkcm">
+    <w:name w:val="envelope address"/>
+    <w:basedOn w:val="Norml"/>
+    <w:uiPriority w:val="99"/>
+    <w:semiHidden/>
+    <w:unhideWhenUsed/>
+    <w:rsid w:val="000A20B0"/>
+    <w:pPr>
+      <w:framePr w:w="7920" w:h="1980" w:hRule="exact" w:hSpace="141" w:wrap="auto" w:hAnchor="page" w:xAlign="center" w:yAlign="bottom"/>
+      <w:ind w:left="2880"/>
+    </w:pPr>
+    <w:rPr>
+      <w:rFonts w:asciiTheme="majorHAnsi" w:eastAsiaTheme="majorEastAsia" w:hAnsiTheme="majorHAnsi" w:cstheme="majorBidi"/>
+      <w:sz w:val="24"/>
+      <w:szCs w:val="24"/>
+    </w:rPr>
+  </w:style>
+  <w:style w:type="paragraph" w:styleId="Buborkszveg">
+    <w:name w:val="Balloon Text"/>
+    <w:basedOn w:val="Norml"/>
+    <w:link w:val="BuborkszvegChar"/>
+    <w:uiPriority w:val="99"/>
+    <w:semiHidden/>
+    <w:unhideWhenUsed/>
+    <w:rsid w:val="000A20B0"/>
+    <w:rPr>
+      <w:rFonts w:ascii="Segoe UI" w:hAnsi="Segoe UI" w:cs="Segoe UI"/>
+      <w:sz w:val="18"/>
+      <w:szCs w:val="18"/>
+    </w:rPr>
+  </w:style>
+  <w:style w:type="character" w:customStyle="1" w:styleId="BuborkszvegChar">
+    <w:name w:val="Buborékszöveg Char"/>
+    <w:basedOn w:val="Bekezdsalapbettpusa"/>
+    <w:link w:val="Buborkszveg"/>
+    <w:uiPriority w:val="99"/>
+    <w:semiHidden/>
+    <w:rsid w:val="000A20B0"/>
+    <w:rPr>
+      <w:rFonts w:ascii="Segoe UI" w:eastAsia="Calibri" w:hAnsi="Segoe UI" w:cs="Segoe UI"/>
+      <w:sz w:val="18"/>
+      <w:szCs w:val="18"/>
+      <w:lang w:val="hu-HU"/>
+    </w:rPr>
+  </w:style>
+  <w:style w:type="character" w:customStyle="1" w:styleId="Cmsor2Char">
+    <w:name w:val="Címsor 2 Char"/>
+    <w:basedOn w:val="Bekezdsalapbettpusa"/>
+    <w:link w:val="Cmsor2"/>
+    <w:uiPriority w:val="9"/>
+    <w:semiHidden/>
+    <w:rsid w:val="000A20B0"/>
+    <w:rPr>
+      <w:rFonts w:asciiTheme="majorHAnsi" w:eastAsiaTheme="majorEastAsia" w:hAnsiTheme="majorHAnsi" w:cstheme="majorBidi"/>
+      <w:color w:val="365F91" w:themeColor="accent1" w:themeShade="BF"/>
+      <w:sz w:val="26"/>
+      <w:szCs w:val="26"/>
+      <w:lang w:val="hu-HU"/>
+    </w:rPr>
+  </w:style>
+  <w:style w:type="character" w:customStyle="1" w:styleId="Cmsor3Char">
+    <w:name w:val="Címsor 3 Char"/>
+    <w:basedOn w:val="Bekezdsalapbettpusa"/>
+    <w:link w:val="Cmsor3"/>
+    <w:uiPriority w:val="9"/>
+    <w:semiHidden/>
+    <w:rsid w:val="000A20B0"/>
+    <w:rPr>
+      <w:rFonts w:asciiTheme="majorHAnsi" w:eastAsiaTheme="majorEastAsia" w:hAnsiTheme="majorHAnsi" w:cstheme="majorBidi"/>
+      <w:color w:val="243F60" w:themeColor="accent1" w:themeShade="7F"/>
+      <w:sz w:val="24"/>
+      <w:szCs w:val="24"/>
+      <w:lang w:val="hu-HU"/>
+    </w:rPr>
+  </w:style>
+  <w:style w:type="character" w:customStyle="1" w:styleId="Cmsor4Char">
+    <w:name w:val="Címsor 4 Char"/>
+    <w:basedOn w:val="Bekezdsalapbettpusa"/>
+    <w:link w:val="Cmsor4"/>
+    <w:uiPriority w:val="9"/>
+    <w:semiHidden/>
+    <w:rsid w:val="000A20B0"/>
+    <w:rPr>
+      <w:rFonts w:asciiTheme="majorHAnsi" w:eastAsiaTheme="majorEastAsia" w:hAnsiTheme="majorHAnsi" w:cstheme="majorBidi"/>
+      <w:i/>
+      <w:iCs/>
+      <w:color w:val="365F91" w:themeColor="accent1" w:themeShade="BF"/>
+      <w:lang w:val="hu-HU"/>
+    </w:rPr>
+  </w:style>
+  <w:style w:type="character" w:customStyle="1" w:styleId="Cmsor5Char">
+    <w:name w:val="Címsor 5 Char"/>
+    <w:basedOn w:val="Bekezdsalapbettpusa"/>
+    <w:link w:val="Cmsor5"/>
+    <w:uiPriority w:val="9"/>
+    <w:semiHidden/>
+    <w:rsid w:val="000A20B0"/>
+    <w:rPr>
+      <w:rFonts w:asciiTheme="majorHAnsi" w:eastAsiaTheme="majorEastAsia" w:hAnsiTheme="majorHAnsi" w:cstheme="majorBidi"/>
+      <w:color w:val="365F91" w:themeColor="accent1" w:themeShade="BF"/>
+      <w:lang w:val="hu-HU"/>
+    </w:rPr>
+  </w:style>
+  <w:style w:type="character" w:customStyle="1" w:styleId="Cmsor6Char">
+    <w:name w:val="Címsor 6 Char"/>
+    <w:basedOn w:val="Bekezdsalapbettpusa"/>
+    <w:link w:val="Cmsor6"/>
+    <w:uiPriority w:val="9"/>
+    <w:semiHidden/>
+    <w:rsid w:val="000A20B0"/>
+    <w:rPr>
+      <w:rFonts w:asciiTheme="majorHAnsi" w:eastAsiaTheme="majorEastAsia" w:hAnsiTheme="majorHAnsi" w:cstheme="majorBidi"/>
+      <w:color w:val="243F60" w:themeColor="accent1" w:themeShade="7F"/>
+      <w:lang w:val="hu-HU"/>
+    </w:rPr>
+  </w:style>
+  <w:style w:type="character" w:customStyle="1" w:styleId="Cmsor7Char">
+    <w:name w:val="Címsor 7 Char"/>
+    <w:basedOn w:val="Bekezdsalapbettpusa"/>
+    <w:link w:val="Cmsor7"/>
+    <w:uiPriority w:val="9"/>
+    <w:semiHidden/>
+    <w:rsid w:val="000A20B0"/>
+    <w:rPr>
+      <w:rFonts w:asciiTheme="majorHAnsi" w:eastAsiaTheme="majorEastAsia" w:hAnsiTheme="majorHAnsi" w:cstheme="majorBidi"/>
+      <w:i/>
+      <w:iCs/>
+      <w:color w:val="243F60" w:themeColor="accent1" w:themeShade="7F"/>
+      <w:lang w:val="hu-HU"/>
+    </w:rPr>
+  </w:style>
+  <w:style w:type="character" w:customStyle="1" w:styleId="Cmsor8Char">
+    <w:name w:val="Címsor 8 Char"/>
+    <w:basedOn w:val="Bekezdsalapbettpusa"/>
+    <w:link w:val="Cmsor8"/>
+    <w:uiPriority w:val="9"/>
+    <w:semiHidden/>
+    <w:rsid w:val="000A20B0"/>
+    <w:rPr>
+      <w:rFonts w:asciiTheme="majorHAnsi" w:eastAsiaTheme="majorEastAsia" w:hAnsiTheme="majorHAnsi" w:cstheme="majorBidi"/>
+      <w:color w:val="272727" w:themeColor="text1" w:themeTint="D8"/>
+      <w:sz w:val="21"/>
+      <w:szCs w:val="21"/>
+      <w:lang w:val="hu-HU"/>
+    </w:rPr>
+  </w:style>
+  <w:style w:type="character" w:customStyle="1" w:styleId="Cmsor9Char">
+    <w:name w:val="Címsor 9 Char"/>
+    <w:basedOn w:val="Bekezdsalapbettpusa"/>
+    <w:link w:val="Cmsor9"/>
+    <w:uiPriority w:val="9"/>
+    <w:semiHidden/>
+    <w:rsid w:val="000A20B0"/>
+    <w:rPr>
+      <w:rFonts w:asciiTheme="majorHAnsi" w:eastAsiaTheme="majorEastAsia" w:hAnsiTheme="majorHAnsi" w:cstheme="majorBidi"/>
+      <w:i/>
+      <w:iCs/>
+      <w:color w:val="272727" w:themeColor="text1" w:themeTint="D8"/>
+      <w:sz w:val="21"/>
+      <w:szCs w:val="21"/>
+      <w:lang w:val="hu-HU"/>
+    </w:rPr>
+  </w:style>
+  <w:style w:type="paragraph" w:styleId="Csakszveg">
+    <w:name w:val="Plain Text"/>
+    <w:basedOn w:val="Norml"/>
+    <w:link w:val="CsakszvegChar"/>
+    <w:uiPriority w:val="99"/>
+    <w:semiHidden/>
+    <w:unhideWhenUsed/>
+    <w:rsid w:val="000A20B0"/>
+    <w:rPr>
+      <w:rFonts w:ascii="Consolas" w:hAnsi="Consolas"/>
+      <w:sz w:val="21"/>
+      <w:szCs w:val="21"/>
+    </w:rPr>
+  </w:style>
+  <w:style w:type="character" w:customStyle="1" w:styleId="CsakszvegChar">
+    <w:name w:val="Csak szöveg Char"/>
+    <w:basedOn w:val="Bekezdsalapbettpusa"/>
+    <w:link w:val="Csakszveg"/>
+    <w:uiPriority w:val="99"/>
+    <w:semiHidden/>
+    <w:rsid w:val="000A20B0"/>
+    <w:rPr>
+      <w:rFonts w:ascii="Consolas" w:eastAsia="Calibri" w:hAnsi="Consolas" w:cs="Calibri"/>
+      <w:sz w:val="21"/>
+      <w:szCs w:val="21"/>
+      <w:lang w:val="hu-HU"/>
+    </w:rPr>
+  </w:style>
+  <w:style w:type="paragraph" w:styleId="Dtum">
+    <w:name w:val="Date"/>
+    <w:basedOn w:val="Norml"/>
+    <w:next w:val="Norml"/>
+    <w:link w:val="DtumChar"/>
+    <w:uiPriority w:val="99"/>
+    <w:semiHidden/>
+    <w:unhideWhenUsed/>
+    <w:rsid w:val="000A20B0"/>
+  </w:style>
+  <w:style w:type="character" w:customStyle="1" w:styleId="DtumChar">
+    <w:name w:val="Dátum Char"/>
+    <w:basedOn w:val="Bekezdsalapbettpusa"/>
+    <w:link w:val="Dtum"/>
+    <w:uiPriority w:val="99"/>
+    <w:semiHidden/>
+    <w:rsid w:val="000A20B0"/>
+    <w:rPr>
+      <w:rFonts w:ascii="Calibri" w:eastAsia="Calibri" w:hAnsi="Calibri" w:cs="Calibri"/>
+      <w:lang w:val="hu-HU"/>
+    </w:rPr>
+  </w:style>
+  <w:style w:type="paragraph" w:styleId="Dokumentumtrkp">
+    <w:name w:val="Document Map"/>
+    <w:basedOn w:val="Norml"/>
+    <w:link w:val="DokumentumtrkpChar"/>
+    <w:uiPriority w:val="99"/>
+    <w:semiHidden/>
+    <w:unhideWhenUsed/>
+    <w:rsid w:val="000A20B0"/>
+    <w:rPr>
+      <w:rFonts w:ascii="Segoe UI" w:hAnsi="Segoe UI" w:cs="Segoe UI"/>
+      <w:sz w:val="16"/>
+      <w:szCs w:val="16"/>
+    </w:rPr>
+  </w:style>
+  <w:style w:type="character" w:customStyle="1" w:styleId="DokumentumtrkpChar">
+    <w:name w:val="Dokumentumtérkép Char"/>
+    <w:basedOn w:val="Bekezdsalapbettpusa"/>
+    <w:link w:val="Dokumentumtrkp"/>
+    <w:uiPriority w:val="99"/>
+    <w:semiHidden/>
+    <w:rsid w:val="000A20B0"/>
+    <w:rPr>
+      <w:rFonts w:ascii="Segoe UI" w:eastAsia="Calibri" w:hAnsi="Segoe UI" w:cs="Segoe UI"/>
+      <w:sz w:val="16"/>
+      <w:szCs w:val="16"/>
+      <w:lang w:val="hu-HU"/>
+    </w:rPr>
+  </w:style>
+  <w:style w:type="paragraph" w:styleId="E-mailalrsa">
+    <w:name w:val="E-mail Signature"/>
+    <w:basedOn w:val="Norml"/>
+    <w:link w:val="E-mailalrsaChar"/>
+    <w:uiPriority w:val="99"/>
+    <w:semiHidden/>
+    <w:unhideWhenUsed/>
+    <w:rsid w:val="000A20B0"/>
+  </w:style>
+  <w:style w:type="character" w:customStyle="1" w:styleId="E-mailalrsaChar">
+    <w:name w:val="E-mail aláírása Char"/>
+    <w:basedOn w:val="Bekezdsalapbettpusa"/>
+    <w:link w:val="E-mailalrsa"/>
+    <w:uiPriority w:val="99"/>
+    <w:semiHidden/>
+    <w:rsid w:val="000A20B0"/>
+    <w:rPr>
+      <w:rFonts w:ascii="Calibri" w:eastAsia="Calibri" w:hAnsi="Calibri" w:cs="Calibri"/>
+      <w:lang w:val="hu-HU"/>
+    </w:rPr>
+  </w:style>
+  <w:style w:type="paragraph" w:styleId="Feladcmebortkon">
+    <w:name w:val="envelope return"/>
+    <w:basedOn w:val="Norml"/>
+    <w:uiPriority w:val="99"/>
+    <w:semiHidden/>
+    <w:unhideWhenUsed/>
+    <w:rsid w:val="000A20B0"/>
+    <w:rPr>
+      <w:rFonts w:asciiTheme="majorHAnsi" w:eastAsiaTheme="majorEastAsia" w:hAnsiTheme="majorHAnsi" w:cstheme="majorBidi"/>
+      <w:sz w:val="20"/>
+      <w:szCs w:val="20"/>
+    </w:rPr>
+  </w:style>
+  <w:style w:type="paragraph" w:styleId="Felsorols">
+    <w:name w:val="List Bullet"/>
+    <w:basedOn w:val="Norml"/>
+    <w:uiPriority w:val="99"/>
+    <w:semiHidden/>
+    <w:unhideWhenUsed/>
+    <w:rsid w:val="000A20B0"/>
+    <w:pPr>
+      <w:numPr>
+        <w:numId w:val="12"/>
+      </w:numPr>
+      <w:contextualSpacing/>
+    </w:pPr>
+  </w:style>
+  <w:style w:type="paragraph" w:styleId="Felsorols2">
+    <w:name w:val="List Bullet 2"/>
+    <w:basedOn w:val="Norml"/>
+    <w:uiPriority w:val="99"/>
+    <w:semiHidden/>
+    <w:unhideWhenUsed/>
+    <w:rsid w:val="000A20B0"/>
+    <w:pPr>
+      <w:numPr>
+        <w:numId w:val="13"/>
+      </w:numPr>
+      <w:contextualSpacing/>
+    </w:pPr>
+  </w:style>
+  <w:style w:type="paragraph" w:styleId="Felsorols3">
+    <w:name w:val="List Bullet 3"/>
+    <w:basedOn w:val="Norml"/>
+    <w:uiPriority w:val="99"/>
+    <w:semiHidden/>
+    <w:unhideWhenUsed/>
+    <w:rsid w:val="000A20B0"/>
+    <w:pPr>
+      <w:numPr>
+        <w:numId w:val="14"/>
+      </w:numPr>
+      <w:contextualSpacing/>
+    </w:pPr>
+  </w:style>
+  <w:style w:type="paragraph" w:styleId="Felsorols4">
+    <w:name w:val="List Bullet 4"/>
+    <w:basedOn w:val="Norml"/>
+    <w:uiPriority w:val="99"/>
+    <w:semiHidden/>
+    <w:unhideWhenUsed/>
+    <w:rsid w:val="000A20B0"/>
+    <w:pPr>
+      <w:numPr>
+        <w:numId w:val="15"/>
+      </w:numPr>
+      <w:contextualSpacing/>
+    </w:pPr>
+  </w:style>
+  <w:style w:type="paragraph" w:styleId="Felsorols5">
+    <w:name w:val="List Bullet 5"/>
+    <w:basedOn w:val="Norml"/>
+    <w:uiPriority w:val="99"/>
+    <w:semiHidden/>
+    <w:unhideWhenUsed/>
+    <w:rsid w:val="000A20B0"/>
+    <w:pPr>
+      <w:numPr>
+        <w:numId w:val="16"/>
+      </w:numPr>
+      <w:contextualSpacing/>
+    </w:pPr>
+  </w:style>
+  <w:style w:type="paragraph" w:styleId="Hivatkozsjegyzk">
+    <w:name w:val="table of authorities"/>
+    <w:basedOn w:val="Norml"/>
+    <w:next w:val="Norml"/>
+    <w:uiPriority w:val="99"/>
+    <w:semiHidden/>
+    <w:unhideWhenUsed/>
+    <w:rsid w:val="000A20B0"/>
+    <w:pPr>
+      <w:ind w:left="220" w:hanging="220"/>
+    </w:pPr>
+  </w:style>
+  <w:style w:type="paragraph" w:styleId="Hivatkozsjegyzk-fej">
+    <w:name w:val="toa heading"/>
+    <w:basedOn w:val="Norml"/>
+    <w:next w:val="Norml"/>
+    <w:uiPriority w:val="99"/>
+    <w:semiHidden/>
+    <w:unhideWhenUsed/>
+    <w:rsid w:val="000A20B0"/>
+    <w:pPr>
+      <w:spacing w:before="120"/>
+    </w:pPr>
+    <w:rPr>
+      <w:rFonts w:asciiTheme="majorHAnsi" w:eastAsiaTheme="majorEastAsia" w:hAnsiTheme="majorHAnsi" w:cstheme="majorBidi"/>
+      <w:b/>
+      <w:bCs/>
+      <w:sz w:val="24"/>
+      <w:szCs w:val="24"/>
+    </w:rPr>
+  </w:style>
+  <w:style w:type="paragraph" w:styleId="HTML-cm">
+    <w:name w:val="HTML Address"/>
+    <w:basedOn w:val="Norml"/>
+    <w:link w:val="HTML-cmChar"/>
+    <w:uiPriority w:val="99"/>
+    <w:semiHidden/>
+    <w:unhideWhenUsed/>
+    <w:rsid w:val="000A20B0"/>
+    <w:rPr>
+      <w:i/>
+      <w:iCs/>
+    </w:rPr>
+  </w:style>
+  <w:style w:type="character" w:customStyle="1" w:styleId="HTML-cmChar">
+    <w:name w:val="HTML-cím Char"/>
+    <w:basedOn w:val="Bekezdsalapbettpusa"/>
+    <w:link w:val="HTML-cm"/>
+    <w:uiPriority w:val="99"/>
+    <w:semiHidden/>
+    <w:rsid w:val="000A20B0"/>
+    <w:rPr>
+      <w:rFonts w:ascii="Calibri" w:eastAsia="Calibri" w:hAnsi="Calibri" w:cs="Calibri"/>
+      <w:i/>
+      <w:iCs/>
+      <w:lang w:val="hu-HU"/>
+    </w:rPr>
+  </w:style>
+  <w:style w:type="paragraph" w:styleId="HTML-kntformzott">
+    <w:name w:val="HTML Preformatted"/>
+    <w:basedOn w:val="Norml"/>
+    <w:link w:val="HTML-kntformzottChar"/>
+    <w:uiPriority w:val="99"/>
+    <w:semiHidden/>
+    <w:unhideWhenUsed/>
+    <w:rsid w:val="000A20B0"/>
+    <w:rPr>
+      <w:rFonts w:ascii="Consolas" w:hAnsi="Consolas"/>
+      <w:sz w:val="20"/>
+      <w:szCs w:val="20"/>
+    </w:rPr>
+  </w:style>
+  <w:style w:type="character" w:customStyle="1" w:styleId="HTML-kntformzottChar">
+    <w:name w:val="HTML-ként formázott Char"/>
+    <w:basedOn w:val="Bekezdsalapbettpusa"/>
+    <w:link w:val="HTML-kntformzott"/>
+    <w:uiPriority w:val="99"/>
+    <w:semiHidden/>
+    <w:rsid w:val="000A20B0"/>
+    <w:rPr>
+      <w:rFonts w:ascii="Consolas" w:eastAsia="Calibri" w:hAnsi="Consolas" w:cs="Calibri"/>
+      <w:sz w:val="20"/>
+      <w:szCs w:val="20"/>
+      <w:lang w:val="hu-HU"/>
+    </w:rPr>
+  </w:style>
+  <w:style w:type="paragraph" w:styleId="Idzet">
+    <w:name w:val="Quote"/>
+    <w:basedOn w:val="Norml"/>
+    <w:next w:val="Norml"/>
+    <w:link w:val="IdzetChar"/>
+    <w:uiPriority w:val="29"/>
+    <w:qFormat/>
+    <w:rsid w:val="000A20B0"/>
+    <w:pPr>
+      <w:spacing w:before="200" w:after="160"/>
+      <w:ind w:left="864" w:right="864"/>
+      <w:jc w:val="center"/>
+    </w:pPr>
+    <w:rPr>
+      <w:i/>
+      <w:iCs/>
+      <w:color w:val="404040" w:themeColor="text1" w:themeTint="BF"/>
+    </w:rPr>
+  </w:style>
+  <w:style w:type="character" w:customStyle="1" w:styleId="IdzetChar">
+    <w:name w:val="Idézet Char"/>
+    <w:basedOn w:val="Bekezdsalapbettpusa"/>
+    <w:link w:val="Idzet"/>
+    <w:uiPriority w:val="29"/>
+    <w:rsid w:val="000A20B0"/>
+    <w:rPr>
+      <w:rFonts w:ascii="Calibri" w:eastAsia="Calibri" w:hAnsi="Calibri" w:cs="Calibri"/>
+      <w:i/>
+      <w:iCs/>
+      <w:color w:val="404040" w:themeColor="text1" w:themeTint="BF"/>
+      <w:lang w:val="hu-HU"/>
+    </w:rPr>
+  </w:style>
+  <w:style w:type="paragraph" w:styleId="Irodalomjegyzk">
+    <w:name w:val="Bibliography"/>
+    <w:basedOn w:val="Norml"/>
+    <w:next w:val="Norml"/>
+    <w:uiPriority w:val="37"/>
+    <w:semiHidden/>
+    <w:unhideWhenUsed/>
+    <w:rsid w:val="000A20B0"/>
+  </w:style>
+  <w:style w:type="paragraph" w:styleId="Jegyzetszveg">
+    <w:name w:val="annotation text"/>
+    <w:basedOn w:val="Norml"/>
+    <w:link w:val="JegyzetszvegChar"/>
+    <w:uiPriority w:val="99"/>
+    <w:semiHidden/>
+    <w:unhideWhenUsed/>
+    <w:rsid w:val="000A20B0"/>
+    <w:rPr>
+      <w:sz w:val="20"/>
+      <w:szCs w:val="20"/>
+    </w:rPr>
+  </w:style>
+  <w:style w:type="character" w:customStyle="1" w:styleId="JegyzetszvegChar">
+    <w:name w:val="Jegyzetszöveg Char"/>
+    <w:basedOn w:val="Bekezdsalapbettpusa"/>
+    <w:link w:val="Jegyzetszveg"/>
+    <w:uiPriority w:val="99"/>
+    <w:semiHidden/>
+    <w:rsid w:val="000A20B0"/>
+    <w:rPr>
+      <w:rFonts w:ascii="Calibri" w:eastAsia="Calibri" w:hAnsi="Calibri" w:cs="Calibri"/>
+      <w:sz w:val="20"/>
+      <w:szCs w:val="20"/>
+      <w:lang w:val="hu-HU"/>
+    </w:rPr>
+  </w:style>
+  <w:style w:type="paragraph" w:styleId="Kpalrs">
+    <w:name w:val="caption"/>
+    <w:basedOn w:val="Norml"/>
+    <w:next w:val="Norml"/>
+    <w:uiPriority w:val="35"/>
+    <w:semiHidden/>
+    <w:unhideWhenUsed/>
+    <w:qFormat/>
+    <w:rsid w:val="000A20B0"/>
+    <w:pPr>
+      <w:spacing w:after="200"/>
+    </w:pPr>
+    <w:rPr>
+      <w:i/>
+      <w:iCs/>
+      <w:color w:val="1F497D" w:themeColor="text2"/>
+      <w:sz w:val="18"/>
+      <w:szCs w:val="18"/>
+    </w:rPr>
+  </w:style>
+  <w:style w:type="paragraph" w:styleId="Kiemeltidzet">
+    <w:name w:val="Intense Quote"/>
+    <w:basedOn w:val="Norml"/>
+    <w:next w:val="Norml"/>
+    <w:link w:val="KiemeltidzetChar"/>
+    <w:uiPriority w:val="30"/>
+    <w:qFormat/>
+    <w:rsid w:val="000A20B0"/>
+    <w:pPr>
+      <w:pBdr>
+        <w:top w:val="single" w:sz="4" w:space="10" w:color="4F81BD" w:themeColor="accent1"/>
+        <w:bottom w:val="single" w:sz="4" w:space="10" w:color="4F81BD" w:themeColor="accent1"/>
+      </w:pBdr>
+      <w:spacing w:before="360" w:after="360"/>
+      <w:ind w:left="864" w:right="864"/>
+      <w:jc w:val="center"/>
+    </w:pPr>
+    <w:rPr>
+      <w:i/>
+      <w:iCs/>
+      <w:color w:val="4F81BD" w:themeColor="accent1"/>
+    </w:rPr>
+  </w:style>
+  <w:style w:type="character" w:customStyle="1" w:styleId="KiemeltidzetChar">
+    <w:name w:val="Kiemelt idézet Char"/>
+    <w:basedOn w:val="Bekezdsalapbettpusa"/>
+    <w:link w:val="Kiemeltidzet"/>
+    <w:uiPriority w:val="30"/>
+    <w:rsid w:val="000A20B0"/>
+    <w:rPr>
+      <w:rFonts w:ascii="Calibri" w:eastAsia="Calibri" w:hAnsi="Calibri" w:cs="Calibri"/>
+      <w:i/>
+      <w:iCs/>
+      <w:color w:val="4F81BD" w:themeColor="accent1"/>
+      <w:lang w:val="hu-HU"/>
+    </w:rPr>
+  </w:style>
+  <w:style w:type="paragraph" w:styleId="Lbjegyzetszveg">
+    <w:name w:val="footnote text"/>
+    <w:basedOn w:val="Norml"/>
+    <w:link w:val="LbjegyzetszvegChar"/>
+    <w:uiPriority w:val="99"/>
+    <w:semiHidden/>
+    <w:unhideWhenUsed/>
+    <w:rsid w:val="000A20B0"/>
+    <w:rPr>
+      <w:sz w:val="20"/>
+      <w:szCs w:val="20"/>
+    </w:rPr>
+  </w:style>
+  <w:style w:type="character" w:customStyle="1" w:styleId="LbjegyzetszvegChar">
+    <w:name w:val="Lábjegyzetszöveg Char"/>
+    <w:basedOn w:val="Bekezdsalapbettpusa"/>
+    <w:link w:val="Lbjegyzetszveg"/>
+    <w:uiPriority w:val="99"/>
+    <w:semiHidden/>
+    <w:rsid w:val="000A20B0"/>
+    <w:rPr>
+      <w:rFonts w:ascii="Calibri" w:eastAsia="Calibri" w:hAnsi="Calibri" w:cs="Calibri"/>
+      <w:sz w:val="20"/>
+      <w:szCs w:val="20"/>
+      <w:lang w:val="hu-HU"/>
+    </w:rPr>
+  </w:style>
+  <w:style w:type="paragraph" w:styleId="Lista">
+    <w:name w:val="List"/>
+    <w:basedOn w:val="Norml"/>
+    <w:uiPriority w:val="99"/>
+    <w:semiHidden/>
+    <w:unhideWhenUsed/>
+    <w:rsid w:val="000A20B0"/>
+    <w:pPr>
+      <w:ind w:left="283" w:hanging="283"/>
+      <w:contextualSpacing/>
+    </w:pPr>
+  </w:style>
+  <w:style w:type="paragraph" w:styleId="Lista2">
+    <w:name w:val="List 2"/>
+    <w:basedOn w:val="Norml"/>
+    <w:uiPriority w:val="99"/>
+    <w:semiHidden/>
+    <w:unhideWhenUsed/>
+    <w:rsid w:val="000A20B0"/>
+    <w:pPr>
+      <w:ind w:left="566" w:hanging="283"/>
+      <w:contextualSpacing/>
+    </w:pPr>
+  </w:style>
+  <w:style w:type="paragraph" w:styleId="Lista3">
+    <w:name w:val="List 3"/>
+    <w:basedOn w:val="Norml"/>
+    <w:uiPriority w:val="99"/>
+    <w:semiHidden/>
+    <w:unhideWhenUsed/>
+    <w:rsid w:val="000A20B0"/>
+    <w:pPr>
+      <w:ind w:left="849" w:hanging="283"/>
+      <w:contextualSpacing/>
+    </w:pPr>
+  </w:style>
+  <w:style w:type="paragraph" w:styleId="Lista4">
+    <w:name w:val="List 4"/>
+    <w:basedOn w:val="Norml"/>
+    <w:uiPriority w:val="99"/>
+    <w:semiHidden/>
+    <w:unhideWhenUsed/>
+    <w:rsid w:val="000A20B0"/>
+    <w:pPr>
+      <w:ind w:left="1132" w:hanging="283"/>
+      <w:contextualSpacing/>
+    </w:pPr>
+  </w:style>
+  <w:style w:type="paragraph" w:styleId="Lista5">
+    <w:name w:val="List 5"/>
+    <w:basedOn w:val="Norml"/>
+    <w:uiPriority w:val="99"/>
+    <w:semiHidden/>
+    <w:unhideWhenUsed/>
+    <w:rsid w:val="000A20B0"/>
+    <w:pPr>
+      <w:ind w:left="1415" w:hanging="283"/>
+      <w:contextualSpacing/>
+    </w:pPr>
+  </w:style>
+  <w:style w:type="paragraph" w:styleId="Listafolytatsa">
+    <w:name w:val="List Continue"/>
+    <w:basedOn w:val="Norml"/>
+    <w:uiPriority w:val="99"/>
+    <w:semiHidden/>
+    <w:unhideWhenUsed/>
+    <w:rsid w:val="000A20B0"/>
+    <w:pPr>
+      <w:spacing w:after="120"/>
+      <w:ind w:left="283"/>
+      <w:contextualSpacing/>
+    </w:pPr>
+  </w:style>
+  <w:style w:type="paragraph" w:styleId="Listafolytatsa2">
+    <w:name w:val="List Continue 2"/>
+    <w:basedOn w:val="Norml"/>
+    <w:uiPriority w:val="99"/>
+    <w:semiHidden/>
+    <w:unhideWhenUsed/>
+    <w:rsid w:val="000A20B0"/>
+    <w:pPr>
+      <w:spacing w:after="120"/>
+      <w:ind w:left="566"/>
+      <w:contextualSpacing/>
+    </w:pPr>
+  </w:style>
+  <w:style w:type="paragraph" w:styleId="Listafolytatsa3">
+    <w:name w:val="List Continue 3"/>
+    <w:basedOn w:val="Norml"/>
+    <w:uiPriority w:val="99"/>
+    <w:semiHidden/>
+    <w:unhideWhenUsed/>
+    <w:rsid w:val="000A20B0"/>
+    <w:pPr>
+      <w:spacing w:after="120"/>
+      <w:ind w:left="849"/>
+      <w:contextualSpacing/>
+    </w:pPr>
+  </w:style>
+  <w:style w:type="paragraph" w:styleId="Listafolytatsa4">
+    <w:name w:val="List Continue 4"/>
+    <w:basedOn w:val="Norml"/>
+    <w:uiPriority w:val="99"/>
+    <w:semiHidden/>
+    <w:unhideWhenUsed/>
+    <w:rsid w:val="000A20B0"/>
+    <w:pPr>
+      <w:spacing w:after="120"/>
+      <w:ind w:left="1132"/>
+      <w:contextualSpacing/>
+    </w:pPr>
+  </w:style>
+  <w:style w:type="paragraph" w:styleId="Listafolytatsa5">
+    <w:name w:val="List Continue 5"/>
+    <w:basedOn w:val="Norml"/>
+    <w:uiPriority w:val="99"/>
+    <w:semiHidden/>
+    <w:unhideWhenUsed/>
+    <w:rsid w:val="000A20B0"/>
+    <w:pPr>
+      <w:spacing w:after="120"/>
+      <w:ind w:left="1415"/>
+      <w:contextualSpacing/>
+    </w:pPr>
+  </w:style>
+  <w:style w:type="paragraph" w:styleId="Makrszvege">
+    <w:name w:val="macro"/>
+    <w:link w:val="MakrszvegeChar"/>
+    <w:uiPriority w:val="99"/>
+    <w:semiHidden/>
+    <w:unhideWhenUsed/>
+    <w:rsid w:val="000A20B0"/>
+    <w:pPr>
+      <w:tabs>
+        <w:tab w:val="left" w:pos="480"/>
+        <w:tab w:val="left" w:pos="960"/>
+        <w:tab w:val="left" w:pos="1440"/>
+        <w:tab w:val="left" w:pos="1920"/>
+        <w:tab w:val="left" w:pos="2400"/>
+        <w:tab w:val="left" w:pos="2880"/>
+        <w:tab w:val="left" w:pos="3360"/>
+        <w:tab w:val="left" w:pos="3840"/>
+        <w:tab w:val="left" w:pos="4320"/>
+      </w:tabs>
+    </w:pPr>
+    <w:rPr>
+      <w:rFonts w:ascii="Consolas" w:eastAsia="Calibri" w:hAnsi="Consolas" w:cs="Calibri"/>
+      <w:sz w:val="20"/>
+      <w:szCs w:val="20"/>
+      <w:lang w:val="hu-HU"/>
+    </w:rPr>
+  </w:style>
+  <w:style w:type="character" w:customStyle="1" w:styleId="MakrszvegeChar">
+    <w:name w:val="Makró szövege Char"/>
+    <w:basedOn w:val="Bekezdsalapbettpusa"/>
+    <w:link w:val="Makrszvege"/>
+    <w:uiPriority w:val="99"/>
+    <w:semiHidden/>
+    <w:rsid w:val="000A20B0"/>
+    <w:rPr>
+      <w:rFonts w:ascii="Consolas" w:eastAsia="Calibri" w:hAnsi="Consolas" w:cs="Calibri"/>
+      <w:sz w:val="20"/>
+      <w:szCs w:val="20"/>
+      <w:lang w:val="hu-HU"/>
+    </w:rPr>
+  </w:style>
+  <w:style w:type="paragraph" w:styleId="Megjegyzstrgya">
+    <w:name w:val="annotation subject"/>
+    <w:basedOn w:val="Jegyzetszveg"/>
+    <w:next w:val="Jegyzetszveg"/>
+    <w:link w:val="MegjegyzstrgyaChar"/>
+    <w:uiPriority w:val="99"/>
+    <w:semiHidden/>
+    <w:unhideWhenUsed/>
+    <w:rsid w:val="000A20B0"/>
+    <w:rPr>
+      <w:b/>
+      <w:bCs/>
+    </w:rPr>
+  </w:style>
+  <w:style w:type="character" w:customStyle="1" w:styleId="MegjegyzstrgyaChar">
+    <w:name w:val="Megjegyzés tárgya Char"/>
+    <w:basedOn w:val="JegyzetszvegChar"/>
+    <w:link w:val="Megjegyzstrgya"/>
+    <w:uiPriority w:val="99"/>
+    <w:semiHidden/>
+    <w:rsid w:val="000A20B0"/>
+    <w:rPr>
+      <w:rFonts w:ascii="Calibri" w:eastAsia="Calibri" w:hAnsi="Calibri" w:cs="Calibri"/>
+      <w:b/>
+      <w:bCs/>
+      <w:sz w:val="20"/>
+      <w:szCs w:val="20"/>
+      <w:lang w:val="hu-HU"/>
+    </w:rPr>
+  </w:style>
+  <w:style w:type="paragraph" w:styleId="Megjegyzsfej">
+    <w:name w:val="Note Heading"/>
+    <w:basedOn w:val="Norml"/>
+    <w:next w:val="Norml"/>
+    <w:link w:val="MegjegyzsfejChar"/>
+    <w:uiPriority w:val="99"/>
+    <w:semiHidden/>
+    <w:unhideWhenUsed/>
+    <w:rsid w:val="000A20B0"/>
+  </w:style>
+  <w:style w:type="character" w:customStyle="1" w:styleId="MegjegyzsfejChar">
+    <w:name w:val="Megjegyzésfej Char"/>
+    <w:basedOn w:val="Bekezdsalapbettpusa"/>
+    <w:link w:val="Megjegyzsfej"/>
+    <w:uiPriority w:val="99"/>
+    <w:semiHidden/>
+    <w:rsid w:val="000A20B0"/>
+    <w:rPr>
+      <w:rFonts w:ascii="Calibri" w:eastAsia="Calibri" w:hAnsi="Calibri" w:cs="Calibri"/>
+      <w:lang w:val="hu-HU"/>
+    </w:rPr>
+  </w:style>
+  <w:style w:type="paragraph" w:styleId="Megszlts">
+    <w:name w:val="Salutation"/>
+    <w:basedOn w:val="Norml"/>
+    <w:next w:val="Norml"/>
+    <w:link w:val="MegszltsChar"/>
+    <w:uiPriority w:val="99"/>
+    <w:semiHidden/>
+    <w:unhideWhenUsed/>
+    <w:rsid w:val="000A20B0"/>
+  </w:style>
+  <w:style w:type="character" w:customStyle="1" w:styleId="MegszltsChar">
+    <w:name w:val="Megszólítás Char"/>
+    <w:basedOn w:val="Bekezdsalapbettpusa"/>
+    <w:link w:val="Megszlts"/>
+    <w:uiPriority w:val="99"/>
+    <w:semiHidden/>
+    <w:rsid w:val="000A20B0"/>
+    <w:rPr>
+      <w:rFonts w:ascii="Calibri" w:eastAsia="Calibri" w:hAnsi="Calibri" w:cs="Calibri"/>
+      <w:lang w:val="hu-HU"/>
+    </w:rPr>
+  </w:style>
+  <w:style w:type="paragraph" w:styleId="Nincstrkz">
+    <w:name w:val="No Spacing"/>
+    <w:uiPriority w:val="1"/>
+    <w:qFormat/>
+    <w:rsid w:val="000A20B0"/>
+    <w:rPr>
+      <w:rFonts w:ascii="Calibri" w:eastAsia="Calibri" w:hAnsi="Calibri" w:cs="Calibri"/>
+      <w:lang w:val="hu-HU"/>
+    </w:rPr>
+  </w:style>
+  <w:style w:type="paragraph" w:styleId="NormlWeb">
+    <w:name w:val="Normal (Web)"/>
+    <w:basedOn w:val="Norml"/>
+    <w:uiPriority w:val="99"/>
+    <w:semiHidden/>
+    <w:unhideWhenUsed/>
+    <w:rsid w:val="000A20B0"/>
+    <w:rPr>
+      <w:rFonts w:ascii="Times New Roman" w:hAnsi="Times New Roman" w:cs="Times New Roman"/>
+      <w:sz w:val="24"/>
+      <w:szCs w:val="24"/>
+    </w:rPr>
+  </w:style>
+  <w:style w:type="paragraph" w:styleId="Normlbehzs">
+    <w:name w:val="Normal Indent"/>
+    <w:basedOn w:val="Norml"/>
+    <w:uiPriority w:val="99"/>
+    <w:semiHidden/>
+    <w:unhideWhenUsed/>
+    <w:rsid w:val="000A20B0"/>
+    <w:pPr>
+      <w:ind w:left="708"/>
+    </w:pPr>
+  </w:style>
+  <w:style w:type="paragraph" w:styleId="Szmozottlista">
+    <w:name w:val="List Number"/>
+    <w:basedOn w:val="Norml"/>
+    <w:uiPriority w:val="99"/>
+    <w:semiHidden/>
+    <w:unhideWhenUsed/>
+    <w:rsid w:val="000A20B0"/>
+    <w:pPr>
+      <w:numPr>
+        <w:numId w:val="17"/>
+      </w:numPr>
+      <w:contextualSpacing/>
+    </w:pPr>
+  </w:style>
+  <w:style w:type="paragraph" w:styleId="Szmozottlista2">
+    <w:name w:val="List Number 2"/>
+    <w:basedOn w:val="Norml"/>
+    <w:uiPriority w:val="99"/>
+    <w:semiHidden/>
+    <w:unhideWhenUsed/>
+    <w:rsid w:val="000A20B0"/>
+    <w:pPr>
+      <w:numPr>
+        <w:numId w:val="18"/>
+      </w:numPr>
+      <w:contextualSpacing/>
+    </w:pPr>
+  </w:style>
+  <w:style w:type="paragraph" w:styleId="Szmozottlista3">
+    <w:name w:val="List Number 3"/>
+    <w:basedOn w:val="Norml"/>
+    <w:uiPriority w:val="99"/>
+    <w:semiHidden/>
+    <w:unhideWhenUsed/>
+    <w:rsid w:val="000A20B0"/>
+    <w:pPr>
+      <w:numPr>
+        <w:numId w:val="19"/>
+      </w:numPr>
+      <w:contextualSpacing/>
+    </w:pPr>
+  </w:style>
+  <w:style w:type="paragraph" w:styleId="Szmozottlista4">
+    <w:name w:val="List Number 4"/>
+    <w:basedOn w:val="Norml"/>
+    <w:uiPriority w:val="99"/>
+    <w:semiHidden/>
+    <w:unhideWhenUsed/>
+    <w:rsid w:val="000A20B0"/>
+    <w:pPr>
+      <w:numPr>
+        <w:numId w:val="20"/>
+      </w:numPr>
+      <w:contextualSpacing/>
+    </w:pPr>
+  </w:style>
+  <w:style w:type="paragraph" w:styleId="Szmozottlista5">
+    <w:name w:val="List Number 5"/>
+    <w:basedOn w:val="Norml"/>
+    <w:uiPriority w:val="99"/>
+    <w:semiHidden/>
+    <w:unhideWhenUsed/>
+    <w:rsid w:val="000A20B0"/>
+    <w:pPr>
+      <w:numPr>
+        <w:numId w:val="21"/>
+      </w:numPr>
+      <w:contextualSpacing/>
+    </w:pPr>
+  </w:style>
+  <w:style w:type="paragraph" w:styleId="Szvegblokk">
+    <w:name w:val="Block Text"/>
+    <w:basedOn w:val="Norml"/>
+    <w:uiPriority w:val="99"/>
+    <w:semiHidden/>
+    <w:unhideWhenUsed/>
+    <w:rsid w:val="000A20B0"/>
+    <w:pPr>
+      <w:pBdr>
+        <w:top w:val="single" w:sz="2" w:space="10" w:color="4F81BD" w:themeColor="accent1"/>
+        <w:left w:val="single" w:sz="2" w:space="10" w:color="4F81BD" w:themeColor="accent1"/>
+        <w:bottom w:val="single" w:sz="2" w:space="10" w:color="4F81BD" w:themeColor="accent1"/>
+        <w:right w:val="single" w:sz="2" w:space="10" w:color="4F81BD" w:themeColor="accent1"/>
+      </w:pBdr>
+      <w:ind w:left="1152" w:right="1152"/>
+    </w:pPr>
+    <w:rPr>
+      <w:rFonts w:asciiTheme="minorHAnsi" w:eastAsiaTheme="minorEastAsia" w:hAnsiTheme="minorHAnsi" w:cstheme="minorBidi"/>
+      <w:i/>
+      <w:iCs/>
+      <w:color w:val="4F81BD" w:themeColor="accent1"/>
+    </w:rPr>
+  </w:style>
+  <w:style w:type="paragraph" w:styleId="Szvegtrzs2">
+    <w:name w:val="Body Text 2"/>
+    <w:basedOn w:val="Norml"/>
+    <w:link w:val="Szvegtrzs2Char"/>
+    <w:uiPriority w:val="99"/>
+    <w:semiHidden/>
+    <w:unhideWhenUsed/>
+    <w:rsid w:val="000A20B0"/>
+    <w:pPr>
+      <w:spacing w:after="120" w:line="480" w:lineRule="auto"/>
+    </w:pPr>
+  </w:style>
+  <w:style w:type="character" w:customStyle="1" w:styleId="Szvegtrzs2Char">
+    <w:name w:val="Szövegtörzs 2 Char"/>
+    <w:basedOn w:val="Bekezdsalapbettpusa"/>
+    <w:link w:val="Szvegtrzs2"/>
+    <w:uiPriority w:val="99"/>
+    <w:semiHidden/>
+    <w:rsid w:val="000A20B0"/>
+    <w:rPr>
+      <w:rFonts w:ascii="Calibri" w:eastAsia="Calibri" w:hAnsi="Calibri" w:cs="Calibri"/>
+      <w:lang w:val="hu-HU"/>
+    </w:rPr>
+  </w:style>
+  <w:style w:type="paragraph" w:styleId="Szvegtrzs3">
+    <w:name w:val="Body Text 3"/>
+    <w:basedOn w:val="Norml"/>
+    <w:link w:val="Szvegtrzs3Char"/>
+    <w:uiPriority w:val="99"/>
+    <w:semiHidden/>
+    <w:unhideWhenUsed/>
+    <w:rsid w:val="000A20B0"/>
+    <w:pPr>
+      <w:spacing w:after="120"/>
+    </w:pPr>
+    <w:rPr>
+      <w:sz w:val="16"/>
+      <w:szCs w:val="16"/>
+    </w:rPr>
+  </w:style>
+  <w:style w:type="character" w:customStyle="1" w:styleId="Szvegtrzs3Char">
+    <w:name w:val="Szövegtörzs 3 Char"/>
+    <w:basedOn w:val="Bekezdsalapbettpusa"/>
+    <w:link w:val="Szvegtrzs3"/>
+    <w:uiPriority w:val="99"/>
+    <w:semiHidden/>
+    <w:rsid w:val="000A20B0"/>
+    <w:rPr>
+      <w:rFonts w:ascii="Calibri" w:eastAsia="Calibri" w:hAnsi="Calibri" w:cs="Calibri"/>
+      <w:sz w:val="16"/>
+      <w:szCs w:val="16"/>
+      <w:lang w:val="hu-HU"/>
+    </w:rPr>
+  </w:style>
+  <w:style w:type="paragraph" w:styleId="Szvegtrzsbehzssal">
+    <w:name w:val="Body Text Indent"/>
+    <w:basedOn w:val="Norml"/>
+    <w:link w:val="SzvegtrzsbehzssalChar"/>
+    <w:uiPriority w:val="99"/>
+    <w:semiHidden/>
+    <w:unhideWhenUsed/>
+    <w:rsid w:val="000A20B0"/>
+    <w:pPr>
+      <w:spacing w:after="120"/>
+      <w:ind w:left="283"/>
+    </w:pPr>
+  </w:style>
+  <w:style w:type="character" w:customStyle="1" w:styleId="SzvegtrzsbehzssalChar">
+    <w:name w:val="Szövegtörzs behúzással Char"/>
+    <w:basedOn w:val="Bekezdsalapbettpusa"/>
+    <w:link w:val="Szvegtrzsbehzssal"/>
+    <w:uiPriority w:val="99"/>
+    <w:semiHidden/>
+    <w:rsid w:val="000A20B0"/>
+    <w:rPr>
+      <w:rFonts w:ascii="Calibri" w:eastAsia="Calibri" w:hAnsi="Calibri" w:cs="Calibri"/>
+      <w:lang w:val="hu-HU"/>
+    </w:rPr>
+  </w:style>
+  <w:style w:type="paragraph" w:styleId="Szvegtrzsbehzssal2">
+    <w:name w:val="Body Text Indent 2"/>
+    <w:basedOn w:val="Norml"/>
+    <w:link w:val="Szvegtrzsbehzssal2Char"/>
+    <w:uiPriority w:val="99"/>
+    <w:semiHidden/>
+    <w:unhideWhenUsed/>
+    <w:rsid w:val="000A20B0"/>
+    <w:pPr>
+      <w:spacing w:after="120" w:line="480" w:lineRule="auto"/>
+      <w:ind w:left="283"/>
+    </w:pPr>
+  </w:style>
+  <w:style w:type="character" w:customStyle="1" w:styleId="Szvegtrzsbehzssal2Char">
+    <w:name w:val="Szövegtörzs behúzással 2 Char"/>
+    <w:basedOn w:val="Bekezdsalapbettpusa"/>
+    <w:link w:val="Szvegtrzsbehzssal2"/>
+    <w:uiPriority w:val="99"/>
+    <w:semiHidden/>
+    <w:rsid w:val="000A20B0"/>
+    <w:rPr>
+      <w:rFonts w:ascii="Calibri" w:eastAsia="Calibri" w:hAnsi="Calibri" w:cs="Calibri"/>
+      <w:lang w:val="hu-HU"/>
+    </w:rPr>
+  </w:style>
+  <w:style w:type="paragraph" w:styleId="Szvegtrzsbehzssal3">
+    <w:name w:val="Body Text Indent 3"/>
+    <w:basedOn w:val="Norml"/>
+    <w:link w:val="Szvegtrzsbehzssal3Char"/>
+    <w:uiPriority w:val="99"/>
+    <w:semiHidden/>
+    <w:unhideWhenUsed/>
+    <w:rsid w:val="000A20B0"/>
+    <w:pPr>
+      <w:spacing w:after="120"/>
+      <w:ind w:left="283"/>
+    </w:pPr>
+    <w:rPr>
+      <w:sz w:val="16"/>
+      <w:szCs w:val="16"/>
+    </w:rPr>
+  </w:style>
+  <w:style w:type="character" w:customStyle="1" w:styleId="Szvegtrzsbehzssal3Char">
+    <w:name w:val="Szövegtörzs behúzással 3 Char"/>
+    <w:basedOn w:val="Bekezdsalapbettpusa"/>
+    <w:link w:val="Szvegtrzsbehzssal3"/>
+    <w:uiPriority w:val="99"/>
+    <w:semiHidden/>
+    <w:rsid w:val="000A20B0"/>
+    <w:rPr>
+      <w:rFonts w:ascii="Calibri" w:eastAsia="Calibri" w:hAnsi="Calibri" w:cs="Calibri"/>
+      <w:sz w:val="16"/>
+      <w:szCs w:val="16"/>
+      <w:lang w:val="hu-HU"/>
+    </w:rPr>
+  </w:style>
+  <w:style w:type="paragraph" w:styleId="Szvegtrzselssora">
+    <w:name w:val="Body Text First Indent"/>
+    <w:basedOn w:val="Szvegtrzs"/>
+    <w:link w:val="SzvegtrzselssoraChar"/>
+    <w:uiPriority w:val="99"/>
+    <w:semiHidden/>
+    <w:unhideWhenUsed/>
+    <w:rsid w:val="000A20B0"/>
+    <w:pPr>
+      <w:ind w:left="0" w:firstLine="360"/>
+    </w:pPr>
+    <w:rPr>
+      <w:sz w:val="22"/>
+      <w:szCs w:val="22"/>
+    </w:rPr>
+  </w:style>
+  <w:style w:type="character" w:customStyle="1" w:styleId="SzvegtrzsChar">
+    <w:name w:val="Szövegtörzs Char"/>
+    <w:basedOn w:val="Bekezdsalapbettpusa"/>
+    <w:link w:val="Szvegtrzs"/>
+    <w:uiPriority w:val="1"/>
+    <w:rsid w:val="000A20B0"/>
+    <w:rPr>
+      <w:rFonts w:ascii="Calibri" w:eastAsia="Calibri" w:hAnsi="Calibri" w:cs="Calibri"/>
+      <w:sz w:val="24"/>
+      <w:szCs w:val="24"/>
+      <w:lang w:val="hu-HU"/>
+    </w:rPr>
+  </w:style>
+  <w:style w:type="character" w:customStyle="1" w:styleId="SzvegtrzselssoraChar">
+    <w:name w:val="Szövegtörzs első sora Char"/>
+    <w:basedOn w:val="SzvegtrzsChar"/>
+    <w:link w:val="Szvegtrzselssora"/>
+    <w:uiPriority w:val="99"/>
+    <w:semiHidden/>
+    <w:rsid w:val="000A20B0"/>
+    <w:rPr>
+      <w:rFonts w:ascii="Calibri" w:eastAsia="Calibri" w:hAnsi="Calibri" w:cs="Calibri"/>
+      <w:sz w:val="24"/>
+      <w:szCs w:val="24"/>
+      <w:lang w:val="hu-HU"/>
+    </w:rPr>
+  </w:style>
+  <w:style w:type="paragraph" w:styleId="Szvegtrzselssora2">
+    <w:name w:val="Body Text First Indent 2"/>
+    <w:basedOn w:val="Szvegtrzsbehzssal"/>
+    <w:link w:val="Szvegtrzselssora2Char"/>
+    <w:uiPriority w:val="99"/>
+    <w:semiHidden/>
+    <w:unhideWhenUsed/>
+    <w:rsid w:val="000A20B0"/>
+    <w:pPr>
+      <w:spacing w:after="0"/>
+      <w:ind w:left="360" w:firstLine="360"/>
+    </w:pPr>
+  </w:style>
+  <w:style w:type="character" w:customStyle="1" w:styleId="Szvegtrzselssora2Char">
+    <w:name w:val="Szövegtörzs első sora 2 Char"/>
+    <w:basedOn w:val="SzvegtrzsbehzssalChar"/>
+    <w:link w:val="Szvegtrzselssora2"/>
+    <w:uiPriority w:val="99"/>
+    <w:semiHidden/>
+    <w:rsid w:val="000A20B0"/>
+    <w:rPr>
+      <w:rFonts w:ascii="Calibri" w:eastAsia="Calibri" w:hAnsi="Calibri" w:cs="Calibri"/>
+      <w:lang w:val="hu-HU"/>
+    </w:rPr>
+  </w:style>
+  <w:style w:type="paragraph" w:styleId="Trgymutat1">
+    <w:name w:val="index 1"/>
+    <w:basedOn w:val="Norml"/>
+    <w:next w:val="Norml"/>
+    <w:autoRedefine/>
+    <w:uiPriority w:val="99"/>
+    <w:semiHidden/>
+    <w:unhideWhenUsed/>
+    <w:rsid w:val="000A20B0"/>
+    <w:pPr>
+      <w:ind w:left="220" w:hanging="220"/>
+    </w:pPr>
+  </w:style>
+  <w:style w:type="paragraph" w:styleId="Trgymutat2">
+    <w:name w:val="index 2"/>
+    <w:basedOn w:val="Norml"/>
+    <w:next w:val="Norml"/>
+    <w:autoRedefine/>
+    <w:uiPriority w:val="99"/>
+    <w:semiHidden/>
+    <w:unhideWhenUsed/>
+    <w:rsid w:val="000A20B0"/>
+    <w:pPr>
+      <w:ind w:left="440" w:hanging="220"/>
+    </w:pPr>
+  </w:style>
+  <w:style w:type="paragraph" w:styleId="Trgymutat3">
+    <w:name w:val="index 3"/>
+    <w:basedOn w:val="Norml"/>
+    <w:next w:val="Norml"/>
+    <w:autoRedefine/>
+    <w:uiPriority w:val="99"/>
+    <w:semiHidden/>
+    <w:unhideWhenUsed/>
+    <w:rsid w:val="000A20B0"/>
+    <w:pPr>
+      <w:ind w:left="660" w:hanging="220"/>
+    </w:pPr>
+  </w:style>
+  <w:style w:type="paragraph" w:styleId="Trgymutat4">
+    <w:name w:val="index 4"/>
+    <w:basedOn w:val="Norml"/>
+    <w:next w:val="Norml"/>
+    <w:autoRedefine/>
+    <w:uiPriority w:val="99"/>
+    <w:semiHidden/>
+    <w:unhideWhenUsed/>
+    <w:rsid w:val="000A20B0"/>
+    <w:pPr>
+      <w:ind w:left="880" w:hanging="220"/>
+    </w:pPr>
+  </w:style>
+  <w:style w:type="paragraph" w:styleId="Trgymutat5">
+    <w:name w:val="index 5"/>
+    <w:basedOn w:val="Norml"/>
+    <w:next w:val="Norml"/>
+    <w:autoRedefine/>
+    <w:uiPriority w:val="99"/>
+    <w:semiHidden/>
+    <w:unhideWhenUsed/>
+    <w:rsid w:val="000A20B0"/>
+    <w:pPr>
+      <w:ind w:left="1100" w:hanging="220"/>
+    </w:pPr>
+  </w:style>
+  <w:style w:type="paragraph" w:styleId="Trgymutat6">
+    <w:name w:val="index 6"/>
+    <w:basedOn w:val="Norml"/>
+    <w:next w:val="Norml"/>
+    <w:autoRedefine/>
+    <w:uiPriority w:val="99"/>
+    <w:semiHidden/>
+    <w:unhideWhenUsed/>
+    <w:rsid w:val="000A20B0"/>
+    <w:pPr>
+      <w:ind w:left="1320" w:hanging="220"/>
+    </w:pPr>
+  </w:style>
+  <w:style w:type="paragraph" w:styleId="Trgymutat7">
+    <w:name w:val="index 7"/>
+    <w:basedOn w:val="Norml"/>
+    <w:next w:val="Norml"/>
+    <w:autoRedefine/>
+    <w:uiPriority w:val="99"/>
+    <w:semiHidden/>
+    <w:unhideWhenUsed/>
+    <w:rsid w:val="000A20B0"/>
+    <w:pPr>
+      <w:ind w:left="1540" w:hanging="220"/>
+    </w:pPr>
+  </w:style>
+  <w:style w:type="paragraph" w:styleId="Trgymutat8">
+    <w:name w:val="index 8"/>
+    <w:basedOn w:val="Norml"/>
+    <w:next w:val="Norml"/>
+    <w:autoRedefine/>
+    <w:uiPriority w:val="99"/>
+    <w:semiHidden/>
+    <w:unhideWhenUsed/>
+    <w:rsid w:val="000A20B0"/>
+    <w:pPr>
+      <w:ind w:left="1760" w:hanging="220"/>
+    </w:pPr>
+  </w:style>
+  <w:style w:type="paragraph" w:styleId="Trgymutat9">
+    <w:name w:val="index 9"/>
+    <w:basedOn w:val="Norml"/>
+    <w:next w:val="Norml"/>
+    <w:autoRedefine/>
+    <w:uiPriority w:val="99"/>
+    <w:semiHidden/>
+    <w:unhideWhenUsed/>
+    <w:rsid w:val="000A20B0"/>
+    <w:pPr>
+      <w:ind w:left="1980" w:hanging="220"/>
+    </w:pPr>
+  </w:style>
+  <w:style w:type="paragraph" w:styleId="Trgymutatcm">
+    <w:name w:val="index heading"/>
+    <w:basedOn w:val="Norml"/>
+    <w:next w:val="Trgymutat1"/>
+    <w:uiPriority w:val="99"/>
+    <w:semiHidden/>
+    <w:unhideWhenUsed/>
+    <w:rsid w:val="000A20B0"/>
+    <w:rPr>
+      <w:rFonts w:asciiTheme="majorHAnsi" w:eastAsiaTheme="majorEastAsia" w:hAnsiTheme="majorHAnsi" w:cstheme="majorBidi"/>
+      <w:b/>
+      <w:bCs/>
+    </w:rPr>
+  </w:style>
+  <w:style w:type="paragraph" w:styleId="Tartalomjegyzkcmsora">
+    <w:name w:val="TOC Heading"/>
+    <w:basedOn w:val="Cmsor1"/>
+    <w:next w:val="Norml"/>
+    <w:uiPriority w:val="39"/>
+    <w:semiHidden/>
+    <w:unhideWhenUsed/>
+    <w:qFormat/>
+    <w:rsid w:val="000A20B0"/>
+    <w:pPr>
+      <w:keepNext/>
+      <w:keepLines/>
+      <w:spacing w:before="240"/>
+      <w:ind w:left="0"/>
+      <w:outlineLvl w:val="9"/>
+    </w:pPr>
+    <w:rPr>
+      <w:rFonts w:asciiTheme="majorHAnsi" w:eastAsiaTheme="majorEastAsia" w:hAnsiTheme="majorHAnsi" w:cstheme="majorBidi"/>
+      <w:b w:val="0"/>
+      <w:bCs w:val="0"/>
+      <w:color w:val="365F91" w:themeColor="accent1" w:themeShade="BF"/>
+      <w:sz w:val="32"/>
+      <w:szCs w:val="32"/>
+    </w:rPr>
+  </w:style>
+  <w:style w:type="paragraph" w:styleId="TJ1">
+    <w:name w:val="toc 1"/>
+    <w:basedOn w:val="Norml"/>
+    <w:next w:val="Norml"/>
+    <w:autoRedefine/>
+    <w:uiPriority w:val="39"/>
+    <w:semiHidden/>
+    <w:unhideWhenUsed/>
+    <w:rsid w:val="000A20B0"/>
+    <w:pPr>
+      <w:spacing w:after="100"/>
+    </w:pPr>
+  </w:style>
+  <w:style w:type="paragraph" w:styleId="TJ2">
+    <w:name w:val="toc 2"/>
+    <w:basedOn w:val="Norml"/>
+    <w:next w:val="Norml"/>
+    <w:autoRedefine/>
+    <w:uiPriority w:val="39"/>
+    <w:semiHidden/>
+    <w:unhideWhenUsed/>
+    <w:rsid w:val="000A20B0"/>
+    <w:pPr>
+      <w:spacing w:after="100"/>
+      <w:ind w:left="220"/>
+    </w:pPr>
+  </w:style>
+  <w:style w:type="paragraph" w:styleId="TJ3">
+    <w:name w:val="toc 3"/>
+    <w:basedOn w:val="Norml"/>
+    <w:next w:val="Norml"/>
+    <w:autoRedefine/>
+    <w:uiPriority w:val="39"/>
+    <w:semiHidden/>
+    <w:unhideWhenUsed/>
+    <w:rsid w:val="000A20B0"/>
+    <w:pPr>
+      <w:spacing w:after="100"/>
+      <w:ind w:left="440"/>
+    </w:pPr>
+  </w:style>
+  <w:style w:type="paragraph" w:styleId="TJ4">
+    <w:name w:val="toc 4"/>
+    <w:basedOn w:val="Norml"/>
+    <w:next w:val="Norml"/>
+    <w:autoRedefine/>
+    <w:uiPriority w:val="39"/>
+    <w:semiHidden/>
+    <w:unhideWhenUsed/>
+    <w:rsid w:val="000A20B0"/>
+    <w:pPr>
+      <w:spacing w:after="100"/>
+      <w:ind w:left="660"/>
+    </w:pPr>
+  </w:style>
+  <w:style w:type="paragraph" w:styleId="TJ5">
+    <w:name w:val="toc 5"/>
+    <w:basedOn w:val="Norml"/>
+    <w:next w:val="Norml"/>
+    <w:autoRedefine/>
+    <w:uiPriority w:val="39"/>
+    <w:semiHidden/>
+    <w:unhideWhenUsed/>
+    <w:rsid w:val="000A20B0"/>
+    <w:pPr>
+      <w:spacing w:after="100"/>
+      <w:ind w:left="880"/>
+    </w:pPr>
+  </w:style>
+  <w:style w:type="paragraph" w:styleId="TJ6">
+    <w:name w:val="toc 6"/>
+    <w:basedOn w:val="Norml"/>
+    <w:next w:val="Norml"/>
+    <w:autoRedefine/>
+    <w:uiPriority w:val="39"/>
+    <w:semiHidden/>
+    <w:unhideWhenUsed/>
+    <w:rsid w:val="000A20B0"/>
+    <w:pPr>
+      <w:spacing w:after="100"/>
+      <w:ind w:left="1100"/>
+    </w:pPr>
+  </w:style>
+  <w:style w:type="paragraph" w:styleId="TJ7">
+    <w:name w:val="toc 7"/>
+    <w:basedOn w:val="Norml"/>
+    <w:next w:val="Norml"/>
+    <w:autoRedefine/>
+    <w:uiPriority w:val="39"/>
+    <w:semiHidden/>
+    <w:unhideWhenUsed/>
+    <w:rsid w:val="000A20B0"/>
+    <w:pPr>
+      <w:spacing w:after="100"/>
+      <w:ind w:left="1320"/>
+    </w:pPr>
+  </w:style>
+  <w:style w:type="paragraph" w:styleId="TJ8">
+    <w:name w:val="toc 8"/>
+    <w:basedOn w:val="Norml"/>
+    <w:next w:val="Norml"/>
+    <w:autoRedefine/>
+    <w:uiPriority w:val="39"/>
+    <w:semiHidden/>
+    <w:unhideWhenUsed/>
+    <w:rsid w:val="000A20B0"/>
+    <w:pPr>
+      <w:spacing w:after="100"/>
+      <w:ind w:left="1540"/>
+    </w:pPr>
+  </w:style>
+  <w:style w:type="paragraph" w:styleId="TJ9">
+    <w:name w:val="toc 9"/>
+    <w:basedOn w:val="Norml"/>
+    <w:next w:val="Norml"/>
+    <w:autoRedefine/>
+    <w:uiPriority w:val="39"/>
+    <w:semiHidden/>
+    <w:unhideWhenUsed/>
+    <w:rsid w:val="000A20B0"/>
+    <w:pPr>
+      <w:spacing w:after="100"/>
+      <w:ind w:left="1760"/>
+    </w:pPr>
+  </w:style>
+  <w:style w:type="paragraph" w:styleId="zenetfej">
+    <w:name w:val="Message Header"/>
+    <w:basedOn w:val="Norml"/>
+    <w:link w:val="zenetfejChar"/>
+    <w:uiPriority w:val="99"/>
+    <w:semiHidden/>
+    <w:unhideWhenUsed/>
+    <w:rsid w:val="000A20B0"/>
+    <w:pPr>
+      <w:pBdr>
+        <w:top w:val="single" w:sz="6" w:space="1" w:color="auto"/>
+        <w:left w:val="single" w:sz="6" w:space="1" w:color="auto"/>
+        <w:bottom w:val="single" w:sz="6" w:space="1" w:color="auto"/>
+        <w:right w:val="single" w:sz="6" w:space="1" w:color="auto"/>
+      </w:pBdr>
+      <w:shd w:val="pct20" w:color="auto" w:fill="auto"/>
+      <w:ind w:left="1134" w:hanging="1134"/>
+    </w:pPr>
+    <w:rPr>
+      <w:rFonts w:asciiTheme="majorHAnsi" w:eastAsiaTheme="majorEastAsia" w:hAnsiTheme="majorHAnsi" w:cstheme="majorBidi"/>
+      <w:sz w:val="24"/>
+      <w:szCs w:val="24"/>
+    </w:rPr>
+  </w:style>
+  <w:style w:type="character" w:customStyle="1" w:styleId="zenetfejChar">
+    <w:name w:val="Üzenetfej Char"/>
+    <w:basedOn w:val="Bekezdsalapbettpusa"/>
+    <w:link w:val="zenetfej"/>
+    <w:uiPriority w:val="99"/>
+    <w:semiHidden/>
+    <w:rsid w:val="000A20B0"/>
+    <w:rPr>
+      <w:rFonts w:asciiTheme="majorHAnsi" w:eastAsiaTheme="majorEastAsia" w:hAnsiTheme="majorHAnsi" w:cstheme="majorBidi"/>
+      <w:sz w:val="24"/>
+      <w:szCs w:val="24"/>
+      <w:shd w:val="pct20" w:color="auto" w:fill="auto"/>
+      <w:lang w:val="hu-HU"/>
+    </w:rPr>
+  </w:style>
+  <w:style w:type="paragraph" w:styleId="Vgjegyzetszvege">
+    <w:name w:val="endnote text"/>
+    <w:basedOn w:val="Norml"/>
+    <w:link w:val="VgjegyzetszvegeChar"/>
+    <w:uiPriority w:val="99"/>
+    <w:semiHidden/>
+    <w:unhideWhenUsed/>
+    <w:rsid w:val="000A20B0"/>
+    <w:rPr>
+      <w:sz w:val="20"/>
+      <w:szCs w:val="20"/>
+    </w:rPr>
+  </w:style>
+  <w:style w:type="character" w:customStyle="1" w:styleId="VgjegyzetszvegeChar">
+    <w:name w:val="Végjegyzet szövege Char"/>
+    <w:basedOn w:val="Bekezdsalapbettpusa"/>
+    <w:link w:val="Vgjegyzetszvege"/>
+    <w:uiPriority w:val="99"/>
+    <w:semiHidden/>
+    <w:rsid w:val="000A20B0"/>
+    <w:rPr>
+      <w:rFonts w:ascii="Calibri" w:eastAsia="Calibri" w:hAnsi="Calibri" w:cs="Calibri"/>
+      <w:sz w:val="20"/>
+      <w:szCs w:val="20"/>
+      <w:lang w:val="hu-HU"/>
     </w:rPr>
   </w:style>
 </w:styles>

</xml_diff>

<commit_message>
újabb suzuki fájl módosítások :|
</commit_message>
<xml_diff>
--- a/public/images/Suzuki menedzser tajekoztato 45 alattiaknak.docx
+++ b/public/images/Suzuki menedzser tajekoztato 45 alattiaknak.docx
@@ -9,19 +9,10 @@
         <w:ind w:left="0" w:firstLine="0"/>
         <w:jc w:val="center"/>
         <w:rPr>
-          <w:rFonts w:ascii="Suzuki Pro" w:hAnsi="Suzuki Pro" w:cstheme="minorHAnsi"/>
+          <w:rFonts w:ascii="SuzukiPRORegular" w:hAnsi="SuzukiPRORegular" w:cstheme="minorHAnsi"/>
           <w:b/>
-          <w:sz w:val="32"/>
-        </w:rPr>
-      </w:pPr>
-      <w:r>
-        <w:rPr>
-          <w:rFonts w:ascii="Suzuki Pro" w:hAnsi="Suzuki Pro" w:cstheme="minorHAnsi"/>
-          <w:b/>
-          <w:sz w:val="32"/>
-        </w:rPr>
-        <w:t>Tisztelt Hölgyem/Uram!</w:t>
-      </w:r>
+        </w:rPr>
+      </w:pPr>
     </w:p>
     <w:p>
       <w:pPr>
@@ -30,18 +21,36 @@
         <w:ind w:left="0" w:firstLine="0"/>
         <w:jc w:val="center"/>
         <w:rPr>
-          <w:rFonts w:ascii="Suzuki Pro" w:hAnsi="Suzuki Pro" w:cstheme="minorHAnsi"/>
+          <w:rFonts w:ascii="SuzukiPRORegular" w:hAnsi="SuzukiPRORegular" w:cstheme="minorHAnsi"/>
           <w:b/>
-          <w:sz w:val="32"/>
         </w:rPr>
       </w:pPr>
     </w:p>
     <w:p>
       <w:pPr>
+        <w:pStyle w:val="Szvegtrzs"/>
+        <w:spacing w:after="120"/>
+        <w:ind w:left="0" w:firstLine="0"/>
+        <w:jc w:val="center"/>
+        <w:rPr>
+          <w:rFonts w:ascii="SuzukiPRORegular" w:hAnsi="SuzukiPRORegular" w:cstheme="minorHAnsi"/>
+          <w:b/>
+        </w:rPr>
+      </w:pPr>
+      <w:r>
+        <w:rPr>
+          <w:rFonts w:ascii="SuzukiPRORegular" w:hAnsi="SuzukiPRORegular" w:cstheme="minorHAnsi"/>
+          <w:b/>
+        </w:rPr>
+        <w:t>Tisztelt Hölgyem/Uram!</w:t>
+      </w:r>
+    </w:p>
+    <w:p>
+      <w:pPr>
         <w:spacing w:after="120"/>
         <w:jc w:val="center"/>
         <w:rPr>
-          <w:rFonts w:ascii="Suzuki Pro" w:hAnsi="Suzuki Pro" w:cstheme="minorHAnsi"/>
+          <w:rFonts w:ascii="SuzukiPRORegular" w:hAnsi="SuzukiPRORegular" w:cstheme="minorHAnsi"/>
           <w:sz w:val="24"/>
           <w:szCs w:val="24"/>
           <w:shd w:val="clear" w:color="auto" w:fill="FFFFFF"/>
@@ -49,108 +58,32 @@
       </w:pPr>
       <w:r>
         <w:rPr>
-          <w:rFonts w:ascii="Suzuki Pro" w:hAnsi="Suzuki Pro" w:cstheme="minorHAnsi"/>
+          <w:rFonts w:ascii="SuzukiPRORegular" w:hAnsi="SuzukiPRORegular" w:cstheme="minorHAnsi"/>
           <w:sz w:val="24"/>
           <w:szCs w:val="24"/>
           <w:shd w:val="clear" w:color="auto" w:fill="FFFFFF"/>
         </w:rPr>
-        <w:t>Kö</w:t>
-      </w:r>
-      <w:r>
-        <w:rPr>
-          <w:rFonts w:ascii="Suzuki Pro" w:hAnsi="Suzuki Pro" w:cstheme="minorHAnsi"/>
+        <w:t xml:space="preserve">Köszönjük, hogy a Hungária </w:t>
+      </w:r>
+      <w:proofErr w:type="spellStart"/>
+      <w:r>
+        <w:rPr>
+          <w:rFonts w:ascii="SuzukiPRORegular" w:hAnsi="SuzukiPRORegular" w:cstheme="minorHAnsi"/>
           <w:sz w:val="24"/>
           <w:szCs w:val="24"/>
           <w:shd w:val="clear" w:color="auto" w:fill="FFFFFF"/>
         </w:rPr>
-        <w:t xml:space="preserve">szönjük, hogy a Hungária </w:t>
-      </w:r>
-      <w:proofErr w:type="spellStart"/>
-      <w:r>
-        <w:rPr>
-          <w:rFonts w:ascii="Suzuki Pro" w:hAnsi="Suzuki Pro" w:cstheme="minorHAnsi"/>
+        <w:t>Med</w:t>
+      </w:r>
+      <w:proofErr w:type="spellEnd"/>
+      <w:r>
+        <w:rPr>
+          <w:rFonts w:ascii="SuzukiPRORegular" w:hAnsi="SuzukiPRORegular" w:cstheme="minorHAnsi"/>
           <w:sz w:val="24"/>
           <w:szCs w:val="24"/>
           <w:shd w:val="clear" w:color="auto" w:fill="FFFFFF"/>
         </w:rPr>
-        <w:t>Med</w:t>
-      </w:r>
-      <w:proofErr w:type="spellEnd"/>
-      <w:r>
-        <w:rPr>
-          <w:rFonts w:ascii="Suzuki Pro" w:hAnsi="Suzuki Pro" w:cstheme="minorHAnsi"/>
-          <w:sz w:val="24"/>
-          <w:szCs w:val="24"/>
-          <w:shd w:val="clear" w:color="auto" w:fill="FFFFFF"/>
-        </w:rPr>
-        <w:t>-M K</w:t>
-      </w:r>
-      <w:r>
-        <w:rPr>
-          <w:rFonts w:ascii="Suzuki Pro" w:hAnsi="Suzuki Pro" w:cstheme="minorHAnsi"/>
-          <w:sz w:val="24"/>
-          <w:szCs w:val="24"/>
-          <w:shd w:val="clear" w:color="auto" w:fill="FFFFFF"/>
-        </w:rPr>
-        <w:t xml:space="preserve">ft.  szolgáltatását  és a Magyar Suzuki </w:t>
-      </w:r>
-      <w:proofErr w:type="spellStart"/>
-      <w:r>
-        <w:rPr>
-          <w:rFonts w:ascii="Suzuki Pro" w:hAnsi="Suzuki Pro" w:cstheme="minorHAnsi"/>
-          <w:sz w:val="24"/>
-          <w:szCs w:val="24"/>
-          <w:shd w:val="clear" w:color="auto" w:fill="FFFFFF"/>
-        </w:rPr>
-        <w:t>Zrt</w:t>
-      </w:r>
-      <w:proofErr w:type="spellEnd"/>
-      <w:r>
-        <w:rPr>
-          <w:rFonts w:ascii="Suzuki Pro" w:hAnsi="Suzuki Pro" w:cstheme="minorHAnsi"/>
-          <w:sz w:val="24"/>
-          <w:szCs w:val="24"/>
-          <w:shd w:val="clear" w:color="auto" w:fill="FFFFFF"/>
-        </w:rPr>
-        <w:t xml:space="preserve">. </w:t>
-      </w:r>
-      <w:proofErr w:type="gramStart"/>
-      <w:r>
-        <w:rPr>
-          <w:rFonts w:ascii="Suzuki Pro" w:hAnsi="Suzuki Pro" w:cstheme="minorHAnsi"/>
-          <w:sz w:val="24"/>
-          <w:szCs w:val="24"/>
-          <w:shd w:val="clear" w:color="auto" w:fill="FFFFFF"/>
-        </w:rPr>
-        <w:t>menedzser</w:t>
-      </w:r>
-      <w:proofErr w:type="gramEnd"/>
-      <w:r>
-        <w:rPr>
-          <w:rFonts w:ascii="Suzuki Pro" w:hAnsi="Suzuki Pro" w:cstheme="minorHAnsi"/>
-          <w:sz w:val="24"/>
-          <w:szCs w:val="24"/>
-          <w:shd w:val="clear" w:color="auto" w:fill="FFFFFF"/>
-        </w:rPr>
-        <w:t xml:space="preserve"> szű</w:t>
-      </w:r>
-      <w:r>
-        <w:rPr>
-          <w:rFonts w:ascii="Suzuki Pro" w:hAnsi="Suzuki Pro" w:cstheme="minorHAnsi"/>
-          <w:sz w:val="24"/>
-          <w:szCs w:val="24"/>
-          <w:shd w:val="clear" w:color="auto" w:fill="FFFFFF"/>
-        </w:rPr>
-        <w:t>ré</w:t>
-      </w:r>
-      <w:r>
-        <w:rPr>
-          <w:rFonts w:ascii="Suzuki Pro" w:hAnsi="Suzuki Pro" w:cstheme="minorHAnsi"/>
-          <w:sz w:val="24"/>
-          <w:szCs w:val="24"/>
-          <w:shd w:val="clear" w:color="auto" w:fill="FFFFFF"/>
-        </w:rPr>
-        <w:t>sét választotta.</w:t>
+        <w:t>-M Kft. szolgáltatását és a Magyar Suzuki Zrt. menedzser szűrését választotta.</w:t>
       </w:r>
     </w:p>
     <w:p>
@@ -158,400 +91,138 @@
         <w:spacing w:after="120"/>
         <w:jc w:val="center"/>
         <w:rPr>
-          <w:rFonts w:ascii="Suzuki Pro" w:hAnsi="Suzuki Pro" w:cstheme="minorHAnsi"/>
+          <w:rFonts w:ascii="SuzukiPRORegular" w:hAnsi="SuzukiPRORegular" w:cstheme="minorHAnsi"/>
           <w:sz w:val="24"/>
           <w:szCs w:val="24"/>
           <w:shd w:val="clear" w:color="auto" w:fill="FFFFFF"/>
         </w:rPr>
       </w:pPr>
+      <w:r>
+        <w:rPr>
+          <w:rFonts w:ascii="SuzukiPRORegular" w:hAnsi="SuzukiPRORegular" w:cstheme="minorHAnsi"/>
+          <w:sz w:val="24"/>
+          <w:szCs w:val="24"/>
+          <w:shd w:val="clear" w:color="auto" w:fill="FFFFFF"/>
+        </w:rPr>
+        <w:t>Ezúton tájékoztatjuk, hogy időpontfoglalása sikeresen megtörtént.</w:t>
+      </w:r>
     </w:p>
     <w:p>
       <w:pPr>
         <w:spacing w:after="120"/>
-        <w:jc w:val="center"/>
-        <w:rPr>
-          <w:rFonts w:ascii="Suzuki Pro" w:hAnsi="Suzuki Pro" w:cstheme="minorHAnsi"/>
+        <w:jc w:val="both"/>
+        <w:rPr>
+          <w:rFonts w:ascii="SuzukiPRORegular" w:hAnsi="SuzukiPRORegular" w:cstheme="minorHAnsi"/>
+          <w:b/>
+          <w:bCs/>
           <w:sz w:val="24"/>
           <w:szCs w:val="24"/>
           <w:shd w:val="clear" w:color="auto" w:fill="FFFFFF"/>
         </w:rPr>
       </w:pPr>
-      <w:r>
-        <w:rPr>
-          <w:rFonts w:ascii="Suzuki Pro" w:hAnsi="Suzuki Pro" w:cstheme="minorHAnsi"/>
+    </w:p>
+    <w:p>
+      <w:pPr>
+        <w:spacing w:after="120"/>
+        <w:jc w:val="both"/>
+        <w:rPr>
+          <w:rFonts w:ascii="SuzukiPRORegular" w:hAnsi="SuzukiPRORegular" w:cstheme="minorHAnsi"/>
+          <w:sz w:val="24"/>
+          <w:szCs w:val="24"/>
+        </w:rPr>
+      </w:pPr>
+      <w:r>
+        <w:rPr>
+          <w:rFonts w:ascii="SuzukiPRORegular" w:hAnsi="SuzukiPRORegular" w:cstheme="minorHAnsi"/>
+          <w:b/>
+          <w:bCs/>
           <w:sz w:val="24"/>
           <w:szCs w:val="24"/>
           <w:shd w:val="clear" w:color="auto" w:fill="FFFFFF"/>
         </w:rPr>
-        <w:t>Ezúton tájékoztatjuk, hogy id</w:t>
+        <w:t>Vizsgálat időpontja:</w:t>
+      </w:r>
+      <w:r>
+        <w:rPr>
+          <w:rFonts w:ascii="SuzukiPRORegular" w:hAnsi="SuzukiPRORegular" w:cstheme="minorHAnsi"/>
+          <w:sz w:val="24"/>
+          <w:szCs w:val="24"/>
+          <w:shd w:val="clear" w:color="auto" w:fill="FFFFFF"/>
+        </w:rPr>
+        <w:t xml:space="preserve"> </w:t>
       </w:r>
       <w:bookmarkStart w:id="0" w:name="_GoBack"/>
       <w:bookmarkEnd w:id="0"/>
-      <w:r>
-        <w:rPr>
-          <w:rFonts w:ascii="Suzuki Pro" w:hAnsi="Suzuki Pro" w:cstheme="minorHAnsi"/>
-          <w:sz w:val="24"/>
-          <w:szCs w:val="24"/>
-          <w:shd w:val="clear" w:color="auto" w:fill="FFFFFF"/>
-        </w:rPr>
-        <w:t>őpontfoglalása sikeresen megtörtént.</w:t>
-      </w:r>
     </w:p>
     <w:p>
       <w:pPr>
         <w:spacing w:after="120"/>
-        <w:jc w:val="center"/>
-        <w:rPr>
-          <w:rFonts w:ascii="Suzuki Pro" w:hAnsi="Suzuki Pro" w:cstheme="minorHAnsi"/>
+        <w:jc w:val="both"/>
+        <w:rPr>
+          <w:rFonts w:ascii="SuzukiPRORegular" w:hAnsi="SuzukiPRORegular" w:cstheme="minorHAnsi"/>
           <w:sz w:val="24"/>
           <w:szCs w:val="24"/>
           <w:shd w:val="clear" w:color="auto" w:fill="FFFFFF"/>
         </w:rPr>
       </w:pPr>
+      <w:r>
+        <w:rPr>
+          <w:rFonts w:ascii="SuzukiPRORegular" w:hAnsi="SuzukiPRORegular" w:cstheme="minorHAnsi"/>
+          <w:b/>
+          <w:bCs/>
+          <w:sz w:val="24"/>
+          <w:szCs w:val="24"/>
+          <w:shd w:val="clear" w:color="auto" w:fill="FFFFFF"/>
+        </w:rPr>
+        <w:t>Választott szűrőcsomag:</w:t>
+      </w:r>
+      <w:r>
+        <w:rPr>
+          <w:rFonts w:ascii="SuzukiPRORegular" w:hAnsi="SuzukiPRORegular" w:cstheme="minorHAnsi"/>
+          <w:sz w:val="24"/>
+          <w:szCs w:val="24"/>
+          <w:shd w:val="clear" w:color="auto" w:fill="FFFFFF"/>
+        </w:rPr>
+        <w:t xml:space="preserve"> </w:t>
+      </w:r>
     </w:p>
     <w:p>
       <w:pPr>
         <w:spacing w:after="120"/>
         <w:jc w:val="both"/>
         <w:rPr>
-          <w:rFonts w:ascii="Suzuki Pro" w:hAnsi="Suzuki Pro" w:cstheme="minorHAnsi"/>
-          <w:sz w:val="24"/>
-          <w:szCs w:val="24"/>
-        </w:rPr>
-      </w:pPr>
-      <w:r>
-        <w:rPr>
-          <w:rFonts w:ascii="Suzuki Pro" w:hAnsi="Suzuki Pro" w:cstheme="minorHAnsi"/>
+          <w:rFonts w:ascii="SuzukiPRORegular" w:hAnsi="SuzukiPRORegular" w:cstheme="minorHAnsi"/>
+          <w:sz w:val="24"/>
+          <w:szCs w:val="24"/>
+        </w:rPr>
+      </w:pPr>
+      <w:r>
+        <w:rPr>
+          <w:rFonts w:ascii="SuzukiPRORegular" w:hAnsi="SuzukiPRORegular" w:cstheme="minorHAnsi"/>
           <w:b/>
-          <w:bCs/>
-          <w:sz w:val="24"/>
-          <w:szCs w:val="24"/>
-          <w:shd w:val="clear" w:color="auto" w:fill="FFFFFF"/>
-        </w:rPr>
-        <w:t>Vizsgálat időpontja:</w:t>
-      </w:r>
-      <w:r>
-        <w:rPr>
-          <w:rFonts w:ascii="Suzuki Pro" w:hAnsi="Suzuki Pro" w:cstheme="minorHAnsi"/>
-          <w:sz w:val="24"/>
-          <w:szCs w:val="24"/>
-        </w:rPr>
-        <w:t xml:space="preserve"> </w:t>
-      </w:r>
-    </w:p>
-    <w:p>
-      <w:pPr>
-        <w:spacing w:after="120"/>
-        <w:jc w:val="both"/>
-        <w:rPr>
-          <w:rFonts w:ascii="Suzuki Pro" w:hAnsi="Suzuki Pro" w:cstheme="minorHAnsi"/>
-          <w:sz w:val="24"/>
-          <w:szCs w:val="24"/>
-        </w:rPr>
-      </w:pPr>
-      <w:r>
-        <w:rPr>
-          <w:rFonts w:ascii="Suzuki Pro" w:hAnsi="Suzuki Pro" w:cstheme="minorHAnsi"/>
-          <w:b/>
-          <w:bCs/>
-          <w:sz w:val="24"/>
-          <w:szCs w:val="24"/>
-          <w:shd w:val="clear" w:color="auto" w:fill="FFFFFF"/>
-        </w:rPr>
-        <w:t>Választott szűrőcsomag:</w:t>
-      </w:r>
-    </w:p>
-    <w:p>
-      <w:pPr>
-        <w:spacing w:after="120"/>
-        <w:jc w:val="both"/>
-        <w:rPr>
-          <w:rFonts w:ascii="Suzuki Pro" w:hAnsi="Suzuki Pro" w:cstheme="minorHAnsi"/>
+          <w:sz w:val="24"/>
+          <w:szCs w:val="24"/>
+        </w:rPr>
+        <w:t>Vizsgálatok</w:t>
+      </w:r>
+      <w:r>
+        <w:rPr>
+          <w:rFonts w:ascii="SuzukiPRORegular" w:hAnsi="SuzukiPRORegular" w:cstheme="minorHAnsi"/>
           <w:b/>
           <w:spacing w:val="-3"/>
           <w:sz w:val="24"/>
           <w:szCs w:val="24"/>
         </w:rPr>
-      </w:pPr>
-      <w:r>
-        <w:rPr>
-          <w:rFonts w:ascii="Suzuki Pro" w:hAnsi="Suzuki Pro" w:cstheme="minorHAnsi"/>
+        <w:t xml:space="preserve"> </w:t>
+      </w:r>
+      <w:r>
+        <w:rPr>
+          <w:rFonts w:ascii="SuzukiPRORegular" w:hAnsi="SuzukiPRORegular" w:cstheme="minorHAnsi"/>
           <w:b/>
           <w:sz w:val="24"/>
           <w:szCs w:val="24"/>
         </w:rPr>
-        <w:t>Vizsgálatok</w:t>
-      </w:r>
-      <w:r>
-        <w:rPr>
-          <w:rFonts w:ascii="Suzuki Pro" w:hAnsi="Suzuki Pro" w:cstheme="minorHAnsi"/>
-          <w:b/>
-          <w:spacing w:val="-3"/>
-          <w:sz w:val="24"/>
-          <w:szCs w:val="24"/>
-        </w:rPr>
-        <w:t xml:space="preserve"> </w:t>
-      </w:r>
-      <w:r>
-        <w:rPr>
-          <w:rFonts w:ascii="Suzuki Pro" w:hAnsi="Suzuki Pro" w:cstheme="minorHAnsi"/>
-          <w:b/>
-          <w:sz w:val="24"/>
-          <w:szCs w:val="24"/>
-        </w:rPr>
         <w:t>helyszíne:</w:t>
-      </w:r>
-      <w:r>
-        <w:rPr>
-          <w:rFonts w:ascii="Suzuki Pro" w:hAnsi="Suzuki Pro" w:cstheme="minorHAnsi"/>
-          <w:b/>
-          <w:spacing w:val="-3"/>
-          <w:sz w:val="24"/>
-          <w:szCs w:val="24"/>
-        </w:rPr>
-        <w:t xml:space="preserve"> </w:t>
-      </w:r>
-    </w:p>
-    <w:p>
-      <w:pPr>
-        <w:pStyle w:val="Listaszerbekezds"/>
-        <w:numPr>
-          <w:ilvl w:val="0"/>
-          <w:numId w:val="8"/>
-        </w:numPr>
-        <w:spacing w:after="120"/>
-        <w:rPr>
-          <w:rFonts w:ascii="Suzuki Pro" w:hAnsi="Suzuki Pro" w:cstheme="minorHAnsi"/>
-          <w:sz w:val="24"/>
-          <w:szCs w:val="24"/>
-        </w:rPr>
-      </w:pPr>
-      <w:r>
-        <w:rPr>
-          <w:rFonts w:ascii="Suzuki Pro" w:hAnsi="Suzuki Pro" w:cstheme="minorHAnsi"/>
-          <w:sz w:val="24"/>
-          <w:szCs w:val="24"/>
-        </w:rPr>
-        <w:t>1135 Budapest,</w:t>
-      </w:r>
-      <w:r>
-        <w:rPr>
-          <w:rFonts w:ascii="Suzuki Pro" w:hAnsi="Suzuki Pro" w:cstheme="minorHAnsi"/>
-          <w:spacing w:val="2"/>
-          <w:sz w:val="24"/>
-          <w:szCs w:val="24"/>
-        </w:rPr>
-        <w:t xml:space="preserve"> </w:t>
-      </w:r>
-      <w:r>
-        <w:rPr>
-          <w:rFonts w:ascii="Suzuki Pro" w:hAnsi="Suzuki Pro" w:cstheme="minorHAnsi"/>
-          <w:sz w:val="24"/>
-          <w:szCs w:val="24"/>
-        </w:rPr>
-        <w:t>Jász</w:t>
-      </w:r>
-      <w:r>
-        <w:rPr>
-          <w:rFonts w:ascii="Suzuki Pro" w:hAnsi="Suzuki Pro" w:cstheme="minorHAnsi"/>
-          <w:spacing w:val="-2"/>
-          <w:sz w:val="24"/>
-          <w:szCs w:val="24"/>
-        </w:rPr>
-        <w:t xml:space="preserve"> </w:t>
-      </w:r>
-      <w:r>
-        <w:rPr>
-          <w:rFonts w:ascii="Suzuki Pro" w:hAnsi="Suzuki Pro" w:cstheme="minorHAnsi"/>
-          <w:sz w:val="24"/>
-          <w:szCs w:val="24"/>
-        </w:rPr>
-        <w:t>utca</w:t>
-      </w:r>
-      <w:r>
-        <w:rPr>
-          <w:rFonts w:ascii="Suzuki Pro" w:hAnsi="Suzuki Pro" w:cstheme="minorHAnsi"/>
-          <w:spacing w:val="-1"/>
-          <w:sz w:val="24"/>
-          <w:szCs w:val="24"/>
-        </w:rPr>
-        <w:t xml:space="preserve"> </w:t>
-      </w:r>
-      <w:r>
-        <w:rPr>
-          <w:rFonts w:ascii="Suzuki Pro" w:hAnsi="Suzuki Pro" w:cstheme="minorHAnsi"/>
-          <w:sz w:val="24"/>
-          <w:szCs w:val="24"/>
-        </w:rPr>
-        <w:t>33-35. Hungária</w:t>
-      </w:r>
-      <w:r>
-        <w:rPr>
-          <w:rFonts w:ascii="Suzuki Pro" w:hAnsi="Suzuki Pro" w:cstheme="minorHAnsi"/>
-          <w:spacing w:val="-4"/>
-          <w:sz w:val="24"/>
-          <w:szCs w:val="24"/>
-        </w:rPr>
-        <w:t xml:space="preserve"> </w:t>
-      </w:r>
-      <w:proofErr w:type="spellStart"/>
-      <w:r>
-        <w:rPr>
-          <w:rFonts w:ascii="Suzuki Pro" w:hAnsi="Suzuki Pro" w:cstheme="minorHAnsi"/>
-          <w:sz w:val="24"/>
-          <w:szCs w:val="24"/>
-        </w:rPr>
-        <w:t>Med</w:t>
-      </w:r>
-      <w:proofErr w:type="spellEnd"/>
-      <w:r>
-        <w:rPr>
-          <w:rFonts w:ascii="Suzuki Pro" w:hAnsi="Suzuki Pro" w:cstheme="minorHAnsi"/>
-          <w:sz w:val="24"/>
-          <w:szCs w:val="24"/>
-        </w:rPr>
-        <w:t>-M</w:t>
-      </w:r>
-      <w:r>
-        <w:rPr>
-          <w:rFonts w:ascii="Suzuki Pro" w:hAnsi="Suzuki Pro" w:cstheme="minorHAnsi"/>
-          <w:spacing w:val="1"/>
-          <w:sz w:val="24"/>
-          <w:szCs w:val="24"/>
-        </w:rPr>
-        <w:t xml:space="preserve"> </w:t>
-      </w:r>
-      <w:r>
-        <w:rPr>
-          <w:rFonts w:ascii="Suzuki Pro" w:hAnsi="Suzuki Pro" w:cstheme="minorHAnsi"/>
-          <w:sz w:val="24"/>
-          <w:szCs w:val="24"/>
-        </w:rPr>
-        <w:t>Kft.</w:t>
-      </w:r>
-      <w:r>
-        <w:rPr>
-          <w:rFonts w:ascii="Suzuki Pro" w:hAnsi="Suzuki Pro" w:cstheme="minorHAnsi"/>
-          <w:spacing w:val="-1"/>
-          <w:sz w:val="24"/>
-          <w:szCs w:val="24"/>
-        </w:rPr>
-        <w:t xml:space="preserve"> </w:t>
-      </w:r>
-      <w:r>
-        <w:rPr>
-          <w:rFonts w:ascii="Suzuki Pro" w:hAnsi="Suzuki Pro" w:cstheme="minorHAnsi"/>
-          <w:sz w:val="24"/>
-          <w:szCs w:val="24"/>
-        </w:rPr>
-        <w:t>rendelője</w:t>
-      </w:r>
-      <w:r>
-        <w:rPr>
-          <w:rFonts w:ascii="Suzuki Pro" w:hAnsi="Suzuki Pro" w:cstheme="minorHAnsi"/>
-          <w:sz w:val="24"/>
-          <w:szCs w:val="24"/>
-        </w:rPr>
-        <w:t>.</w:t>
-      </w:r>
-    </w:p>
-    <w:p>
-      <w:pPr>
-        <w:pStyle w:val="Listaszerbekezds"/>
-        <w:numPr>
-          <w:ilvl w:val="0"/>
-          <w:numId w:val="8"/>
-        </w:numPr>
-        <w:spacing w:after="120"/>
-        <w:rPr>
-          <w:rFonts w:ascii="Suzuki Pro" w:hAnsi="Suzuki Pro" w:cstheme="minorHAnsi"/>
-          <w:sz w:val="24"/>
-          <w:szCs w:val="24"/>
-        </w:rPr>
-      </w:pPr>
-      <w:r>
-        <w:rPr>
-          <w:rFonts w:ascii="Suzuki Pro" w:hAnsi="Suzuki Pro" w:cstheme="minorHAnsi"/>
-          <w:sz w:val="24"/>
-          <w:szCs w:val="24"/>
-        </w:rPr>
-        <w:t>Bejárat a</w:t>
-      </w:r>
-      <w:r>
-        <w:rPr>
-          <w:rFonts w:ascii="Suzuki Pro" w:hAnsi="Suzuki Pro" w:cstheme="minorHAnsi"/>
-          <w:spacing w:val="-1"/>
-          <w:sz w:val="24"/>
-          <w:szCs w:val="24"/>
-        </w:rPr>
-        <w:t xml:space="preserve"> </w:t>
-      </w:r>
-      <w:r>
-        <w:rPr>
-          <w:rFonts w:ascii="Suzuki Pro" w:hAnsi="Suzuki Pro" w:cstheme="minorHAnsi"/>
-          <w:sz w:val="24"/>
-          <w:szCs w:val="24"/>
-        </w:rPr>
-        <w:t>Béke Patika</w:t>
-      </w:r>
-      <w:r>
-        <w:rPr>
-          <w:rFonts w:ascii="Suzuki Pro" w:hAnsi="Suzuki Pro" w:cstheme="minorHAnsi"/>
-          <w:spacing w:val="-4"/>
-          <w:sz w:val="24"/>
-          <w:szCs w:val="24"/>
-        </w:rPr>
-        <w:t xml:space="preserve"> </w:t>
-      </w:r>
-      <w:r>
-        <w:rPr>
-          <w:rFonts w:ascii="Suzuki Pro" w:hAnsi="Suzuki Pro" w:cstheme="minorHAnsi"/>
-          <w:sz w:val="24"/>
-          <w:szCs w:val="24"/>
-        </w:rPr>
-        <w:t>épületének</w:t>
-      </w:r>
-      <w:r>
-        <w:rPr>
-          <w:rFonts w:ascii="Suzuki Pro" w:hAnsi="Suzuki Pro" w:cstheme="minorHAnsi"/>
-          <w:spacing w:val="-2"/>
-          <w:sz w:val="24"/>
-          <w:szCs w:val="24"/>
-        </w:rPr>
-        <w:t xml:space="preserve"> </w:t>
-      </w:r>
-      <w:r>
-        <w:rPr>
-          <w:rFonts w:ascii="Suzuki Pro" w:hAnsi="Suzuki Pro" w:cstheme="minorHAnsi"/>
-          <w:sz w:val="24"/>
-          <w:szCs w:val="24"/>
-        </w:rPr>
-        <w:t>oldalán</w:t>
-      </w:r>
-      <w:r>
-        <w:rPr>
-          <w:rFonts w:ascii="Suzuki Pro" w:hAnsi="Suzuki Pro" w:cstheme="minorHAnsi"/>
-          <w:spacing w:val="2"/>
-          <w:sz w:val="24"/>
-          <w:szCs w:val="24"/>
-        </w:rPr>
-        <w:t xml:space="preserve"> </w:t>
-      </w:r>
-      <w:r>
-        <w:rPr>
-          <w:rFonts w:ascii="Suzuki Pro" w:hAnsi="Suzuki Pro" w:cstheme="minorHAnsi"/>
-          <w:sz w:val="24"/>
-          <w:szCs w:val="24"/>
-        </w:rPr>
-        <w:t>található</w:t>
-      </w:r>
-      <w:r>
-        <w:rPr>
-          <w:rFonts w:ascii="Suzuki Pro" w:hAnsi="Suzuki Pro" w:cstheme="minorHAnsi"/>
-          <w:sz w:val="24"/>
-          <w:szCs w:val="24"/>
-        </w:rPr>
-        <w:t>.</w:t>
       </w:r>
     </w:p>
     <w:p>
@@ -564,22 +235,56 @@
         <w:spacing w:after="120"/>
         <w:ind w:left="714" w:hanging="357"/>
         <w:rPr>
-          <w:rFonts w:ascii="Suzuki Pro" w:hAnsi="Suzuki Pro" w:cstheme="minorHAnsi"/>
-          <w:sz w:val="24"/>
-          <w:szCs w:val="24"/>
-        </w:rPr>
-      </w:pPr>
-      <w:r>
-        <w:rPr>
-          <w:rFonts w:ascii="Suzuki Pro" w:hAnsi="Suzuki Pro" w:cstheme="minorHAnsi"/>
-          <w:sz w:val="24"/>
-          <w:szCs w:val="24"/>
-        </w:rPr>
-        <w:t>Parkolás</w:t>
-      </w:r>
-      <w:r>
-        <w:rPr>
-          <w:rFonts w:ascii="Suzuki Pro" w:hAnsi="Suzuki Pro" w:cstheme="minorHAnsi"/>
+          <w:rFonts w:ascii="SuzukiPRORegular" w:hAnsi="SuzukiPRORegular" w:cstheme="minorHAnsi"/>
+          <w:sz w:val="24"/>
+          <w:szCs w:val="24"/>
+        </w:rPr>
+      </w:pPr>
+      <w:r>
+        <w:rPr>
+          <w:rFonts w:ascii="SuzukiPRORegular" w:hAnsi="SuzukiPRORegular" w:cstheme="minorHAnsi"/>
+          <w:sz w:val="24"/>
+          <w:szCs w:val="24"/>
+        </w:rPr>
+        <w:t>1135 Budapest,</w:t>
+      </w:r>
+      <w:r>
+        <w:rPr>
+          <w:rFonts w:ascii="SuzukiPRORegular" w:hAnsi="SuzukiPRORegular" w:cstheme="minorHAnsi"/>
+          <w:spacing w:val="2"/>
+          <w:sz w:val="24"/>
+          <w:szCs w:val="24"/>
+        </w:rPr>
+        <w:t xml:space="preserve"> </w:t>
+      </w:r>
+      <w:r>
+        <w:rPr>
+          <w:rFonts w:ascii="SuzukiPRORegular" w:hAnsi="SuzukiPRORegular" w:cstheme="minorHAnsi"/>
+          <w:sz w:val="24"/>
+          <w:szCs w:val="24"/>
+        </w:rPr>
+        <w:t>Jász</w:t>
+      </w:r>
+      <w:r>
+        <w:rPr>
+          <w:rFonts w:ascii="SuzukiPRORegular" w:hAnsi="SuzukiPRORegular" w:cstheme="minorHAnsi"/>
+          <w:spacing w:val="-2"/>
+          <w:sz w:val="24"/>
+          <w:szCs w:val="24"/>
+        </w:rPr>
+        <w:t xml:space="preserve"> </w:t>
+      </w:r>
+      <w:r>
+        <w:rPr>
+          <w:rFonts w:ascii="SuzukiPRORegular" w:hAnsi="SuzukiPRORegular" w:cstheme="minorHAnsi"/>
+          <w:sz w:val="24"/>
+          <w:szCs w:val="24"/>
+        </w:rPr>
+        <w:t>utca</w:t>
+      </w:r>
+      <w:r>
+        <w:rPr>
+          <w:rFonts w:ascii="SuzukiPRORegular" w:hAnsi="SuzukiPRORegular" w:cstheme="minorHAnsi"/>
           <w:spacing w:val="-1"/>
           <w:sz w:val="24"/>
           <w:szCs w:val="24"/>
@@ -588,15 +293,75 @@
       </w:r>
       <w:r>
         <w:rPr>
-          <w:rFonts w:ascii="Suzuki Pro" w:hAnsi="Suzuki Pro" w:cstheme="minorHAnsi"/>
-          <w:sz w:val="24"/>
-          <w:szCs w:val="24"/>
-        </w:rPr>
-        <w:t>a</w:t>
-      </w:r>
-      <w:r>
-        <w:rPr>
-          <w:rFonts w:ascii="Suzuki Pro" w:hAnsi="Suzuki Pro" w:cstheme="minorHAnsi"/>
+          <w:rFonts w:ascii="SuzukiPRORegular" w:hAnsi="SuzukiPRORegular" w:cstheme="minorHAnsi"/>
+          <w:sz w:val="24"/>
+          <w:szCs w:val="24"/>
+        </w:rPr>
+        <w:t>33-35.</w:t>
+      </w:r>
+      <w:r>
+        <w:rPr>
+          <w:rFonts w:ascii="SuzukiPRORegular" w:hAnsi="SuzukiPRORegular" w:cstheme="minorHAnsi"/>
+          <w:sz w:val="24"/>
+          <w:szCs w:val="24"/>
+        </w:rPr>
+        <w:t xml:space="preserve">, a </w:t>
+      </w:r>
+      <w:r>
+        <w:rPr>
+          <w:rFonts w:ascii="SuzukiPRORegular" w:hAnsi="SuzukiPRORegular" w:cstheme="minorHAnsi"/>
+          <w:sz w:val="24"/>
+          <w:szCs w:val="24"/>
+        </w:rPr>
+        <w:t>Hungária</w:t>
+      </w:r>
+      <w:r>
+        <w:rPr>
+          <w:rFonts w:ascii="SuzukiPRORegular" w:hAnsi="SuzukiPRORegular" w:cstheme="minorHAnsi"/>
+          <w:spacing w:val="-4"/>
+          <w:sz w:val="24"/>
+          <w:szCs w:val="24"/>
+        </w:rPr>
+        <w:t xml:space="preserve"> </w:t>
+      </w:r>
+      <w:proofErr w:type="spellStart"/>
+      <w:r>
+        <w:rPr>
+          <w:rFonts w:ascii="SuzukiPRORegular" w:hAnsi="SuzukiPRORegular" w:cstheme="minorHAnsi"/>
+          <w:sz w:val="24"/>
+          <w:szCs w:val="24"/>
+        </w:rPr>
+        <w:t>Med</w:t>
+      </w:r>
+      <w:proofErr w:type="spellEnd"/>
+      <w:r>
+        <w:rPr>
+          <w:rFonts w:ascii="SuzukiPRORegular" w:hAnsi="SuzukiPRORegular" w:cstheme="minorHAnsi"/>
+          <w:sz w:val="24"/>
+          <w:szCs w:val="24"/>
+        </w:rPr>
+        <w:t>-M</w:t>
+      </w:r>
+      <w:r>
+        <w:rPr>
+          <w:rFonts w:ascii="SuzukiPRORegular" w:hAnsi="SuzukiPRORegular" w:cstheme="minorHAnsi"/>
+          <w:spacing w:val="1"/>
+          <w:sz w:val="24"/>
+          <w:szCs w:val="24"/>
+        </w:rPr>
+        <w:t xml:space="preserve"> </w:t>
+      </w:r>
+      <w:r>
+        <w:rPr>
+          <w:rFonts w:ascii="SuzukiPRORegular" w:hAnsi="SuzukiPRORegular" w:cstheme="minorHAnsi"/>
+          <w:sz w:val="24"/>
+          <w:szCs w:val="24"/>
+        </w:rPr>
+        <w:t>Kft.</w:t>
+      </w:r>
+      <w:r>
+        <w:rPr>
+          <w:rFonts w:ascii="SuzukiPRORegular" w:hAnsi="SuzukiPRORegular" w:cstheme="minorHAnsi"/>
           <w:spacing w:val="-1"/>
           <w:sz w:val="24"/>
           <w:szCs w:val="24"/>
@@ -605,91 +370,11 @@
       </w:r>
       <w:r>
         <w:rPr>
-          <w:rFonts w:ascii="Suzuki Pro" w:hAnsi="Suzuki Pro" w:cstheme="minorHAnsi"/>
-          <w:sz w:val="24"/>
-          <w:szCs w:val="24"/>
-        </w:rPr>
-        <w:t>rendelő</w:t>
-      </w:r>
-      <w:r>
-        <w:rPr>
-          <w:rFonts w:ascii="Suzuki Pro" w:hAnsi="Suzuki Pro" w:cstheme="minorHAnsi"/>
-          <w:spacing w:val="-2"/>
-          <w:sz w:val="24"/>
-          <w:szCs w:val="24"/>
-        </w:rPr>
-        <w:t xml:space="preserve"> </w:t>
-      </w:r>
-      <w:r>
-        <w:rPr>
-          <w:rFonts w:ascii="Suzuki Pro" w:hAnsi="Suzuki Pro" w:cstheme="minorHAnsi"/>
-          <w:sz w:val="24"/>
-          <w:szCs w:val="24"/>
-        </w:rPr>
-        <w:t xml:space="preserve">udvarában </w:t>
-      </w:r>
-      <w:r>
-        <w:rPr>
-          <w:rFonts w:ascii="Suzuki Pro" w:hAnsi="Suzuki Pro" w:cstheme="minorHAnsi"/>
-          <w:sz w:val="24"/>
-          <w:szCs w:val="24"/>
-        </w:rPr>
-        <w:t xml:space="preserve">korlátozott </w:t>
-      </w:r>
-      <w:r>
-        <w:rPr>
-          <w:rFonts w:ascii="Suzuki Pro" w:hAnsi="Suzuki Pro" w:cstheme="minorHAnsi"/>
-          <w:sz w:val="24"/>
-          <w:szCs w:val="24"/>
-        </w:rPr>
-        <w:t>számban</w:t>
-      </w:r>
-      <w:r>
-        <w:rPr>
-          <w:rFonts w:ascii="Suzuki Pro" w:hAnsi="Suzuki Pro" w:cstheme="minorHAnsi"/>
-          <w:spacing w:val="2"/>
-          <w:sz w:val="24"/>
-          <w:szCs w:val="24"/>
-        </w:rPr>
-        <w:t xml:space="preserve"> </w:t>
-      </w:r>
-      <w:r>
-        <w:rPr>
-          <w:rFonts w:ascii="Suzuki Pro" w:hAnsi="Suzuki Pro" w:cstheme="minorHAnsi"/>
-          <w:sz w:val="24"/>
-          <w:szCs w:val="24"/>
-        </w:rPr>
-        <w:t>lehetséges</w:t>
-      </w:r>
-      <w:r>
-        <w:rPr>
-          <w:rFonts w:ascii="Suzuki Pro" w:hAnsi="Suzuki Pro" w:cstheme="minorHAnsi"/>
-          <w:sz w:val="24"/>
-          <w:szCs w:val="24"/>
-        </w:rPr>
-        <w:t>.</w:t>
-      </w:r>
-    </w:p>
-    <w:p>
-      <w:pPr>
-        <w:jc w:val="both"/>
-        <w:rPr>
-          <w:rFonts w:ascii="Suzuki Pro" w:hAnsi="Suzuki Pro" w:cstheme="minorHAnsi"/>
-          <w:b/>
-          <w:sz w:val="24"/>
-          <w:szCs w:val="24"/>
-          <w:shd w:val="clear" w:color="auto" w:fill="FFFFFF"/>
-        </w:rPr>
-      </w:pPr>
-      <w:r>
-        <w:rPr>
-          <w:rFonts w:ascii="Suzuki Pro" w:hAnsi="Suzuki Pro" w:cstheme="minorHAnsi"/>
-          <w:b/>
-          <w:sz w:val="24"/>
-          <w:szCs w:val="24"/>
-          <w:shd w:val="clear" w:color="auto" w:fill="FFFFFF"/>
-        </w:rPr>
-        <w:t>Vizsgálatokkal kapcsolatos értesítések:</w:t>
+          <w:rFonts w:ascii="SuzukiPRORegular" w:hAnsi="SuzukiPRORegular" w:cstheme="minorHAnsi"/>
+          <w:sz w:val="24"/>
+          <w:szCs w:val="24"/>
+        </w:rPr>
+        <w:t>rendelője.</w:t>
       </w:r>
     </w:p>
     <w:p>
@@ -697,35 +382,91 @@
         <w:pStyle w:val="Listaszerbekezds"/>
         <w:numPr>
           <w:ilvl w:val="0"/>
-          <w:numId w:val="22"/>
+          <w:numId w:val="8"/>
         </w:numPr>
+        <w:spacing w:after="120"/>
         <w:ind w:left="714" w:hanging="357"/>
         <w:rPr>
-          <w:rFonts w:ascii="Suzuki Pro" w:hAnsi="Suzuki Pro" w:cstheme="minorHAnsi"/>
-          <w:sz w:val="24"/>
-          <w:szCs w:val="24"/>
-          <w:shd w:val="clear" w:color="auto" w:fill="FFFFFF"/>
-        </w:rPr>
-      </w:pPr>
-      <w:proofErr w:type="spellStart"/>
-      <w:r>
-        <w:rPr>
-          <w:rFonts w:ascii="Suzuki Pro" w:hAnsi="Suzuki Pro" w:cstheme="minorHAnsi"/>
-          <w:sz w:val="24"/>
-          <w:szCs w:val="24"/>
-          <w:shd w:val="clear" w:color="auto" w:fill="FFFFFF"/>
-        </w:rPr>
-        <w:t>Call</w:t>
-      </w:r>
-      <w:proofErr w:type="spellEnd"/>
-      <w:r>
-        <w:rPr>
-          <w:rFonts w:ascii="Suzuki Pro" w:hAnsi="Suzuki Pro" w:cstheme="minorHAnsi"/>
-          <w:sz w:val="24"/>
-          <w:szCs w:val="24"/>
-          <w:shd w:val="clear" w:color="auto" w:fill="FFFFFF"/>
-        </w:rPr>
-        <w:t>-centeres munkatársunk a vizsgálat előtt 1 héttel, majd 1 munkanappal felhívja Önt a vizsgálatokkal kapcsolatos egyeztetés céljából.</w:t>
+          <w:rFonts w:ascii="SuzukiPRORegular" w:hAnsi="SuzukiPRORegular" w:cstheme="minorHAnsi"/>
+          <w:sz w:val="24"/>
+          <w:szCs w:val="24"/>
+        </w:rPr>
+      </w:pPr>
+      <w:r>
+        <w:rPr>
+          <w:rFonts w:ascii="SuzukiPRORegular" w:hAnsi="SuzukiPRORegular" w:cstheme="minorHAnsi"/>
+          <w:sz w:val="24"/>
+          <w:szCs w:val="24"/>
+        </w:rPr>
+        <w:t>Bejárat a</w:t>
+      </w:r>
+      <w:r>
+        <w:rPr>
+          <w:rFonts w:ascii="SuzukiPRORegular" w:hAnsi="SuzukiPRORegular" w:cstheme="minorHAnsi"/>
+          <w:spacing w:val="-1"/>
+          <w:sz w:val="24"/>
+          <w:szCs w:val="24"/>
+        </w:rPr>
+        <w:t xml:space="preserve"> </w:t>
+      </w:r>
+      <w:r>
+        <w:rPr>
+          <w:rFonts w:ascii="SuzukiPRORegular" w:hAnsi="SuzukiPRORegular" w:cstheme="minorHAnsi"/>
+          <w:sz w:val="24"/>
+          <w:szCs w:val="24"/>
+        </w:rPr>
+        <w:t>Béke Patika</w:t>
+      </w:r>
+      <w:r>
+        <w:rPr>
+          <w:rFonts w:ascii="SuzukiPRORegular" w:hAnsi="SuzukiPRORegular" w:cstheme="minorHAnsi"/>
+          <w:spacing w:val="-4"/>
+          <w:sz w:val="24"/>
+          <w:szCs w:val="24"/>
+        </w:rPr>
+        <w:t xml:space="preserve"> </w:t>
+      </w:r>
+      <w:r>
+        <w:rPr>
+          <w:rFonts w:ascii="SuzukiPRORegular" w:hAnsi="SuzukiPRORegular" w:cstheme="minorHAnsi"/>
+          <w:sz w:val="24"/>
+          <w:szCs w:val="24"/>
+        </w:rPr>
+        <w:t>épületének</w:t>
+      </w:r>
+      <w:r>
+        <w:rPr>
+          <w:rFonts w:ascii="SuzukiPRORegular" w:hAnsi="SuzukiPRORegular" w:cstheme="minorHAnsi"/>
+          <w:spacing w:val="-2"/>
+          <w:sz w:val="24"/>
+          <w:szCs w:val="24"/>
+        </w:rPr>
+        <w:t xml:space="preserve"> </w:t>
+      </w:r>
+      <w:r>
+        <w:rPr>
+          <w:rFonts w:ascii="SuzukiPRORegular" w:hAnsi="SuzukiPRORegular" w:cstheme="minorHAnsi"/>
+          <w:sz w:val="24"/>
+          <w:szCs w:val="24"/>
+        </w:rPr>
+        <w:t>oldalán</w:t>
+      </w:r>
+      <w:r>
+        <w:rPr>
+          <w:rFonts w:ascii="SuzukiPRORegular" w:hAnsi="SuzukiPRORegular" w:cstheme="minorHAnsi"/>
+          <w:spacing w:val="2"/>
+          <w:sz w:val="24"/>
+          <w:szCs w:val="24"/>
+        </w:rPr>
+        <w:t xml:space="preserve"> </w:t>
+      </w:r>
+      <w:r>
+        <w:rPr>
+          <w:rFonts w:ascii="SuzukiPRORegular" w:hAnsi="SuzukiPRORegular" w:cstheme="minorHAnsi"/>
+          <w:sz w:val="24"/>
+          <w:szCs w:val="24"/>
+        </w:rPr>
+        <w:t>található.</w:t>
       </w:r>
     </w:p>
     <w:p>
@@ -733,40 +474,191 @@
         <w:pStyle w:val="Listaszerbekezds"/>
         <w:numPr>
           <w:ilvl w:val="0"/>
-          <w:numId w:val="22"/>
+          <w:numId w:val="8"/>
         </w:numPr>
+        <w:spacing w:after="120"/>
         <w:ind w:left="714" w:hanging="357"/>
         <w:rPr>
-          <w:rFonts w:ascii="Suzuki Pro" w:hAnsi="Suzuki Pro" w:cstheme="minorHAnsi"/>
-          <w:sz w:val="24"/>
-          <w:szCs w:val="24"/>
-        </w:rPr>
-      </w:pPr>
-      <w:r>
-        <w:rPr>
-          <w:rFonts w:ascii="Suzuki Pro" w:hAnsi="Suzuki Pro" w:cstheme="minorHAnsi"/>
-          <w:sz w:val="24"/>
-          <w:szCs w:val="24"/>
-          <w:shd w:val="clear" w:color="auto" w:fill="FFFFFF"/>
-        </w:rPr>
-        <w:t>24 órával a vizsgálat előtt SMS értesítést küldünk Önnek.</w:t>
+          <w:rFonts w:ascii="SuzukiPRORegular" w:hAnsi="SuzukiPRORegular" w:cstheme="minorHAnsi"/>
+          <w:sz w:val="24"/>
+          <w:szCs w:val="24"/>
+        </w:rPr>
+      </w:pPr>
+      <w:r>
+        <w:rPr>
+          <w:rFonts w:ascii="SuzukiPRORegular" w:hAnsi="SuzukiPRORegular" w:cstheme="minorHAnsi"/>
+          <w:sz w:val="24"/>
+          <w:szCs w:val="24"/>
+        </w:rPr>
+        <w:t>Parkolás</w:t>
+      </w:r>
+      <w:r>
+        <w:rPr>
+          <w:rFonts w:ascii="SuzukiPRORegular" w:hAnsi="SuzukiPRORegular" w:cstheme="minorHAnsi"/>
+          <w:spacing w:val="-1"/>
+          <w:sz w:val="24"/>
+          <w:szCs w:val="24"/>
+        </w:rPr>
+        <w:t xml:space="preserve"> </w:t>
+      </w:r>
+      <w:r>
+        <w:rPr>
+          <w:rFonts w:ascii="SuzukiPRORegular" w:hAnsi="SuzukiPRORegular" w:cstheme="minorHAnsi"/>
+          <w:sz w:val="24"/>
+          <w:szCs w:val="24"/>
+        </w:rPr>
+        <w:t>a</w:t>
+      </w:r>
+      <w:r>
+        <w:rPr>
+          <w:rFonts w:ascii="SuzukiPRORegular" w:hAnsi="SuzukiPRORegular" w:cstheme="minorHAnsi"/>
+          <w:spacing w:val="-1"/>
+          <w:sz w:val="24"/>
+          <w:szCs w:val="24"/>
+        </w:rPr>
+        <w:t xml:space="preserve"> </w:t>
+      </w:r>
+      <w:r>
+        <w:rPr>
+          <w:rFonts w:ascii="SuzukiPRORegular" w:hAnsi="SuzukiPRORegular" w:cstheme="minorHAnsi"/>
+          <w:sz w:val="24"/>
+          <w:szCs w:val="24"/>
+        </w:rPr>
+        <w:t>rendelő</w:t>
+      </w:r>
+      <w:r>
+        <w:rPr>
+          <w:rFonts w:ascii="SuzukiPRORegular" w:hAnsi="SuzukiPRORegular" w:cstheme="minorHAnsi"/>
+          <w:spacing w:val="-2"/>
+          <w:sz w:val="24"/>
+          <w:szCs w:val="24"/>
+        </w:rPr>
+        <w:t xml:space="preserve"> </w:t>
+      </w:r>
+      <w:r>
+        <w:rPr>
+          <w:rFonts w:ascii="SuzukiPRORegular" w:hAnsi="SuzukiPRORegular" w:cstheme="minorHAnsi"/>
+          <w:sz w:val="24"/>
+          <w:szCs w:val="24"/>
+        </w:rPr>
+        <w:t>udvarában korlátozott számban</w:t>
+      </w:r>
+      <w:r>
+        <w:rPr>
+          <w:rFonts w:ascii="SuzukiPRORegular" w:hAnsi="SuzukiPRORegular" w:cstheme="minorHAnsi"/>
+          <w:spacing w:val="2"/>
+          <w:sz w:val="24"/>
+          <w:szCs w:val="24"/>
+        </w:rPr>
+        <w:t xml:space="preserve"> </w:t>
+      </w:r>
+      <w:r>
+        <w:rPr>
+          <w:rFonts w:ascii="SuzukiPRORegular" w:hAnsi="SuzukiPRORegular" w:cstheme="minorHAnsi"/>
+          <w:sz w:val="24"/>
+          <w:szCs w:val="24"/>
+        </w:rPr>
+        <w:t>lehetséges.</w:t>
       </w:r>
     </w:p>
     <w:p>
       <w:pPr>
+        <w:jc w:val="both"/>
+        <w:rPr>
+          <w:rFonts w:ascii="SuzukiPRORegular" w:hAnsi="SuzukiPRORegular" w:cstheme="minorHAnsi"/>
+          <w:b/>
+          <w:sz w:val="24"/>
+          <w:szCs w:val="24"/>
+          <w:shd w:val="clear" w:color="auto" w:fill="FFFFFF"/>
+        </w:rPr>
+      </w:pPr>
+      <w:r>
+        <w:rPr>
+          <w:rFonts w:ascii="SuzukiPRORegular" w:hAnsi="SuzukiPRORegular" w:cstheme="minorHAnsi"/>
+          <w:b/>
+          <w:sz w:val="24"/>
+          <w:szCs w:val="24"/>
+          <w:shd w:val="clear" w:color="auto" w:fill="FFFFFF"/>
+        </w:rPr>
+        <w:t>Vizsgálatokkal kapcsolatos értesítések:</w:t>
+      </w:r>
+    </w:p>
+    <w:p>
+      <w:pPr>
+        <w:pStyle w:val="Listaszerbekezds"/>
+        <w:numPr>
+          <w:ilvl w:val="0"/>
+          <w:numId w:val="11"/>
+        </w:numPr>
+        <w:spacing w:after="120"/>
+        <w:ind w:left="714" w:hanging="357"/>
+        <w:rPr>
+          <w:rFonts w:ascii="SuzukiPRORegular" w:hAnsi="SuzukiPRORegular" w:cstheme="minorHAnsi"/>
+          <w:sz w:val="24"/>
+          <w:szCs w:val="24"/>
+          <w:shd w:val="clear" w:color="auto" w:fill="FFFFFF"/>
+        </w:rPr>
+      </w:pPr>
+      <w:proofErr w:type="spellStart"/>
+      <w:r>
+        <w:rPr>
+          <w:rFonts w:ascii="SuzukiPRORegular" w:hAnsi="SuzukiPRORegular" w:cstheme="minorHAnsi"/>
+          <w:sz w:val="24"/>
+          <w:szCs w:val="24"/>
+          <w:shd w:val="clear" w:color="auto" w:fill="FFFFFF"/>
+        </w:rPr>
+        <w:t>Call</w:t>
+      </w:r>
+      <w:proofErr w:type="spellEnd"/>
+      <w:r>
+        <w:rPr>
+          <w:rFonts w:ascii="SuzukiPRORegular" w:hAnsi="SuzukiPRORegular" w:cstheme="minorHAnsi"/>
+          <w:sz w:val="24"/>
+          <w:szCs w:val="24"/>
+          <w:shd w:val="clear" w:color="auto" w:fill="FFFFFF"/>
+        </w:rPr>
+        <w:t>-centeres munkatársunk a vizsgálat előtt 1 héttel, majd 1 munkanappal felhívja Önt a vizsgálatokkal kapcsolatos egyeztetés céljából.</w:t>
+      </w:r>
+    </w:p>
+    <w:p>
+      <w:pPr>
+        <w:pStyle w:val="Listaszerbekezds"/>
+        <w:numPr>
+          <w:ilvl w:val="0"/>
+          <w:numId w:val="11"/>
+        </w:numPr>
+        <w:spacing w:after="120"/>
+        <w:ind w:left="714" w:hanging="357"/>
+        <w:rPr>
+          <w:rFonts w:ascii="SuzukiPRORegular" w:hAnsi="SuzukiPRORegular" w:cstheme="minorHAnsi"/>
+          <w:sz w:val="24"/>
+          <w:szCs w:val="24"/>
+        </w:rPr>
+      </w:pPr>
+      <w:r>
+        <w:rPr>
+          <w:rFonts w:ascii="SuzukiPRORegular" w:hAnsi="SuzukiPRORegular" w:cstheme="minorHAnsi"/>
+          <w:sz w:val="24"/>
+          <w:szCs w:val="24"/>
+          <w:shd w:val="clear" w:color="auto" w:fill="FFFFFF"/>
+        </w:rPr>
+        <w:t>24 órával a vizsgálat előtt SMS értesítést küldünk Önnek.</w:t>
+      </w:r>
+    </w:p>
+    <w:p>
+      <w:pPr>
         <w:pStyle w:val="Cmsor1"/>
-        <w:spacing w:before="44" w:after="120"/>
         <w:ind w:left="0"/>
         <w:jc w:val="both"/>
         <w:rPr>
-          <w:rFonts w:ascii="Suzuki Pro" w:hAnsi="Suzuki Pro" w:cstheme="minorHAnsi"/>
-          <w:sz w:val="24"/>
-          <w:szCs w:val="24"/>
-        </w:rPr>
-      </w:pPr>
-      <w:r>
-        <w:rPr>
-          <w:rFonts w:ascii="Suzuki Pro" w:hAnsi="Suzuki Pro" w:cstheme="minorHAnsi"/>
+          <w:rFonts w:ascii="SuzukiPRORegular" w:hAnsi="SuzukiPRORegular" w:cstheme="minorHAnsi"/>
+          <w:sz w:val="24"/>
+          <w:szCs w:val="24"/>
+        </w:rPr>
+      </w:pPr>
+      <w:r>
+        <w:rPr>
+          <w:rFonts w:ascii="SuzukiPRORegular" w:hAnsi="SuzukiPRORegular" w:cstheme="minorHAnsi"/>
           <w:sz w:val="24"/>
           <w:szCs w:val="24"/>
         </w:rPr>
@@ -774,30 +666,20 @@
       </w:r>
       <w:r>
         <w:rPr>
-          <w:rFonts w:ascii="Suzuki Pro" w:hAnsi="Suzuki Pro" w:cstheme="minorHAnsi"/>
+          <w:rFonts w:ascii="SuzukiPRORegular" w:hAnsi="SuzukiPRORegular" w:cstheme="minorHAnsi"/>
           <w:spacing w:val="-2"/>
           <w:sz w:val="24"/>
           <w:szCs w:val="24"/>
         </w:rPr>
         <w:t xml:space="preserve"> </w:t>
       </w:r>
-      <w:proofErr w:type="gramStart"/>
-      <w:r>
-        <w:rPr>
-          <w:rFonts w:ascii="Suzuki Pro" w:hAnsi="Suzuki Pro" w:cstheme="minorHAnsi"/>
-          <w:sz w:val="24"/>
-          <w:szCs w:val="24"/>
-        </w:rPr>
-        <w:t>információk</w:t>
-      </w:r>
-      <w:proofErr w:type="gramEnd"/>
-      <w:r>
-        <w:rPr>
-          <w:rFonts w:ascii="Suzuki Pro" w:hAnsi="Suzuki Pro" w:cstheme="minorHAnsi"/>
-          <w:sz w:val="24"/>
-          <w:szCs w:val="24"/>
-        </w:rPr>
-        <w:t>:</w:t>
+      <w:r>
+        <w:rPr>
+          <w:rFonts w:ascii="SuzukiPRORegular" w:hAnsi="SuzukiPRORegular" w:cstheme="minorHAnsi"/>
+          <w:sz w:val="24"/>
+          <w:szCs w:val="24"/>
+        </w:rPr>
+        <w:t>információk:</w:t>
       </w:r>
     </w:p>
     <w:p>
@@ -813,30 +695,22 @@
         <w:spacing w:after="120"/>
         <w:ind w:left="714" w:right="134" w:hanging="357"/>
         <w:rPr>
-          <w:rFonts w:ascii="Suzuki Pro" w:hAnsi="Suzuki Pro" w:cstheme="minorHAnsi"/>
-          <w:sz w:val="24"/>
-          <w:szCs w:val="24"/>
-        </w:rPr>
-      </w:pPr>
-      <w:r>
-        <w:rPr>
-          <w:rFonts w:ascii="Suzuki Pro" w:hAnsi="Suzuki Pro" w:cstheme="minorHAnsi"/>
-          <w:sz w:val="24"/>
-          <w:szCs w:val="24"/>
-        </w:rPr>
-        <w:t>B</w:t>
-      </w:r>
-      <w:r>
-        <w:rPr>
-          <w:rFonts w:ascii="Suzuki Pro" w:hAnsi="Suzuki Pro" w:cstheme="minorHAnsi"/>
-          <w:sz w:val="24"/>
-          <w:szCs w:val="24"/>
-        </w:rPr>
-        <w:t>ejelentkezés</w:t>
-      </w:r>
-      <w:r>
-        <w:rPr>
-          <w:rFonts w:ascii="Suzuki Pro" w:hAnsi="Suzuki Pro" w:cstheme="minorHAnsi"/>
+          <w:rFonts w:ascii="SuzukiPRORegular" w:hAnsi="SuzukiPRORegular" w:cstheme="minorHAnsi"/>
+          <w:sz w:val="24"/>
+          <w:szCs w:val="24"/>
+        </w:rPr>
+      </w:pPr>
+      <w:r>
+        <w:rPr>
+          <w:rFonts w:ascii="SuzukiPRORegular" w:hAnsi="SuzukiPRORegular" w:cstheme="minorHAnsi"/>
+          <w:sz w:val="24"/>
+          <w:szCs w:val="24"/>
+        </w:rPr>
+        <w:t>Bejelentkezés</w:t>
+      </w:r>
+      <w:r>
+        <w:rPr>
+          <w:rFonts w:ascii="SuzukiPRORegular" w:hAnsi="SuzukiPRORegular" w:cstheme="minorHAnsi"/>
           <w:spacing w:val="1"/>
           <w:sz w:val="24"/>
           <w:szCs w:val="24"/>
@@ -845,7 +719,7 @@
       </w:r>
       <w:r>
         <w:rPr>
-          <w:rFonts w:ascii="Suzuki Pro" w:hAnsi="Suzuki Pro" w:cstheme="minorHAnsi"/>
+          <w:rFonts w:ascii="SuzukiPRORegular" w:hAnsi="SuzukiPRORegular" w:cstheme="minorHAnsi"/>
           <w:sz w:val="24"/>
           <w:szCs w:val="24"/>
         </w:rPr>
@@ -853,7 +727,7 @@
       </w:r>
       <w:r>
         <w:rPr>
-          <w:rFonts w:ascii="Suzuki Pro" w:hAnsi="Suzuki Pro" w:cstheme="minorHAnsi"/>
+          <w:rFonts w:ascii="SuzukiPRORegular" w:hAnsi="SuzukiPRORegular" w:cstheme="minorHAnsi"/>
           <w:spacing w:val="1"/>
           <w:sz w:val="24"/>
           <w:szCs w:val="24"/>
@@ -862,7 +736,7 @@
       </w:r>
       <w:r>
         <w:rPr>
-          <w:rFonts w:ascii="Suzuki Pro" w:hAnsi="Suzuki Pro" w:cstheme="minorHAnsi"/>
+          <w:rFonts w:ascii="SuzukiPRORegular" w:hAnsi="SuzukiPRORegular" w:cstheme="minorHAnsi"/>
           <w:sz w:val="24"/>
           <w:szCs w:val="24"/>
         </w:rPr>
@@ -870,7 +744,7 @@
       </w:r>
       <w:r>
         <w:rPr>
-          <w:rFonts w:ascii="Suzuki Pro" w:hAnsi="Suzuki Pro" w:cstheme="minorHAnsi"/>
+          <w:rFonts w:ascii="SuzukiPRORegular" w:hAnsi="SuzukiPRORegular" w:cstheme="minorHAnsi"/>
           <w:spacing w:val="1"/>
           <w:sz w:val="24"/>
           <w:szCs w:val="24"/>
@@ -879,31 +753,15 @@
       </w:r>
       <w:r>
         <w:rPr>
-          <w:rFonts w:ascii="Suzuki Pro" w:hAnsi="Suzuki Pro" w:cstheme="minorHAnsi"/>
-          <w:sz w:val="24"/>
-          <w:szCs w:val="24"/>
-        </w:rPr>
-        <w:t>emel</w:t>
-      </w:r>
-      <w:r>
-        <w:rPr>
-          <w:rFonts w:ascii="Suzuki Pro" w:hAnsi="Suzuki Pro" w:cstheme="minorHAnsi"/>
-          <w:sz w:val="24"/>
-          <w:szCs w:val="24"/>
-        </w:rPr>
-        <w:t>e</w:t>
-      </w:r>
-      <w:r>
-        <w:rPr>
-          <w:rFonts w:ascii="Suzuki Pro" w:hAnsi="Suzuki Pro" w:cstheme="minorHAnsi"/>
-          <w:sz w:val="24"/>
-          <w:szCs w:val="24"/>
-        </w:rPr>
-        <w:t>ti</w:t>
-      </w:r>
-      <w:r>
-        <w:rPr>
-          <w:rFonts w:ascii="Suzuki Pro" w:hAnsi="Suzuki Pro" w:cstheme="minorHAnsi"/>
+          <w:rFonts w:ascii="SuzukiPRORegular" w:hAnsi="SuzukiPRORegular" w:cstheme="minorHAnsi"/>
+          <w:sz w:val="24"/>
+          <w:szCs w:val="24"/>
+        </w:rPr>
+        <w:t>emeleti</w:t>
+      </w:r>
+      <w:r>
+        <w:rPr>
+          <w:rFonts w:ascii="SuzukiPRORegular" w:hAnsi="SuzukiPRORegular" w:cstheme="minorHAnsi"/>
           <w:spacing w:val="1"/>
           <w:sz w:val="24"/>
           <w:szCs w:val="24"/>
@@ -912,7 +770,7 @@
       </w:r>
       <w:r>
         <w:rPr>
-          <w:rFonts w:ascii="Suzuki Pro" w:hAnsi="Suzuki Pro" w:cstheme="minorHAnsi"/>
+          <w:rFonts w:ascii="SuzukiPRORegular" w:hAnsi="SuzukiPRORegular" w:cstheme="minorHAnsi"/>
           <w:sz w:val="24"/>
           <w:szCs w:val="24"/>
         </w:rPr>
@@ -920,7 +778,7 @@
       </w:r>
       <w:r>
         <w:rPr>
-          <w:rFonts w:ascii="Suzuki Pro" w:hAnsi="Suzuki Pro" w:cstheme="minorHAnsi"/>
+          <w:rFonts w:ascii="SuzukiPRORegular" w:hAnsi="SuzukiPRORegular" w:cstheme="minorHAnsi"/>
           <w:spacing w:val="1"/>
           <w:sz w:val="24"/>
           <w:szCs w:val="24"/>
@@ -929,7 +787,7 @@
       </w:r>
       <w:r>
         <w:rPr>
-          <w:rFonts w:ascii="Suzuki Pro" w:hAnsi="Suzuki Pro" w:cstheme="minorHAnsi"/>
+          <w:rFonts w:ascii="SuzukiPRORegular" w:hAnsi="SuzukiPRORegular" w:cstheme="minorHAnsi"/>
           <w:sz w:val="24"/>
           <w:szCs w:val="24"/>
         </w:rPr>
@@ -937,7 +795,7 @@
       </w:r>
       <w:r>
         <w:rPr>
-          <w:rFonts w:ascii="Suzuki Pro" w:hAnsi="Suzuki Pro" w:cstheme="minorHAnsi"/>
+          <w:rFonts w:ascii="SuzukiPRORegular" w:hAnsi="SuzukiPRORegular" w:cstheme="minorHAnsi"/>
           <w:spacing w:val="1"/>
           <w:sz w:val="24"/>
           <w:szCs w:val="24"/>
@@ -946,7 +804,7 @@
       </w:r>
       <w:r>
         <w:rPr>
-          <w:rFonts w:ascii="Suzuki Pro" w:hAnsi="Suzuki Pro" w:cstheme="minorHAnsi"/>
+          <w:rFonts w:ascii="SuzukiPRORegular" w:hAnsi="SuzukiPRORegular" w:cstheme="minorHAnsi"/>
           <w:sz w:val="24"/>
           <w:szCs w:val="24"/>
         </w:rPr>
@@ -954,7 +812,7 @@
       </w:r>
       <w:r>
         <w:rPr>
-          <w:rFonts w:ascii="Suzuki Pro" w:hAnsi="Suzuki Pro" w:cstheme="minorHAnsi"/>
+          <w:rFonts w:ascii="SuzukiPRORegular" w:hAnsi="SuzukiPRORegular" w:cstheme="minorHAnsi"/>
           <w:spacing w:val="1"/>
           <w:sz w:val="24"/>
           <w:szCs w:val="24"/>
@@ -963,7 +821,7 @@
       </w:r>
       <w:r>
         <w:rPr>
-          <w:rFonts w:ascii="Suzuki Pro" w:hAnsi="Suzuki Pro" w:cstheme="minorHAnsi"/>
+          <w:rFonts w:ascii="SuzukiPRORegular" w:hAnsi="SuzukiPRORegular" w:cstheme="minorHAnsi"/>
           <w:sz w:val="24"/>
           <w:szCs w:val="24"/>
         </w:rPr>
@@ -971,7 +829,7 @@
       </w:r>
       <w:r>
         <w:rPr>
-          <w:rFonts w:ascii="Suzuki Pro" w:hAnsi="Suzuki Pro" w:cstheme="minorHAnsi"/>
+          <w:rFonts w:ascii="SuzukiPRORegular" w:hAnsi="SuzukiPRORegular" w:cstheme="minorHAnsi"/>
           <w:spacing w:val="1"/>
           <w:sz w:val="24"/>
           <w:szCs w:val="24"/>
@@ -980,7 +838,7 @@
       </w:r>
       <w:r>
         <w:rPr>
-          <w:rFonts w:ascii="Suzuki Pro" w:hAnsi="Suzuki Pro" w:cstheme="minorHAnsi"/>
+          <w:rFonts w:ascii="SuzukiPRORegular" w:hAnsi="SuzukiPRORegular" w:cstheme="minorHAnsi"/>
           <w:sz w:val="24"/>
           <w:szCs w:val="24"/>
         </w:rPr>
@@ -988,7 +846,7 @@
       </w:r>
       <w:r>
         <w:rPr>
-          <w:rFonts w:ascii="Suzuki Pro" w:hAnsi="Suzuki Pro" w:cstheme="minorHAnsi"/>
+          <w:rFonts w:ascii="SuzukiPRORegular" w:hAnsi="SuzukiPRORegular" w:cstheme="minorHAnsi"/>
           <w:spacing w:val="-52"/>
           <w:sz w:val="24"/>
           <w:szCs w:val="24"/>
@@ -997,83 +855,11 @@
       </w:r>
       <w:r>
         <w:rPr>
-          <w:rFonts w:ascii="Suzuki Pro" w:hAnsi="Suzuki Pro" w:cstheme="minorHAnsi"/>
-          <w:sz w:val="24"/>
-          <w:szCs w:val="24"/>
-        </w:rPr>
-        <w:t>adategyeztetés</w:t>
-      </w:r>
-      <w:r>
-        <w:rPr>
-          <w:rFonts w:ascii="Suzuki Pro" w:hAnsi="Suzuki Pro" w:cstheme="minorHAnsi"/>
-          <w:sz w:val="24"/>
-          <w:szCs w:val="24"/>
-        </w:rPr>
-        <w:t>t</w:t>
-      </w:r>
-      <w:r>
-        <w:rPr>
-          <w:rFonts w:ascii="Suzuki Pro" w:hAnsi="Suzuki Pro" w:cstheme="minorHAnsi"/>
-          <w:sz w:val="24"/>
-          <w:szCs w:val="24"/>
-        </w:rPr>
-        <w:t xml:space="preserve"> </w:t>
-      </w:r>
-      <w:r>
-        <w:rPr>
-          <w:rFonts w:ascii="Suzuki Pro" w:hAnsi="Suzuki Pro" w:cstheme="minorHAnsi"/>
-          <w:sz w:val="24"/>
-          <w:szCs w:val="24"/>
-        </w:rPr>
-        <w:t>követően meg</w:t>
-      </w:r>
-      <w:r>
-        <w:rPr>
-          <w:rFonts w:ascii="Suzuki Pro" w:hAnsi="Suzuki Pro" w:cstheme="minorHAnsi"/>
-          <w:sz w:val="24"/>
-          <w:szCs w:val="24"/>
-        </w:rPr>
-        <w:t>kez</w:t>
-      </w:r>
-      <w:r>
-        <w:rPr>
-          <w:rFonts w:ascii="Suzuki Pro" w:hAnsi="Suzuki Pro" w:cstheme="minorHAnsi"/>
-          <w:sz w:val="24"/>
-          <w:szCs w:val="24"/>
-        </w:rPr>
-        <w:t xml:space="preserve">dődnek </w:t>
-      </w:r>
-      <w:r>
-        <w:rPr>
-          <w:rFonts w:ascii="Suzuki Pro" w:hAnsi="Suzuki Pro" w:cstheme="minorHAnsi"/>
-          <w:sz w:val="24"/>
-          <w:szCs w:val="24"/>
-        </w:rPr>
-        <w:t xml:space="preserve">a vizsgálatok. A vizsgálatokra </w:t>
-      </w:r>
-      <w:r>
-        <w:rPr>
-          <w:rFonts w:ascii="Suzuki Pro" w:hAnsi="Suzuki Pro" w:cstheme="minorHAnsi"/>
-          <w:sz w:val="24"/>
-          <w:szCs w:val="24"/>
-        </w:rPr>
-        <w:t xml:space="preserve">mindig </w:t>
-      </w:r>
-      <w:r>
-        <w:rPr>
-          <w:rFonts w:ascii="Suzuki Pro" w:hAnsi="Suzuki Pro" w:cstheme="minorHAnsi"/>
-          <w:sz w:val="24"/>
-          <w:szCs w:val="24"/>
-        </w:rPr>
-        <w:t>név szerint szólítják</w:t>
-      </w:r>
-      <w:r>
-        <w:rPr>
-          <w:rFonts w:ascii="Suzuki Pro" w:hAnsi="Suzuki Pro" w:cstheme="minorHAnsi"/>
-          <w:sz w:val="24"/>
-          <w:szCs w:val="24"/>
-        </w:rPr>
-        <w:t xml:space="preserve">. </w:t>
+          <w:rFonts w:ascii="SuzukiPRORegular" w:hAnsi="SuzukiPRORegular" w:cstheme="minorHAnsi"/>
+          <w:sz w:val="24"/>
+          <w:szCs w:val="24"/>
+        </w:rPr>
+        <w:t xml:space="preserve">adategyeztetés után megkezdődnek a vizsgálatok. A vizsgálatokra mindig név szerint szólítják. </w:t>
       </w:r>
     </w:p>
     <w:p>
@@ -1089,50 +875,18 @@
         <w:spacing w:after="120"/>
         <w:ind w:left="714" w:right="134" w:hanging="357"/>
         <w:rPr>
-          <w:rFonts w:ascii="Suzuki Pro" w:hAnsi="Suzuki Pro" w:cstheme="minorHAnsi"/>
-          <w:sz w:val="24"/>
-          <w:szCs w:val="24"/>
-        </w:rPr>
-      </w:pPr>
-      <w:r>
-        <w:rPr>
-          <w:rFonts w:ascii="Suzuki Pro" w:hAnsi="Suzuki Pro" w:cstheme="minorHAnsi"/>
-          <w:sz w:val="24"/>
-          <w:szCs w:val="24"/>
-        </w:rPr>
-        <w:t xml:space="preserve">A vizsgálatok után </w:t>
-      </w:r>
-      <w:r>
-        <w:rPr>
-          <w:rFonts w:ascii="Suzuki Pro" w:hAnsi="Suzuki Pro" w:cstheme="minorHAnsi"/>
-          <w:sz w:val="24"/>
-          <w:szCs w:val="24"/>
-        </w:rPr>
-        <w:t xml:space="preserve">kérjük, </w:t>
-      </w:r>
-      <w:r>
-        <w:rPr>
-          <w:rFonts w:ascii="Suzuki Pro" w:hAnsi="Suzuki Pro" w:cstheme="minorHAnsi"/>
-          <w:sz w:val="24"/>
-          <w:szCs w:val="24"/>
-        </w:rPr>
-        <w:t xml:space="preserve">sétálópapírját </w:t>
-      </w:r>
-      <w:r>
-        <w:rPr>
-          <w:rFonts w:ascii="Suzuki Pro" w:hAnsi="Suzuki Pro" w:cstheme="minorHAnsi"/>
-          <w:sz w:val="24"/>
-          <w:szCs w:val="24"/>
-        </w:rPr>
-        <w:t>minden esetben</w:t>
-      </w:r>
-      <w:r>
-        <w:rPr>
-          <w:rFonts w:ascii="Suzuki Pro" w:hAnsi="Suzuki Pro" w:cstheme="minorHAnsi"/>
-          <w:sz w:val="24"/>
-          <w:szCs w:val="24"/>
-        </w:rPr>
-        <w:t xml:space="preserve"> adja le a recepción.</w:t>
+          <w:rFonts w:ascii="SuzukiPRORegular" w:hAnsi="SuzukiPRORegular" w:cstheme="minorHAnsi"/>
+          <w:sz w:val="24"/>
+          <w:szCs w:val="24"/>
+        </w:rPr>
+      </w:pPr>
+      <w:r>
+        <w:rPr>
+          <w:rFonts w:ascii="SuzukiPRORegular" w:hAnsi="SuzukiPRORegular" w:cstheme="minorHAnsi"/>
+          <w:sz w:val="24"/>
+          <w:szCs w:val="24"/>
+        </w:rPr>
+        <w:t>A vizsgálatok után sétálópapírját kérjük, mindig adja le a recepción.</w:t>
       </w:r>
     </w:p>
     <w:p>
@@ -1145,17 +899,17 @@
         <w:tabs>
           <w:tab w:val="left" w:pos="856"/>
         </w:tabs>
-        <w:spacing w:before="7" w:after="120"/>
+        <w:spacing w:after="120"/>
         <w:ind w:left="714" w:right="135" w:hanging="357"/>
         <w:rPr>
-          <w:rFonts w:ascii="Suzuki Pro" w:hAnsi="Suzuki Pro" w:cstheme="minorHAnsi"/>
-          <w:sz w:val="24"/>
-          <w:szCs w:val="24"/>
-        </w:rPr>
-      </w:pPr>
-      <w:r>
-        <w:rPr>
-          <w:rFonts w:ascii="Suzuki Pro" w:hAnsi="Suzuki Pro" w:cstheme="minorHAnsi"/>
+          <w:rFonts w:ascii="SuzukiPRORegular" w:hAnsi="SuzukiPRORegular" w:cstheme="minorHAnsi"/>
+          <w:sz w:val="24"/>
+          <w:szCs w:val="24"/>
+        </w:rPr>
+      </w:pPr>
+      <w:r>
+        <w:rPr>
+          <w:rFonts w:ascii="SuzukiPRORegular" w:hAnsi="SuzukiPRORegular" w:cstheme="minorHAnsi"/>
           <w:sz w:val="24"/>
           <w:szCs w:val="24"/>
         </w:rPr>
@@ -1163,7 +917,7 @@
       </w:r>
       <w:r>
         <w:rPr>
-          <w:rFonts w:ascii="Suzuki Pro" w:hAnsi="Suzuki Pro" w:cstheme="minorHAnsi"/>
+          <w:rFonts w:ascii="SuzukiPRORegular" w:hAnsi="SuzukiPRORegular" w:cstheme="minorHAnsi"/>
           <w:spacing w:val="1"/>
           <w:sz w:val="24"/>
           <w:szCs w:val="24"/>
@@ -1172,7 +926,7 @@
       </w:r>
       <w:r>
         <w:rPr>
-          <w:rFonts w:ascii="Suzuki Pro" w:hAnsi="Suzuki Pro" w:cstheme="minorHAnsi"/>
+          <w:rFonts w:ascii="SuzukiPRORegular" w:hAnsi="SuzukiPRORegular" w:cstheme="minorHAnsi"/>
           <w:sz w:val="24"/>
           <w:szCs w:val="24"/>
         </w:rPr>
@@ -1180,7 +934,7 @@
       </w:r>
       <w:r>
         <w:rPr>
-          <w:rFonts w:ascii="Suzuki Pro" w:hAnsi="Suzuki Pro" w:cstheme="minorHAnsi"/>
+          <w:rFonts w:ascii="SuzukiPRORegular" w:hAnsi="SuzukiPRORegular" w:cstheme="minorHAnsi"/>
           <w:spacing w:val="1"/>
           <w:sz w:val="24"/>
           <w:szCs w:val="24"/>
@@ -1189,7 +943,7 @@
       </w:r>
       <w:r>
         <w:rPr>
-          <w:rFonts w:ascii="Suzuki Pro" w:hAnsi="Suzuki Pro" w:cstheme="minorHAnsi"/>
+          <w:rFonts w:ascii="SuzukiPRORegular" w:hAnsi="SuzukiPRORegular" w:cstheme="minorHAnsi"/>
           <w:sz w:val="24"/>
           <w:szCs w:val="24"/>
         </w:rPr>
@@ -1197,7 +951,7 @@
       </w:r>
       <w:r>
         <w:rPr>
-          <w:rFonts w:ascii="Suzuki Pro" w:hAnsi="Suzuki Pro" w:cstheme="minorHAnsi"/>
+          <w:rFonts w:ascii="SuzukiPRORegular" w:hAnsi="SuzukiPRORegular" w:cstheme="minorHAnsi"/>
           <w:spacing w:val="1"/>
           <w:sz w:val="24"/>
           <w:szCs w:val="24"/>
@@ -1206,23 +960,15 @@
       </w:r>
       <w:r>
         <w:rPr>
-          <w:rFonts w:ascii="Suzuki Pro" w:hAnsi="Suzuki Pro" w:cstheme="minorHAnsi"/>
-          <w:sz w:val="24"/>
-          <w:szCs w:val="24"/>
-        </w:rPr>
-        <w:t>követően</w:t>
-      </w:r>
-      <w:r>
-        <w:rPr>
-          <w:rFonts w:ascii="Suzuki Pro" w:hAnsi="Suzuki Pro" w:cstheme="minorHAnsi"/>
-          <w:sz w:val="24"/>
-          <w:szCs w:val="24"/>
-        </w:rPr>
-        <w:t xml:space="preserve"> (labor és ultrahang)</w:t>
-      </w:r>
-      <w:r>
-        <w:rPr>
-          <w:rFonts w:ascii="Suzuki Pro" w:hAnsi="Suzuki Pro" w:cstheme="minorHAnsi"/>
+          <w:rFonts w:ascii="SuzukiPRORegular" w:hAnsi="SuzukiPRORegular" w:cstheme="minorHAnsi"/>
+          <w:sz w:val="24"/>
+          <w:szCs w:val="24"/>
+        </w:rPr>
+        <w:t>követően (labor és ultrahang)</w:t>
+      </w:r>
+      <w:r>
+        <w:rPr>
+          <w:rFonts w:ascii="SuzukiPRORegular" w:hAnsi="SuzukiPRORegular" w:cstheme="minorHAnsi"/>
           <w:spacing w:val="1"/>
           <w:sz w:val="24"/>
           <w:szCs w:val="24"/>
@@ -1231,31 +977,15 @@
       </w:r>
       <w:r>
         <w:rPr>
-          <w:rFonts w:ascii="Suzuki Pro" w:hAnsi="Suzuki Pro" w:cstheme="minorHAnsi"/>
-          <w:sz w:val="24"/>
-          <w:szCs w:val="24"/>
-        </w:rPr>
-        <w:t>reggelit</w:t>
-      </w:r>
-      <w:r>
-        <w:rPr>
-          <w:rFonts w:ascii="Suzuki Pro" w:hAnsi="Suzuki Pro" w:cstheme="minorHAnsi"/>
-          <w:sz w:val="24"/>
-          <w:szCs w:val="24"/>
-        </w:rPr>
-        <w:t xml:space="preserve"> biztosítunk</w:t>
-      </w:r>
-      <w:r>
-        <w:rPr>
-          <w:rFonts w:ascii="Suzuki Pro" w:hAnsi="Suzuki Pro" w:cstheme="minorHAnsi"/>
-          <w:sz w:val="24"/>
-          <w:szCs w:val="24"/>
-        </w:rPr>
-        <w:t>.</w:t>
-      </w:r>
-      <w:r>
-        <w:rPr>
-          <w:rFonts w:ascii="Suzuki Pro" w:hAnsi="Suzuki Pro" w:cstheme="minorHAnsi"/>
+          <w:rFonts w:ascii="SuzukiPRORegular" w:hAnsi="SuzukiPRORegular" w:cstheme="minorHAnsi"/>
+          <w:sz w:val="24"/>
+          <w:szCs w:val="24"/>
+        </w:rPr>
+        <w:t>reggelit biztosítunk.</w:t>
+      </w:r>
+      <w:r>
+        <w:rPr>
+          <w:rFonts w:ascii="SuzukiPRORegular" w:hAnsi="SuzukiPRORegular" w:cstheme="minorHAnsi"/>
           <w:spacing w:val="1"/>
           <w:sz w:val="24"/>
           <w:szCs w:val="24"/>
@@ -1264,111 +994,53 @@
       </w:r>
       <w:r>
         <w:rPr>
-          <w:rFonts w:ascii="Suzuki Pro" w:hAnsi="Suzuki Pro" w:cstheme="minorHAnsi"/>
-          <w:sz w:val="24"/>
-          <w:szCs w:val="24"/>
-        </w:rPr>
-        <w:t xml:space="preserve">Ha </w:t>
+          <w:rFonts w:ascii="SuzukiPRORegular" w:hAnsi="SuzukiPRORegular" w:cstheme="minorHAnsi"/>
+          <w:sz w:val="24"/>
+          <w:szCs w:val="24"/>
+        </w:rPr>
+        <w:t xml:space="preserve">Ha laktóz, </w:t>
       </w:r>
       <w:proofErr w:type="spellStart"/>
       <w:r>
         <w:rPr>
-          <w:rFonts w:ascii="Suzuki Pro" w:hAnsi="Suzuki Pro" w:cstheme="minorHAnsi"/>
-          <w:sz w:val="24"/>
-          <w:szCs w:val="24"/>
-        </w:rPr>
-        <w:t>laktóz</w:t>
+          <w:rFonts w:ascii="SuzukiPRORegular" w:hAnsi="SuzukiPRORegular" w:cstheme="minorHAnsi"/>
+          <w:sz w:val="24"/>
+          <w:szCs w:val="24"/>
+        </w:rPr>
+        <w:t>glutén</w:t>
       </w:r>
       <w:proofErr w:type="spellEnd"/>
       <w:r>
         <w:rPr>
-          <w:rFonts w:ascii="Suzuki Pro" w:hAnsi="Suzuki Pro" w:cstheme="minorHAnsi"/>
-          <w:sz w:val="24"/>
-          <w:szCs w:val="24"/>
-        </w:rPr>
-        <w:t xml:space="preserve">, </w:t>
+          <w:rFonts w:ascii="SuzukiPRORegular" w:hAnsi="SuzukiPRORegular" w:cstheme="minorHAnsi"/>
+          <w:sz w:val="24"/>
+          <w:szCs w:val="24"/>
+        </w:rPr>
+        <w:t xml:space="preserve">, húsmentes vagy </w:t>
       </w:r>
       <w:proofErr w:type="spellStart"/>
       <w:r>
         <w:rPr>
-          <w:rFonts w:ascii="Suzuki Pro" w:hAnsi="Suzuki Pro" w:cstheme="minorHAnsi"/>
-          <w:sz w:val="24"/>
-          <w:szCs w:val="24"/>
-        </w:rPr>
-        <w:t>glutén</w:t>
+          <w:rFonts w:ascii="SuzukiPRORegular" w:hAnsi="SuzukiPRORegular" w:cstheme="minorHAnsi"/>
+          <w:sz w:val="24"/>
+          <w:szCs w:val="24"/>
+        </w:rPr>
+        <w:t>vegán</w:t>
       </w:r>
       <w:proofErr w:type="spellEnd"/>
       <w:r>
         <w:rPr>
-          <w:rFonts w:ascii="Suzuki Pro" w:hAnsi="Suzuki Pro" w:cstheme="minorHAnsi"/>
-          <w:sz w:val="24"/>
-          <w:szCs w:val="24"/>
-        </w:rPr>
-        <w:t xml:space="preserve">, húsmentes vagy </w:t>
-      </w:r>
-      <w:proofErr w:type="spellStart"/>
-      <w:r>
-        <w:rPr>
-          <w:rFonts w:ascii="Suzuki Pro" w:hAnsi="Suzuki Pro" w:cstheme="minorHAnsi"/>
-          <w:sz w:val="24"/>
-          <w:szCs w:val="24"/>
-        </w:rPr>
-        <w:t>vegán</w:t>
-      </w:r>
-      <w:proofErr w:type="spellEnd"/>
-      <w:r>
-        <w:rPr>
-          <w:rFonts w:ascii="Suzuki Pro" w:hAnsi="Suzuki Pro" w:cstheme="minorHAnsi"/>
-          <w:sz w:val="24"/>
-          <w:szCs w:val="24"/>
-        </w:rPr>
-        <w:t xml:space="preserve"> </w:t>
-      </w:r>
-      <w:r>
-        <w:rPr>
-          <w:rFonts w:ascii="Suzuki Pro" w:hAnsi="Suzuki Pro" w:cstheme="minorHAnsi"/>
-          <w:sz w:val="24"/>
-          <w:szCs w:val="24"/>
-        </w:rPr>
-        <w:t>szendvicset fogyasztana,</w:t>
-      </w:r>
-      <w:r>
-        <w:rPr>
-          <w:rFonts w:ascii="Suzuki Pro" w:hAnsi="Suzuki Pro" w:cstheme="minorHAnsi"/>
-          <w:sz w:val="24"/>
-          <w:szCs w:val="24"/>
-        </w:rPr>
-        <w:t xml:space="preserve"> kérjük,</w:t>
-      </w:r>
-      <w:r>
-        <w:rPr>
-          <w:rFonts w:ascii="Suzuki Pro" w:hAnsi="Suzuki Pro" w:cstheme="minorHAnsi"/>
-          <w:sz w:val="24"/>
-          <w:szCs w:val="24"/>
-        </w:rPr>
-        <w:t xml:space="preserve"> jelezze</w:t>
-      </w:r>
-      <w:r>
-        <w:rPr>
-          <w:rFonts w:ascii="Suzuki Pro" w:hAnsi="Suzuki Pro" w:cstheme="minorHAnsi"/>
-          <w:sz w:val="24"/>
-          <w:szCs w:val="24"/>
-        </w:rPr>
-        <w:t xml:space="preserve"> a</w:t>
-      </w:r>
-      <w:r>
-        <w:rPr>
-          <w:rFonts w:ascii="Suzuki Pro" w:hAnsi="Suzuki Pro" w:cstheme="minorHAnsi"/>
-          <w:sz w:val="24"/>
-          <w:szCs w:val="24"/>
-        </w:rPr>
-        <w:t xml:space="preserve">zt nekünk a </w:t>
+          <w:rFonts w:ascii="SuzukiPRORegular" w:hAnsi="SuzukiPRORegular" w:cstheme="minorHAnsi"/>
+          <w:sz w:val="24"/>
+          <w:szCs w:val="24"/>
+        </w:rPr>
+        <w:t xml:space="preserve"> szendvicset fogyasztana, kérjük, jelezze azt nekünk a </w:t>
       </w:r>
       <w:hyperlink r:id="rId7" w:history="1">
         <w:r>
           <w:rPr>
             <w:rStyle w:val="Hiperhivatkozs"/>
-            <w:rFonts w:ascii="Suzuki Pro" w:hAnsi="Suzuki Pro" w:cstheme="minorHAnsi"/>
+            <w:rFonts w:ascii="SuzukiPRORegular" w:hAnsi="SuzukiPRORegular" w:cstheme="minorHAnsi"/>
             <w:color w:val="auto"/>
             <w:sz w:val="24"/>
             <w:szCs w:val="24"/>
@@ -1378,59 +1050,11 @@
       </w:hyperlink>
       <w:r>
         <w:rPr>
-          <w:rFonts w:ascii="Suzuki Pro" w:hAnsi="Suzuki Pro" w:cstheme="minorHAnsi"/>
-          <w:sz w:val="24"/>
-          <w:szCs w:val="24"/>
-        </w:rPr>
-        <w:t xml:space="preserve"> e-mail címen,</w:t>
-      </w:r>
-      <w:r>
-        <w:rPr>
-          <w:rFonts w:ascii="Suzuki Pro" w:hAnsi="Suzuki Pro" w:cstheme="minorHAnsi"/>
-          <w:sz w:val="24"/>
-          <w:szCs w:val="24"/>
-        </w:rPr>
-        <w:t xml:space="preserve"> </w:t>
-      </w:r>
-      <w:r>
-        <w:rPr>
-          <w:rFonts w:ascii="Suzuki Pro" w:hAnsi="Suzuki Pro" w:cstheme="minorHAnsi"/>
-          <w:sz w:val="24"/>
-          <w:szCs w:val="24"/>
-        </w:rPr>
-        <w:t>plusz vizsgálati igény</w:t>
-      </w:r>
-      <w:r>
-        <w:rPr>
-          <w:rFonts w:ascii="Suzuki Pro" w:hAnsi="Suzuki Pro" w:cstheme="minorHAnsi"/>
-          <w:sz w:val="24"/>
-          <w:szCs w:val="24"/>
-        </w:rPr>
-        <w:t>ét is erre az e-mail címre legyen kedves</w:t>
-      </w:r>
-      <w:r>
-        <w:rPr>
-          <w:rFonts w:ascii="Suzuki Pro" w:hAnsi="Suzuki Pro" w:cstheme="minorHAnsi"/>
-          <w:sz w:val="24"/>
-          <w:szCs w:val="24"/>
-        </w:rPr>
-        <w:t xml:space="preserve"> </w:t>
-      </w:r>
-      <w:r>
-        <w:rPr>
-          <w:rFonts w:ascii="Suzuki Pro" w:hAnsi="Suzuki Pro" w:cstheme="minorHAnsi"/>
-          <w:sz w:val="24"/>
-          <w:szCs w:val="24"/>
-        </w:rPr>
-        <w:t>elküldeni</w:t>
-      </w:r>
-      <w:r>
-        <w:rPr>
-          <w:rFonts w:ascii="Suzuki Pro" w:hAnsi="Suzuki Pro" w:cstheme="minorHAnsi"/>
-          <w:sz w:val="24"/>
-          <w:szCs w:val="24"/>
-        </w:rPr>
-        <w:t>.</w:t>
+          <w:rFonts w:ascii="SuzukiPRORegular" w:hAnsi="SuzukiPRORegular" w:cstheme="minorHAnsi"/>
+          <w:sz w:val="24"/>
+          <w:szCs w:val="24"/>
+        </w:rPr>
+        <w:t xml:space="preserve"> e-mail címen. Plusz vizsgálati igényét is erre az e-mail címre legyen kedves elküldeni.</w:t>
       </w:r>
     </w:p>
     <w:p>
@@ -1443,78 +1067,37 @@
         <w:tabs>
           <w:tab w:val="left" w:pos="856"/>
         </w:tabs>
-        <w:spacing w:before="9" w:after="120"/>
+        <w:spacing w:after="120"/>
         <w:ind w:left="714" w:right="132" w:hanging="357"/>
         <w:rPr>
-          <w:rFonts w:ascii="Suzuki Pro" w:hAnsi="Suzuki Pro" w:cstheme="minorHAnsi"/>
-          <w:sz w:val="24"/>
-          <w:szCs w:val="24"/>
-        </w:rPr>
-      </w:pPr>
-      <w:r>
-        <w:rPr>
-          <w:rFonts w:ascii="Suzuki Pro" w:hAnsi="Suzuki Pro" w:cstheme="minorHAnsi"/>
-          <w:sz w:val="24"/>
-          <w:szCs w:val="24"/>
-        </w:rPr>
-        <w:t xml:space="preserve">A </w:t>
-      </w:r>
-      <w:r>
-        <w:rPr>
-          <w:rFonts w:ascii="Suzuki Pro" w:hAnsi="Suzuki Pro" w:cstheme="minorHAnsi"/>
-          <w:sz w:val="24"/>
-          <w:szCs w:val="24"/>
-        </w:rPr>
-        <w:t>szűrés végén</w:t>
-      </w:r>
-      <w:r>
-        <w:rPr>
-          <w:rFonts w:ascii="Suzuki Pro" w:hAnsi="Suzuki Pro" w:cstheme="minorHAnsi"/>
-          <w:sz w:val="24"/>
-          <w:szCs w:val="24"/>
-        </w:rPr>
-        <w:t xml:space="preserve"> </w:t>
-      </w:r>
-      <w:r>
-        <w:rPr>
-          <w:rFonts w:ascii="Suzuki Pro" w:hAnsi="Suzuki Pro" w:cstheme="minorHAnsi"/>
-          <w:sz w:val="24"/>
-          <w:szCs w:val="24"/>
-        </w:rPr>
-        <w:t>kézhez kapja az</w:t>
-      </w:r>
-      <w:r>
-        <w:rPr>
-          <w:rFonts w:ascii="Suzuki Pro" w:hAnsi="Suzuki Pro" w:cstheme="minorHAnsi"/>
-          <w:sz w:val="24"/>
-          <w:szCs w:val="24"/>
-        </w:rPr>
-        <w:t xml:space="preserve"> aznap elk</w:t>
-      </w:r>
-      <w:r>
-        <w:rPr>
-          <w:rFonts w:ascii="Suzuki Pro" w:hAnsi="Suzuki Pro" w:cstheme="minorHAnsi"/>
-          <w:sz w:val="24"/>
-          <w:szCs w:val="24"/>
-        </w:rPr>
-        <w:t>észült vizsgálati dokumentációt, a</w:t>
-      </w:r>
-      <w:r>
-        <w:rPr>
-          <w:rFonts w:ascii="Suzuki Pro" w:hAnsi="Suzuki Pro" w:cstheme="minorHAnsi"/>
-          <w:spacing w:val="1"/>
-          <w:sz w:val="24"/>
-          <w:szCs w:val="24"/>
-        </w:rPr>
-        <w:t xml:space="preserve"> </w:t>
-      </w:r>
-      <w:r>
-        <w:rPr>
-          <w:rFonts w:ascii="Suzuki Pro" w:hAnsi="Suzuki Pro" w:cstheme="minorHAnsi"/>
-          <w:sz w:val="24"/>
-          <w:szCs w:val="24"/>
-        </w:rPr>
-        <w:t xml:space="preserve">vizsgálati leletek az EESZT-be is feltöltésre kerülnek. </w:t>
+          <w:rFonts w:ascii="SuzukiPRORegular" w:hAnsi="SuzukiPRORegular" w:cstheme="minorHAnsi"/>
+          <w:sz w:val="24"/>
+          <w:szCs w:val="24"/>
+        </w:rPr>
+      </w:pPr>
+      <w:r>
+        <w:rPr>
+          <w:rFonts w:ascii="SuzukiPRORegular" w:hAnsi="SuzukiPRORegular" w:cstheme="minorHAnsi"/>
+          <w:sz w:val="24"/>
+          <w:szCs w:val="24"/>
+        </w:rPr>
+        <w:t xml:space="preserve">A szűrés végén kézhez kapja az aznap elkészült vizsgálati dokumentációt, </w:t>
+      </w:r>
+      <w:r>
+        <w:rPr>
+          <w:rFonts w:ascii="SuzukiPRORegular" w:hAnsi="SuzukiPRORegular" w:cstheme="minorHAnsi"/>
+          <w:sz w:val="24"/>
+          <w:szCs w:val="24"/>
+        </w:rPr>
+        <w:t xml:space="preserve">valamint </w:t>
+      </w:r>
+      <w:r>
+        <w:rPr>
+          <w:rFonts w:ascii="SuzukiPRORegular" w:hAnsi="SuzukiPRORegular" w:cstheme="minorHAnsi"/>
+          <w:sz w:val="24"/>
+          <w:szCs w:val="24"/>
+        </w:rPr>
+        <w:t>az eredményeket feltöltjük az EESZT-be is.</w:t>
       </w:r>
     </w:p>
     <w:p>
@@ -1527,10 +1110,10 @@
         <w:tabs>
           <w:tab w:val="left" w:pos="856"/>
         </w:tabs>
-        <w:spacing w:before="9" w:after="120"/>
+        <w:spacing w:after="120"/>
         <w:ind w:left="714" w:right="132" w:hanging="357"/>
         <w:rPr>
-          <w:rFonts w:ascii="Suzuki Pro" w:hAnsi="Suzuki Pro" w:cstheme="minorHAnsi"/>
+          <w:rFonts w:ascii="SuzukiPRORegular" w:hAnsi="SuzukiPRORegular" w:cstheme="minorHAnsi"/>
           <w:sz w:val="24"/>
           <w:szCs w:val="24"/>
         </w:rPr>
@@ -1538,38 +1121,21 @@
           <w:headerReference w:type="default" r:id="rId8"/>
           <w:type w:val="continuous"/>
           <w:pgSz w:w="11910" w:h="16840"/>
-          <w:pgMar w:top="940" w:right="1280" w:bottom="280" w:left="1134" w:header="709" w:footer="708" w:gutter="0"/>
+          <w:pgMar w:top="940" w:right="1280" w:bottom="280" w:left="1134" w:header="708" w:footer="708" w:gutter="0"/>
           <w:cols w:space="708"/>
-          <w:docGrid w:linePitch="299"/>
         </w:sectPr>
       </w:pPr>
       <w:r>
         <w:rPr>
-          <w:rFonts w:ascii="Suzuki Pro" w:hAnsi="Suzuki Pro" w:cstheme="minorHAnsi"/>
-          <w:sz w:val="24"/>
-          <w:szCs w:val="24"/>
-        </w:rPr>
-        <w:t>A vizsgála</w:t>
-      </w:r>
-      <w:r>
-        <w:rPr>
-          <w:rFonts w:ascii="Suzuki Pro" w:hAnsi="Suzuki Pro" w:cstheme="minorHAnsi"/>
-          <w:sz w:val="24"/>
-          <w:szCs w:val="24"/>
-        </w:rPr>
-        <w:t>t</w:t>
-      </w:r>
-      <w:r>
-        <w:rPr>
-          <w:rFonts w:ascii="Suzuki Pro" w:hAnsi="Suzuki Pro" w:cstheme="minorHAnsi"/>
-          <w:sz w:val="24"/>
-          <w:szCs w:val="24"/>
-        </w:rPr>
-        <w:t xml:space="preserve"> zárásaként írásos</w:t>
-      </w:r>
-      <w:r>
-        <w:rPr>
-          <w:rFonts w:ascii="Suzuki Pro" w:hAnsi="Suzuki Pro" w:cstheme="minorHAnsi"/>
+          <w:rFonts w:ascii="SuzukiPRORegular" w:hAnsi="SuzukiPRORegular" w:cstheme="minorHAnsi"/>
+          <w:sz w:val="24"/>
+          <w:szCs w:val="24"/>
+        </w:rPr>
+        <w:t>A vizsgálat zárásaként írásos</w:t>
+      </w:r>
+      <w:r>
+        <w:rPr>
+          <w:rFonts w:ascii="SuzukiPRORegular" w:hAnsi="SuzukiPRORegular" w:cstheme="minorHAnsi"/>
           <w:spacing w:val="1"/>
           <w:sz w:val="24"/>
           <w:szCs w:val="24"/>
@@ -1578,99 +1144,11 @@
       </w:r>
       <w:r>
         <w:rPr>
-          <w:rFonts w:ascii="Suzuki Pro" w:hAnsi="Suzuki Pro" w:cstheme="minorHAnsi"/>
-          <w:sz w:val="24"/>
-          <w:szCs w:val="24"/>
-        </w:rPr>
-        <w:t>összefoglalót küldünk az Ön által megadott e-mail</w:t>
-      </w:r>
-      <w:r>
-        <w:rPr>
-          <w:rFonts w:ascii="Suzuki Pro" w:hAnsi="Suzuki Pro" w:cstheme="minorHAnsi"/>
-          <w:sz w:val="24"/>
-          <w:szCs w:val="24"/>
-        </w:rPr>
-        <w:t xml:space="preserve"> címre,</w:t>
-      </w:r>
-      <w:r>
-        <w:rPr>
-          <w:rFonts w:ascii="Suzuki Pro" w:hAnsi="Suzuki Pro" w:cstheme="minorHAnsi"/>
-          <w:sz w:val="24"/>
-          <w:szCs w:val="24"/>
-        </w:rPr>
-        <w:t xml:space="preserve"> </w:t>
-      </w:r>
-      <w:r>
-        <w:rPr>
-          <w:rFonts w:ascii="Suzuki Pro" w:hAnsi="Suzuki Pro" w:cstheme="minorHAnsi"/>
-          <w:sz w:val="24"/>
-          <w:szCs w:val="24"/>
-        </w:rPr>
-        <w:t>melyre a laboreredményeket</w:t>
-      </w:r>
-      <w:r>
-        <w:rPr>
-          <w:rFonts w:ascii="Suzuki Pro" w:hAnsi="Suzuki Pro" w:cstheme="minorHAnsi"/>
-          <w:sz w:val="24"/>
-          <w:szCs w:val="24"/>
-        </w:rPr>
-        <w:t xml:space="preserve"> is</w:t>
-      </w:r>
-      <w:r>
-        <w:rPr>
-          <w:rFonts w:ascii="Suzuki Pro" w:hAnsi="Suzuki Pro" w:cstheme="minorHAnsi"/>
-          <w:sz w:val="24"/>
-          <w:szCs w:val="24"/>
-        </w:rPr>
-        <w:t xml:space="preserve"> elküldjük Önnek</w:t>
-      </w:r>
-      <w:r>
-        <w:rPr>
-          <w:rFonts w:ascii="Suzuki Pro" w:hAnsi="Suzuki Pro" w:cstheme="minorHAnsi"/>
-          <w:sz w:val="24"/>
-          <w:szCs w:val="24"/>
-        </w:rPr>
-        <w:t>. A laboreredményeket 1-2 munkanapon belül, míg a</w:t>
-      </w:r>
-      <w:r>
-        <w:rPr>
-          <w:rFonts w:ascii="Suzuki Pro" w:hAnsi="Suzuki Pro" w:cstheme="minorHAnsi"/>
-          <w:sz w:val="24"/>
-          <w:szCs w:val="24"/>
-        </w:rPr>
-        <w:t>z</w:t>
-      </w:r>
-      <w:r>
-        <w:rPr>
-          <w:rFonts w:ascii="Suzuki Pro" w:hAnsi="Suzuki Pro" w:cstheme="minorHAnsi"/>
-          <w:sz w:val="24"/>
-          <w:szCs w:val="24"/>
-        </w:rPr>
-        <w:t xml:space="preserve"> összefoglaló véleményt 15 </w:t>
-      </w:r>
-      <w:r>
-        <w:rPr>
-          <w:rFonts w:ascii="Suzuki Pro" w:hAnsi="Suzuki Pro" w:cstheme="minorHAnsi"/>
-          <w:sz w:val="24"/>
-          <w:szCs w:val="24"/>
-        </w:rPr>
-        <w:t>munka</w:t>
-      </w:r>
-      <w:r>
-        <w:rPr>
-          <w:rFonts w:ascii="Suzuki Pro" w:hAnsi="Suzuki Pro" w:cstheme="minorHAnsi"/>
-          <w:sz w:val="24"/>
-          <w:szCs w:val="24"/>
-        </w:rPr>
-        <w:t>napon belül fogja megkapni</w:t>
-      </w:r>
-      <w:r>
-        <w:rPr>
-          <w:rFonts w:ascii="Suzuki Pro" w:hAnsi="Suzuki Pro" w:cstheme="minorHAnsi"/>
-          <w:sz w:val="24"/>
-          <w:szCs w:val="24"/>
-        </w:rPr>
-        <w:t>.</w:t>
+          <w:rFonts w:ascii="SuzukiPRORegular" w:hAnsi="SuzukiPRORegular" w:cstheme="minorHAnsi"/>
+          <w:sz w:val="24"/>
+          <w:szCs w:val="24"/>
+        </w:rPr>
+        <w:t>összefoglalót küldünk az Ön által megadott e-mail címre, melyre a laboreredményeket is elküldjük. A laboreredményeket 1-2 munkanapon belül, míg az összefoglaló vélemény 15 munkanapon belül fogja megkapni.</w:t>
       </w:r>
     </w:p>
     <w:p>
@@ -1679,14 +1157,14 @@
         <w:ind w:left="0"/>
         <w:jc w:val="both"/>
         <w:rPr>
-          <w:rFonts w:ascii="Suzuki Pro" w:hAnsi="Suzuki Pro" w:cstheme="minorHAnsi"/>
-          <w:sz w:val="24"/>
-          <w:szCs w:val="24"/>
-        </w:rPr>
-      </w:pPr>
-      <w:r>
-        <w:rPr>
-          <w:rFonts w:ascii="Suzuki Pro" w:hAnsi="Suzuki Pro" w:cstheme="minorHAnsi"/>
+          <w:rFonts w:ascii="SuzukiPRORegular" w:hAnsi="SuzukiPRORegular" w:cstheme="minorHAnsi"/>
+          <w:sz w:val="24"/>
+          <w:szCs w:val="24"/>
+        </w:rPr>
+      </w:pPr>
+      <w:r>
+        <w:rPr>
+          <w:rFonts w:ascii="SuzukiPRORegular" w:hAnsi="SuzukiPRORegular" w:cstheme="minorHAnsi"/>
           <w:sz w:val="24"/>
           <w:szCs w:val="24"/>
         </w:rPr>
@@ -1695,7 +1173,7 @@
       </w:r>
       <w:r>
         <w:rPr>
-          <w:rFonts w:ascii="Suzuki Pro" w:hAnsi="Suzuki Pro" w:cstheme="minorHAnsi"/>
+          <w:rFonts w:ascii="SuzukiPRORegular" w:hAnsi="SuzukiPRORegular" w:cstheme="minorHAnsi"/>
           <w:spacing w:val="-1"/>
           <w:sz w:val="24"/>
           <w:szCs w:val="24"/>
@@ -1704,7 +1182,7 @@
       </w:r>
       <w:r>
         <w:rPr>
-          <w:rFonts w:ascii="Suzuki Pro" w:hAnsi="Suzuki Pro" w:cstheme="minorHAnsi"/>
+          <w:rFonts w:ascii="SuzukiPRORegular" w:hAnsi="SuzukiPRORegular" w:cstheme="minorHAnsi"/>
           <w:sz w:val="24"/>
           <w:szCs w:val="24"/>
         </w:rPr>
@@ -1721,17 +1199,17 @@
         <w:tabs>
           <w:tab w:val="left" w:pos="720"/>
         </w:tabs>
-        <w:spacing w:before="145" w:after="120"/>
+        <w:spacing w:after="120"/>
         <w:ind w:left="714" w:right="133" w:hanging="357"/>
         <w:rPr>
-          <w:rFonts w:ascii="Suzuki Pro" w:hAnsi="Suzuki Pro" w:cstheme="minorHAnsi"/>
-          <w:sz w:val="24"/>
-          <w:szCs w:val="24"/>
-        </w:rPr>
-      </w:pPr>
-      <w:r>
-        <w:rPr>
-          <w:rFonts w:ascii="Suzuki Pro" w:hAnsi="Suzuki Pro" w:cstheme="minorHAnsi"/>
+          <w:rFonts w:ascii="SuzukiPRORegular" w:hAnsi="SuzukiPRORegular" w:cstheme="minorHAnsi"/>
+          <w:sz w:val="24"/>
+          <w:szCs w:val="24"/>
+        </w:rPr>
+      </w:pPr>
+      <w:r>
+        <w:rPr>
+          <w:rFonts w:ascii="SuzukiPRORegular" w:hAnsi="SuzukiPRORegular" w:cstheme="minorHAnsi"/>
           <w:sz w:val="24"/>
           <w:szCs w:val="24"/>
         </w:rPr>
@@ -1739,41 +1217,58 @@
       </w:r>
       <w:r>
         <w:rPr>
-          <w:rFonts w:ascii="Suzuki Pro" w:hAnsi="Suzuki Pro" w:cstheme="minorHAnsi"/>
+          <w:rFonts w:ascii="SuzukiPRORegular" w:hAnsi="SuzukiPRORegular" w:cstheme="minorHAnsi"/>
           <w:spacing w:val="1"/>
           <w:sz w:val="24"/>
           <w:szCs w:val="24"/>
         </w:rPr>
+        <w:t xml:space="preserve"> a vizsgálatokra </w:t>
+      </w:r>
+      <w:r>
+        <w:rPr>
+          <w:rFonts w:ascii="SuzukiPRORegular" w:hAnsi="SuzukiPRORegular" w:cstheme="minorHAnsi"/>
+          <w:sz w:val="24"/>
+          <w:szCs w:val="24"/>
+        </w:rPr>
+        <w:t>éhgyomorral</w:t>
+      </w:r>
+      <w:r>
+        <w:rPr>
+          <w:rFonts w:ascii="SuzukiPRORegular" w:hAnsi="SuzukiPRORegular" w:cstheme="minorHAnsi"/>
+          <w:spacing w:val="1"/>
+          <w:sz w:val="24"/>
+          <w:szCs w:val="24"/>
+        </w:rPr>
         <w:t xml:space="preserve"> </w:t>
       </w:r>
       <w:r>
         <w:rPr>
-          <w:rFonts w:ascii="Suzuki Pro" w:hAnsi="Suzuki Pro" w:cstheme="minorHAnsi"/>
+          <w:rFonts w:ascii="SuzukiPRORegular" w:hAnsi="SuzukiPRORegular" w:cstheme="minorHAnsi"/>
+          <w:sz w:val="24"/>
+          <w:szCs w:val="24"/>
+        </w:rPr>
+        <w:t>érkezzen.</w:t>
+      </w:r>
+      <w:r>
+        <w:rPr>
+          <w:rFonts w:ascii="SuzukiPRORegular" w:hAnsi="SuzukiPRORegular" w:cstheme="minorHAnsi"/>
           <w:spacing w:val="1"/>
           <w:sz w:val="24"/>
           <w:szCs w:val="24"/>
         </w:rPr>
-        <w:t xml:space="preserve">a vizsgálatokra </w:t>
-      </w:r>
-      <w:r>
-        <w:rPr>
-          <w:rFonts w:ascii="Suzuki Pro" w:hAnsi="Suzuki Pro" w:cstheme="minorHAnsi"/>
-          <w:sz w:val="24"/>
-          <w:szCs w:val="24"/>
-        </w:rPr>
-        <w:t>éhgyomorra</w:t>
-      </w:r>
-      <w:r>
-        <w:rPr>
-          <w:rFonts w:ascii="Suzuki Pro" w:hAnsi="Suzuki Pro" w:cstheme="minorHAnsi"/>
-          <w:sz w:val="24"/>
-          <w:szCs w:val="24"/>
-        </w:rPr>
-        <w:t>l</w:t>
-      </w:r>
-      <w:r>
-        <w:rPr>
-          <w:rFonts w:ascii="Suzuki Pro" w:hAnsi="Suzuki Pro" w:cstheme="minorHAnsi"/>
+        <w:t xml:space="preserve"> </w:t>
+      </w:r>
+      <w:r>
+        <w:rPr>
+          <w:rFonts w:ascii="SuzukiPRORegular" w:hAnsi="SuzukiPRORegular" w:cstheme="minorHAnsi"/>
+          <w:sz w:val="24"/>
+          <w:szCs w:val="24"/>
+        </w:rPr>
+        <w:t>Ez különösen fontos a labor, illetve hasi-és kismedencei ultrahang vizsgálat esetén. Ezen vizsgálatok előtt fogyasszon</w:t>
+      </w:r>
+      <w:r>
+        <w:rPr>
+          <w:rFonts w:ascii="SuzukiPRORegular" w:hAnsi="SuzukiPRORegular" w:cstheme="minorHAnsi"/>
           <w:spacing w:val="1"/>
           <w:sz w:val="24"/>
           <w:szCs w:val="24"/>
@@ -1782,40 +1277,42 @@
       </w:r>
       <w:r>
         <w:rPr>
-          <w:rFonts w:ascii="Suzuki Pro" w:hAnsi="Suzuki Pro" w:cstheme="minorHAnsi"/>
-          <w:sz w:val="24"/>
-          <w:szCs w:val="24"/>
-        </w:rPr>
-        <w:t>érkezzen.</w:t>
-      </w:r>
-      <w:r>
-        <w:rPr>
-          <w:rFonts w:ascii="Suzuki Pro" w:hAnsi="Suzuki Pro" w:cstheme="minorHAnsi"/>
+          <w:rFonts w:ascii="SuzukiPRORegular" w:hAnsi="SuzukiPRORegular" w:cstheme="minorHAnsi"/>
+          <w:sz w:val="24"/>
+          <w:szCs w:val="24"/>
+        </w:rPr>
+        <w:t>bőséggel</w:t>
+      </w:r>
+      <w:r>
+        <w:rPr>
+          <w:rFonts w:ascii="SuzukiPRORegular" w:hAnsi="SuzukiPRORegular" w:cstheme="minorHAnsi"/>
           <w:spacing w:val="1"/>
           <w:sz w:val="24"/>
           <w:szCs w:val="24"/>
         </w:rPr>
+        <w:t xml:space="preserve"> cukormentes folyadékot (víz, szénsavmentes ásványvíz). A</w:t>
+      </w:r>
+      <w:r>
+        <w:rPr>
+          <w:rFonts w:ascii="SuzukiPRORegular" w:hAnsi="SuzukiPRORegular" w:cstheme="minorHAnsi"/>
+          <w:spacing w:val="-9"/>
+          <w:sz w:val="24"/>
+          <w:szCs w:val="24"/>
+        </w:rPr>
         <w:t xml:space="preserve"> </w:t>
       </w:r>
       <w:r>
         <w:rPr>
-          <w:rFonts w:ascii="Suzuki Pro" w:hAnsi="Suzuki Pro" w:cstheme="minorHAnsi"/>
-          <w:sz w:val="24"/>
-          <w:szCs w:val="24"/>
-        </w:rPr>
-        <w:t>Ez különösen fontos a labor</w:t>
-      </w:r>
-      <w:r>
-        <w:rPr>
-          <w:rFonts w:ascii="Suzuki Pro" w:hAnsi="Suzuki Pro" w:cstheme="minorHAnsi"/>
-          <w:sz w:val="24"/>
-          <w:szCs w:val="24"/>
-        </w:rPr>
-        <w:t>,</w:t>
-      </w:r>
-      <w:r>
-        <w:rPr>
-          <w:rFonts w:ascii="Suzuki Pro" w:hAnsi="Suzuki Pro" w:cstheme="minorHAnsi"/>
+          <w:rFonts w:ascii="SuzukiPRORegular" w:hAnsi="SuzukiPRORegular" w:cstheme="minorHAnsi"/>
+          <w:sz w:val="24"/>
+          <w:szCs w:val="24"/>
+        </w:rPr>
+        <w:t>hasi</w:t>
+      </w:r>
+      <w:r>
+        <w:rPr>
+          <w:rFonts w:ascii="SuzukiPRORegular" w:hAnsi="SuzukiPRORegular" w:cstheme="minorHAnsi"/>
+          <w:spacing w:val="-9"/>
           <w:sz w:val="24"/>
           <w:szCs w:val="24"/>
         </w:rPr>
@@ -1823,48 +1320,16 @@
       </w:r>
       <w:r>
         <w:rPr>
-          <w:rFonts w:ascii="Suzuki Pro" w:hAnsi="Suzuki Pro" w:cstheme="minorHAnsi"/>
-          <w:sz w:val="24"/>
-          <w:szCs w:val="24"/>
-        </w:rPr>
-        <w:t>illetve</w:t>
-      </w:r>
-      <w:r>
-        <w:rPr>
-          <w:rFonts w:ascii="Suzuki Pro" w:hAnsi="Suzuki Pro" w:cstheme="minorHAnsi"/>
-          <w:sz w:val="24"/>
-          <w:szCs w:val="24"/>
-        </w:rPr>
-        <w:t xml:space="preserve"> hasi-és kismedencei ultrahang </w:t>
-      </w:r>
-      <w:r>
-        <w:rPr>
-          <w:rFonts w:ascii="Suzuki Pro" w:hAnsi="Suzuki Pro" w:cstheme="minorHAnsi"/>
-          <w:sz w:val="24"/>
-          <w:szCs w:val="24"/>
-        </w:rPr>
-        <w:t xml:space="preserve">vizsgálat </w:t>
-      </w:r>
-      <w:r>
-        <w:rPr>
-          <w:rFonts w:ascii="Suzuki Pro" w:hAnsi="Suzuki Pro" w:cstheme="minorHAnsi"/>
-          <w:sz w:val="24"/>
-          <w:szCs w:val="24"/>
-        </w:rPr>
-        <w:t>esetén</w:t>
-      </w:r>
-      <w:r>
-        <w:rPr>
-          <w:rFonts w:ascii="Suzuki Pro" w:hAnsi="Suzuki Pro" w:cstheme="minorHAnsi"/>
-          <w:sz w:val="24"/>
-          <w:szCs w:val="24"/>
-        </w:rPr>
-        <w:t>. Ezen vizsgálatok előtt fogyasszon</w:t>
-      </w:r>
-      <w:r>
-        <w:rPr>
-          <w:rFonts w:ascii="Suzuki Pro" w:hAnsi="Suzuki Pro" w:cstheme="minorHAnsi"/>
-          <w:spacing w:val="1"/>
+          <w:rFonts w:ascii="SuzukiPRORegular" w:hAnsi="SuzukiPRORegular" w:cstheme="minorHAnsi"/>
+          <w:sz w:val="24"/>
+          <w:szCs w:val="24"/>
+        </w:rPr>
+        <w:t>ultrahang</w:t>
+      </w:r>
+      <w:r>
+        <w:rPr>
+          <w:rFonts w:ascii="SuzukiPRORegular" w:hAnsi="SuzukiPRORegular" w:cstheme="minorHAnsi"/>
+          <w:spacing w:val="-7"/>
           <w:sz w:val="24"/>
           <w:szCs w:val="24"/>
         </w:rPr>
@@ -1872,16 +1337,16 @@
       </w:r>
       <w:r>
         <w:rPr>
-          <w:rFonts w:ascii="Suzuki Pro" w:hAnsi="Suzuki Pro" w:cstheme="minorHAnsi"/>
-          <w:sz w:val="24"/>
-          <w:szCs w:val="24"/>
-        </w:rPr>
-        <w:t>bőséggel</w:t>
-      </w:r>
-      <w:r>
-        <w:rPr>
-          <w:rFonts w:ascii="Suzuki Pro" w:hAnsi="Suzuki Pro" w:cstheme="minorHAnsi"/>
-          <w:spacing w:val="1"/>
+          <w:rFonts w:ascii="SuzukiPRORegular" w:hAnsi="SuzukiPRORegular" w:cstheme="minorHAnsi"/>
+          <w:sz w:val="24"/>
+          <w:szCs w:val="24"/>
+        </w:rPr>
+        <w:t>elvégzéséhez</w:t>
+      </w:r>
+      <w:r>
+        <w:rPr>
+          <w:rFonts w:ascii="SuzukiPRORegular" w:hAnsi="SuzukiPRORegular" w:cstheme="minorHAnsi"/>
+          <w:spacing w:val="-9"/>
           <w:sz w:val="24"/>
           <w:szCs w:val="24"/>
         </w:rPr>
@@ -1889,15 +1354,32 @@
       </w:r>
       <w:r>
         <w:rPr>
-          <w:rFonts w:ascii="Suzuki Pro" w:hAnsi="Suzuki Pro" w:cstheme="minorHAnsi"/>
-          <w:sz w:val="24"/>
-          <w:szCs w:val="24"/>
-        </w:rPr>
-        <w:t>szénsavmentes</w:t>
-      </w:r>
-      <w:r>
-        <w:rPr>
-          <w:rFonts w:ascii="Suzuki Pro" w:hAnsi="Suzuki Pro" w:cstheme="minorHAnsi"/>
+          <w:rFonts w:ascii="SuzukiPRORegular" w:hAnsi="SuzukiPRORegular" w:cstheme="minorHAnsi"/>
+          <w:sz w:val="24"/>
+          <w:szCs w:val="24"/>
+        </w:rPr>
+        <w:t>telt</w:t>
+      </w:r>
+      <w:r>
+        <w:rPr>
+          <w:rFonts w:ascii="SuzukiPRORegular" w:hAnsi="SuzukiPRORegular" w:cstheme="minorHAnsi"/>
+          <w:spacing w:val="-7"/>
+          <w:sz w:val="24"/>
+          <w:szCs w:val="24"/>
+        </w:rPr>
+        <w:t xml:space="preserve"> </w:t>
+      </w:r>
+      <w:r>
+        <w:rPr>
+          <w:rFonts w:ascii="SuzukiPRORegular" w:hAnsi="SuzukiPRORegular" w:cstheme="minorHAnsi"/>
+          <w:sz w:val="24"/>
+          <w:szCs w:val="24"/>
+        </w:rPr>
+        <w:t>hólyag</w:t>
+      </w:r>
+      <w:r>
+        <w:rPr>
+          <w:rFonts w:ascii="SuzukiPRORegular" w:hAnsi="SuzukiPRORegular" w:cstheme="minorHAnsi"/>
           <w:spacing w:val="-9"/>
           <w:sz w:val="24"/>
           <w:szCs w:val="24"/>
@@ -1906,126 +1388,7 @@
       </w:r>
       <w:r>
         <w:rPr>
-          <w:rFonts w:ascii="Suzuki Pro" w:hAnsi="Suzuki Pro" w:cstheme="minorHAnsi"/>
-          <w:sz w:val="24"/>
-          <w:szCs w:val="24"/>
-        </w:rPr>
-        <w:t>ásványvizet,</w:t>
-      </w:r>
-      <w:r>
-        <w:rPr>
-          <w:rFonts w:ascii="Suzuki Pro" w:hAnsi="Suzuki Pro" w:cstheme="minorHAnsi"/>
-          <w:spacing w:val="-7"/>
-          <w:sz w:val="24"/>
-          <w:szCs w:val="24"/>
-        </w:rPr>
-        <w:t xml:space="preserve"> </w:t>
-      </w:r>
-      <w:r>
-        <w:rPr>
-          <w:rFonts w:ascii="Suzuki Pro" w:hAnsi="Suzuki Pro" w:cstheme="minorHAnsi"/>
-          <w:sz w:val="24"/>
-          <w:szCs w:val="24"/>
-        </w:rPr>
-        <w:t>a</w:t>
-      </w:r>
-      <w:r>
-        <w:rPr>
-          <w:rFonts w:ascii="Suzuki Pro" w:hAnsi="Suzuki Pro" w:cstheme="minorHAnsi"/>
-          <w:spacing w:val="-9"/>
-          <w:sz w:val="24"/>
-          <w:szCs w:val="24"/>
-        </w:rPr>
-        <w:t xml:space="preserve"> </w:t>
-      </w:r>
-      <w:r>
-        <w:rPr>
-          <w:rFonts w:ascii="Suzuki Pro" w:hAnsi="Suzuki Pro" w:cstheme="minorHAnsi"/>
-          <w:sz w:val="24"/>
-          <w:szCs w:val="24"/>
-        </w:rPr>
-        <w:t>hasi</w:t>
-      </w:r>
-      <w:r>
-        <w:rPr>
-          <w:rFonts w:ascii="Suzuki Pro" w:hAnsi="Suzuki Pro" w:cstheme="minorHAnsi"/>
-          <w:spacing w:val="-9"/>
-          <w:sz w:val="24"/>
-          <w:szCs w:val="24"/>
-        </w:rPr>
-        <w:t xml:space="preserve"> </w:t>
-      </w:r>
-      <w:r>
-        <w:rPr>
-          <w:rFonts w:ascii="Suzuki Pro" w:hAnsi="Suzuki Pro" w:cstheme="minorHAnsi"/>
-          <w:sz w:val="24"/>
-          <w:szCs w:val="24"/>
-        </w:rPr>
-        <w:t>ultrahang</w:t>
-      </w:r>
-      <w:r>
-        <w:rPr>
-          <w:rFonts w:ascii="Suzuki Pro" w:hAnsi="Suzuki Pro" w:cstheme="minorHAnsi"/>
-          <w:spacing w:val="-7"/>
-          <w:sz w:val="24"/>
-          <w:szCs w:val="24"/>
-        </w:rPr>
-        <w:t xml:space="preserve"> </w:t>
-      </w:r>
-      <w:r>
-        <w:rPr>
-          <w:rFonts w:ascii="Suzuki Pro" w:hAnsi="Suzuki Pro" w:cstheme="minorHAnsi"/>
-          <w:sz w:val="24"/>
-          <w:szCs w:val="24"/>
-        </w:rPr>
-        <w:t>elvégzéséhez</w:t>
-      </w:r>
-      <w:r>
-        <w:rPr>
-          <w:rFonts w:ascii="Suzuki Pro" w:hAnsi="Suzuki Pro" w:cstheme="minorHAnsi"/>
-          <w:spacing w:val="-9"/>
-          <w:sz w:val="24"/>
-          <w:szCs w:val="24"/>
-        </w:rPr>
-        <w:t xml:space="preserve"> </w:t>
-      </w:r>
-      <w:r>
-        <w:rPr>
-          <w:rFonts w:ascii="Suzuki Pro" w:hAnsi="Suzuki Pro" w:cstheme="minorHAnsi"/>
-          <w:sz w:val="24"/>
-          <w:szCs w:val="24"/>
-        </w:rPr>
-        <w:t>telt</w:t>
-      </w:r>
-      <w:r>
-        <w:rPr>
-          <w:rFonts w:ascii="Suzuki Pro" w:hAnsi="Suzuki Pro" w:cstheme="minorHAnsi"/>
-          <w:spacing w:val="-7"/>
-          <w:sz w:val="24"/>
-          <w:szCs w:val="24"/>
-        </w:rPr>
-        <w:t xml:space="preserve"> </w:t>
-      </w:r>
-      <w:r>
-        <w:rPr>
-          <w:rFonts w:ascii="Suzuki Pro" w:hAnsi="Suzuki Pro" w:cstheme="minorHAnsi"/>
-          <w:sz w:val="24"/>
-          <w:szCs w:val="24"/>
-        </w:rPr>
-        <w:t>hólyag</w:t>
-      </w:r>
-      <w:r>
-        <w:rPr>
-          <w:rFonts w:ascii="Suzuki Pro" w:hAnsi="Suzuki Pro" w:cstheme="minorHAnsi"/>
-          <w:spacing w:val="-9"/>
-          <w:sz w:val="24"/>
-          <w:szCs w:val="24"/>
-        </w:rPr>
-        <w:t xml:space="preserve"> </w:t>
-      </w:r>
-      <w:r>
-        <w:rPr>
-          <w:rFonts w:ascii="Suzuki Pro" w:hAnsi="Suzuki Pro" w:cstheme="minorHAnsi"/>
+          <w:rFonts w:ascii="SuzukiPRORegular" w:hAnsi="SuzukiPRORegular" w:cstheme="minorHAnsi"/>
           <w:sz w:val="24"/>
           <w:szCs w:val="24"/>
         </w:rPr>
@@ -2045,56 +1408,48 @@
         <w:spacing w:after="120"/>
         <w:ind w:left="714" w:hanging="357"/>
         <w:rPr>
-          <w:rFonts w:ascii="Suzuki Pro" w:hAnsi="Suzuki Pro" w:cstheme="minorHAnsi"/>
-          <w:sz w:val="24"/>
-          <w:szCs w:val="24"/>
-        </w:rPr>
-      </w:pPr>
-      <w:r>
-        <w:rPr>
-          <w:rFonts w:ascii="Suzuki Pro" w:hAnsi="Suzuki Pro" w:cstheme="minorHAnsi"/>
-          <w:sz w:val="24"/>
-          <w:szCs w:val="24"/>
-        </w:rPr>
-        <w:t>R</w:t>
-      </w:r>
-      <w:r>
-        <w:rPr>
-          <w:rFonts w:ascii="Suzuki Pro" w:hAnsi="Suzuki Pro" w:cstheme="minorHAnsi"/>
-          <w:sz w:val="24"/>
-          <w:szCs w:val="24"/>
-        </w:rPr>
-        <w:t>endszeresen</w:t>
-      </w:r>
-      <w:r>
-        <w:rPr>
-          <w:rFonts w:ascii="Suzuki Pro" w:hAnsi="Suzuki Pro" w:cstheme="minorHAnsi"/>
+          <w:rFonts w:ascii="SuzukiPRORegular" w:hAnsi="SuzukiPRORegular" w:cstheme="minorHAnsi"/>
+          <w:sz w:val="24"/>
+          <w:szCs w:val="24"/>
+        </w:rPr>
+      </w:pPr>
+      <w:r>
+        <w:rPr>
+          <w:rFonts w:ascii="SuzukiPRORegular" w:hAnsi="SuzukiPRORegular" w:cstheme="minorHAnsi"/>
+          <w:sz w:val="24"/>
+          <w:szCs w:val="24"/>
+        </w:rPr>
+        <w:t xml:space="preserve">Rendszeresen </w:t>
+      </w:r>
+      <w:r>
+        <w:rPr>
+          <w:rFonts w:ascii="SuzukiPRORegular" w:hAnsi="SuzukiPRORegular" w:cstheme="minorHAnsi"/>
           <w:spacing w:val="2"/>
           <w:sz w:val="24"/>
           <w:szCs w:val="24"/>
         </w:rPr>
+        <w:t xml:space="preserve">szedett </w:t>
+      </w:r>
+      <w:r>
+        <w:rPr>
+          <w:rFonts w:ascii="SuzukiPRORegular" w:hAnsi="SuzukiPRORegular" w:cstheme="minorHAnsi"/>
+          <w:sz w:val="24"/>
+          <w:szCs w:val="24"/>
+        </w:rPr>
+        <w:t>gyógyszereit a</w:t>
+      </w:r>
+      <w:r>
+        <w:rPr>
+          <w:rFonts w:ascii="SuzukiPRORegular" w:hAnsi="SuzukiPRORegular" w:cstheme="minorHAnsi"/>
+          <w:spacing w:val="-4"/>
+          <w:sz w:val="24"/>
+          <w:szCs w:val="24"/>
+        </w:rPr>
         <w:t xml:space="preserve"> </w:t>
       </w:r>
       <w:r>
         <w:rPr>
-          <w:rFonts w:ascii="Suzuki Pro" w:hAnsi="Suzuki Pro" w:cstheme="minorHAnsi"/>
-          <w:sz w:val="24"/>
-          <w:szCs w:val="24"/>
-        </w:rPr>
-        <w:t>gyógyszereit a</w:t>
-      </w:r>
-      <w:r>
-        <w:rPr>
-          <w:rFonts w:ascii="Suzuki Pro" w:hAnsi="Suzuki Pro" w:cstheme="minorHAnsi"/>
-          <w:spacing w:val="-4"/>
-          <w:sz w:val="24"/>
-          <w:szCs w:val="24"/>
-        </w:rPr>
-        <w:t xml:space="preserve"> </w:t>
-      </w:r>
-      <w:r>
-        <w:rPr>
-          <w:rFonts w:ascii="Suzuki Pro" w:hAnsi="Suzuki Pro" w:cstheme="minorHAnsi"/>
+          <w:rFonts w:ascii="SuzukiPRORegular" w:hAnsi="SuzukiPRORegular" w:cstheme="minorHAnsi"/>
           <w:bCs/>
           <w:sz w:val="24"/>
           <w:szCs w:val="24"/>
@@ -2103,45 +1458,26 @@
       </w:r>
       <w:r>
         <w:rPr>
-          <w:rFonts w:ascii="Suzuki Pro" w:hAnsi="Suzuki Pro" w:cstheme="minorHAnsi"/>
+          <w:rFonts w:ascii="SuzukiPRORegular" w:hAnsi="SuzukiPRORegular" w:cstheme="minorHAnsi"/>
           <w:bCs/>
           <w:spacing w:val="-3"/>
           <w:sz w:val="24"/>
           <w:szCs w:val="24"/>
         </w:rPr>
-        <w:t xml:space="preserve"> </w:t>
-      </w:r>
-      <w:r>
-        <w:rPr>
-          <w:rFonts w:ascii="Suzuki Pro" w:hAnsi="Suzuki Pro" w:cstheme="minorHAnsi"/>
+        <w:t xml:space="preserve"> módon </w:t>
+      </w:r>
+      <w:r>
+        <w:rPr>
+          <w:rFonts w:ascii="SuzukiPRORegular" w:hAnsi="SuzukiPRORegular" w:cstheme="minorHAnsi"/>
           <w:bCs/>
           <w:sz w:val="24"/>
           <w:szCs w:val="24"/>
         </w:rPr>
-        <w:t>módon</w:t>
-      </w:r>
-      <w:r>
-        <w:rPr>
-          <w:rFonts w:ascii="Suzuki Pro" w:hAnsi="Suzuki Pro" w:cstheme="minorHAnsi"/>
-          <w:bCs/>
-          <w:spacing w:val="-3"/>
-          <w:sz w:val="24"/>
-          <w:szCs w:val="24"/>
-        </w:rPr>
-        <w:t xml:space="preserve"> </w:t>
-      </w:r>
-      <w:r>
-        <w:rPr>
-          <w:rFonts w:ascii="Suzuki Pro" w:hAnsi="Suzuki Pro" w:cstheme="minorHAnsi"/>
-          <w:bCs/>
-          <w:sz w:val="24"/>
-          <w:szCs w:val="24"/>
-        </w:rPr>
         <w:t>vegye</w:t>
       </w:r>
       <w:r>
         <w:rPr>
-          <w:rFonts w:ascii="Suzuki Pro" w:hAnsi="Suzuki Pro" w:cstheme="minorHAnsi"/>
+          <w:rFonts w:ascii="SuzukiPRORegular" w:hAnsi="SuzukiPRORegular" w:cstheme="minorHAnsi"/>
           <w:bCs/>
           <w:spacing w:val="-1"/>
           <w:sz w:val="24"/>
@@ -2151,7 +1487,7 @@
       </w:r>
       <w:r>
         <w:rPr>
-          <w:rFonts w:ascii="Suzuki Pro" w:hAnsi="Suzuki Pro" w:cstheme="minorHAnsi"/>
+          <w:rFonts w:ascii="SuzukiPRORegular" w:hAnsi="SuzukiPRORegular" w:cstheme="minorHAnsi"/>
           <w:bCs/>
           <w:sz w:val="24"/>
           <w:szCs w:val="24"/>
@@ -2160,7 +1496,7 @@
       </w:r>
       <w:r>
         <w:rPr>
-          <w:rFonts w:ascii="Suzuki Pro" w:hAnsi="Suzuki Pro" w:cstheme="minorHAnsi"/>
+          <w:rFonts w:ascii="SuzukiPRORegular" w:hAnsi="SuzukiPRORegular" w:cstheme="minorHAnsi"/>
           <w:sz w:val="24"/>
           <w:szCs w:val="24"/>
         </w:rPr>
@@ -2177,140 +1513,43 @@
         <w:tabs>
           <w:tab w:val="left" w:pos="856"/>
         </w:tabs>
-        <w:spacing w:before="9" w:after="120"/>
+        <w:spacing w:after="120"/>
         <w:ind w:left="714" w:right="136" w:hanging="357"/>
         <w:rPr>
-          <w:rFonts w:ascii="Suzuki Pro" w:hAnsi="Suzuki Pro" w:cstheme="minorHAnsi"/>
-          <w:sz w:val="24"/>
-          <w:szCs w:val="24"/>
-        </w:rPr>
-      </w:pPr>
-      <w:r>
-        <w:rPr>
-          <w:rFonts w:ascii="Suzuki Pro" w:hAnsi="Suzuki Pro" w:cstheme="minorHAnsi"/>
-          <w:sz w:val="24"/>
-          <w:szCs w:val="24"/>
-        </w:rPr>
-        <w:t xml:space="preserve">Laborcsomagja </w:t>
-      </w:r>
-      <w:r>
-        <w:rPr>
-          <w:rFonts w:ascii="Suzuki Pro" w:hAnsi="Suzuki Pro" w:cstheme="minorHAnsi"/>
-          <w:sz w:val="24"/>
-          <w:szCs w:val="24"/>
-        </w:rPr>
-        <w:t>vizeletvizsgálatot</w:t>
-      </w:r>
-      <w:r>
-        <w:rPr>
-          <w:rFonts w:ascii="Suzuki Pro" w:hAnsi="Suzuki Pro" w:cstheme="minorHAnsi"/>
-          <w:sz w:val="24"/>
-          <w:szCs w:val="24"/>
-        </w:rPr>
-        <w:t xml:space="preserve"> is tartalmaz</w:t>
-      </w:r>
-      <w:r>
-        <w:rPr>
-          <w:rFonts w:ascii="Suzuki Pro" w:hAnsi="Suzuki Pro" w:cstheme="minorHAnsi"/>
-          <w:sz w:val="24"/>
-          <w:szCs w:val="24"/>
-        </w:rPr>
-        <w:t>. A minta</w:t>
-      </w:r>
-      <w:r>
-        <w:rPr>
-          <w:rFonts w:ascii="Suzuki Pro" w:hAnsi="Suzuki Pro" w:cstheme="minorHAnsi"/>
-          <w:sz w:val="24"/>
-          <w:szCs w:val="24"/>
-        </w:rPr>
-        <w:t xml:space="preserve"> leadása </w:t>
-      </w:r>
-      <w:r>
-        <w:rPr>
-          <w:rFonts w:ascii="Suzuki Pro" w:hAnsi="Suzuki Pro" w:cstheme="minorHAnsi"/>
-          <w:sz w:val="24"/>
-          <w:szCs w:val="24"/>
-        </w:rPr>
-        <w:t xml:space="preserve">csak az ultrahang vizsgálatok </w:t>
-      </w:r>
-      <w:r>
-        <w:rPr>
-          <w:rFonts w:ascii="Suzuki Pro" w:hAnsi="Suzuki Pro" w:cstheme="minorHAnsi"/>
-          <w:sz w:val="24"/>
-          <w:szCs w:val="24"/>
-        </w:rPr>
-        <w:t>után lehetséges.  Az</w:t>
-      </w:r>
-      <w:r>
-        <w:rPr>
-          <w:rFonts w:ascii="Suzuki Pro" w:hAnsi="Suzuki Pro" w:cstheme="minorHAnsi"/>
-          <w:sz w:val="24"/>
-          <w:szCs w:val="24"/>
-        </w:rPr>
-        <w:t xml:space="preserve"> ehhez szükséges </w:t>
-      </w:r>
-      <w:r>
-        <w:rPr>
-          <w:rFonts w:ascii="Suzuki Pro" w:hAnsi="Suzuki Pro" w:cstheme="minorHAnsi"/>
-          <w:sz w:val="24"/>
-          <w:szCs w:val="24"/>
-        </w:rPr>
-        <w:t xml:space="preserve">eszközöket laboros </w:t>
-      </w:r>
-      <w:proofErr w:type="gramStart"/>
-      <w:r>
-        <w:rPr>
-          <w:rFonts w:ascii="Suzuki Pro" w:hAnsi="Suzuki Pro" w:cstheme="minorHAnsi"/>
-          <w:sz w:val="24"/>
-          <w:szCs w:val="24"/>
-        </w:rPr>
-        <w:t>kolléga</w:t>
-      </w:r>
-      <w:proofErr w:type="gramEnd"/>
-      <w:r>
-        <w:rPr>
-          <w:rFonts w:ascii="Suzuki Pro" w:hAnsi="Suzuki Pro" w:cstheme="minorHAnsi"/>
-          <w:sz w:val="24"/>
-          <w:szCs w:val="24"/>
-        </w:rPr>
-        <w:t>nőink</w:t>
-      </w:r>
-      <w:r>
-        <w:rPr>
-          <w:rFonts w:ascii="Suzuki Pro" w:hAnsi="Suzuki Pro" w:cstheme="minorHAnsi"/>
-          <w:sz w:val="24"/>
-          <w:szCs w:val="24"/>
-        </w:rPr>
-        <w:t xml:space="preserve"> a vérvételt követően</w:t>
-      </w:r>
-      <w:r>
-        <w:rPr>
-          <w:rFonts w:ascii="Suzuki Pro" w:hAnsi="Suzuki Pro" w:cstheme="minorHAnsi"/>
-          <w:sz w:val="24"/>
-          <w:szCs w:val="24"/>
-        </w:rPr>
-        <w:t xml:space="preserve"> adják át Önnek</w:t>
-      </w:r>
-      <w:r>
-        <w:rPr>
-          <w:rFonts w:ascii="Suzuki Pro" w:hAnsi="Suzuki Pro" w:cstheme="minorHAnsi"/>
-          <w:sz w:val="24"/>
-          <w:szCs w:val="24"/>
-        </w:rPr>
-        <w:t xml:space="preserve">. </w:t>
-      </w:r>
-      <w:r>
-        <w:rPr>
-          <w:rFonts w:ascii="Suzuki Pro" w:hAnsi="Suzuki Pro" w:cstheme="minorHAnsi"/>
-          <w:sz w:val="24"/>
-          <w:szCs w:val="24"/>
-        </w:rPr>
-        <w:t xml:space="preserve">Vizeletes csövet ezen felül </w:t>
+          <w:rFonts w:ascii="SuzukiPRORegular" w:hAnsi="SuzukiPRORegular" w:cstheme="minorHAnsi"/>
+          <w:sz w:val="24"/>
+          <w:szCs w:val="24"/>
+        </w:rPr>
+      </w:pPr>
+      <w:r>
+        <w:rPr>
+          <w:rFonts w:ascii="SuzukiPRORegular" w:hAnsi="SuzukiPRORegular" w:cstheme="minorHAnsi"/>
+          <w:sz w:val="24"/>
+          <w:szCs w:val="24"/>
+        </w:rPr>
+        <w:t>Laborcsomagja vizeletvizsgálatot is tartalmaz. A minta leadása csak az ultrahang vizsgálatok után</w:t>
+      </w:r>
+      <w:r>
+        <w:rPr>
+          <w:rFonts w:ascii="SuzukiPRORegular" w:hAnsi="SuzukiPRORegular" w:cstheme="minorHAnsi"/>
+          <w:spacing w:val="1"/>
+          <w:sz w:val="24"/>
+          <w:szCs w:val="24"/>
+        </w:rPr>
+        <w:t xml:space="preserve"> </w:t>
+      </w:r>
+      <w:r>
+        <w:rPr>
+          <w:rFonts w:ascii="SuzukiPRORegular" w:hAnsi="SuzukiPRORegular" w:cstheme="minorHAnsi"/>
+          <w:sz w:val="24"/>
+          <w:szCs w:val="24"/>
+        </w:rPr>
+        <w:t xml:space="preserve">lehetséges. Az ehhez szükséges eszközöket laboros kolléganőink a vérvételt követően adják át Önnek. Vizeletes csövet e mellett </w:t>
       </w:r>
       <w:proofErr w:type="spellStart"/>
       <w:r>
         <w:rPr>
-          <w:rFonts w:ascii="Suzuki Pro" w:hAnsi="Suzuki Pro" w:cstheme="minorHAnsi"/>
+          <w:rFonts w:ascii="SuzukiPRORegular" w:hAnsi="SuzukiPRORegular" w:cstheme="minorHAnsi"/>
           <w:sz w:val="24"/>
           <w:szCs w:val="24"/>
         </w:rPr>
@@ -2319,29 +1558,35 @@
       <w:proofErr w:type="spellEnd"/>
       <w:r>
         <w:rPr>
-          <w:rFonts w:ascii="Suzuki Pro" w:hAnsi="Suzuki Pro" w:cstheme="minorHAnsi"/>
-          <w:sz w:val="24"/>
-          <w:szCs w:val="24"/>
-        </w:rPr>
-        <w:t xml:space="preserve"> Andrea </w:t>
-      </w:r>
-      <w:proofErr w:type="gramStart"/>
-      <w:r>
-        <w:rPr>
-          <w:rFonts w:ascii="Suzuki Pro" w:hAnsi="Suzuki Pro" w:cstheme="minorHAnsi"/>
-          <w:sz w:val="24"/>
-          <w:szCs w:val="24"/>
-        </w:rPr>
-        <w:t>kolléga</w:t>
-      </w:r>
-      <w:proofErr w:type="gramEnd"/>
-      <w:r>
-        <w:rPr>
-          <w:rFonts w:ascii="Suzuki Pro" w:hAnsi="Suzuki Pro" w:cstheme="minorHAnsi"/>
-          <w:sz w:val="24"/>
-          <w:szCs w:val="24"/>
-        </w:rPr>
-        <w:t>nőjétől, a HR osztályon tud kérni.</w:t>
+          <w:rFonts w:ascii="SuzukiPRORegular" w:hAnsi="SuzukiPRORegular" w:cstheme="minorHAnsi"/>
+          <w:sz w:val="24"/>
+          <w:szCs w:val="24"/>
+        </w:rPr>
+        <w:t xml:space="preserve"> Andrea kolléganőjétől</w:t>
+      </w:r>
+      <w:r>
+        <w:rPr>
+          <w:rFonts w:ascii="SuzukiPRORegular" w:hAnsi="SuzukiPRORegular" w:cstheme="minorHAnsi"/>
+          <w:sz w:val="24"/>
+          <w:szCs w:val="24"/>
+        </w:rPr>
+        <w:t xml:space="preserve"> is kérhet</w:t>
+      </w:r>
+      <w:r>
+        <w:rPr>
+          <w:rFonts w:ascii="SuzukiPRORegular" w:hAnsi="SuzukiPRORegular" w:cstheme="minorHAnsi"/>
+          <w:sz w:val="24"/>
+          <w:szCs w:val="24"/>
+        </w:rPr>
+        <w:t>, a HR osztályon</w:t>
+      </w:r>
+      <w:r>
+        <w:rPr>
+          <w:rFonts w:ascii="SuzukiPRORegular" w:hAnsi="SuzukiPRORegular" w:cstheme="minorHAnsi"/>
+          <w:sz w:val="24"/>
+          <w:szCs w:val="24"/>
+        </w:rPr>
+        <w:t>.</w:t>
       </w:r>
     </w:p>
     <w:p>
@@ -2354,140 +1599,28 @@
         <w:tabs>
           <w:tab w:val="left" w:pos="856"/>
         </w:tabs>
-        <w:spacing w:before="10" w:after="120"/>
+        <w:spacing w:after="120"/>
         <w:ind w:left="714" w:right="131" w:hanging="357"/>
         <w:rPr>
-          <w:rFonts w:ascii="Suzuki Pro" w:hAnsi="Suzuki Pro" w:cstheme="minorHAnsi"/>
-          <w:sz w:val="24"/>
-          <w:szCs w:val="24"/>
-        </w:rPr>
-      </w:pPr>
-      <w:r>
-        <w:rPr>
-          <w:rFonts w:ascii="Suzuki Pro" w:hAnsi="Suzuki Pro" w:cstheme="minorHAnsi"/>
-          <w:sz w:val="24"/>
-          <w:szCs w:val="24"/>
-        </w:rPr>
-        <w:t xml:space="preserve">Szűrővizsgálata </w:t>
-      </w:r>
-      <w:r>
-        <w:rPr>
-          <w:rFonts w:ascii="Suzuki Pro" w:hAnsi="Suzuki Pro" w:cstheme="minorHAnsi"/>
-          <w:sz w:val="24"/>
-          <w:szCs w:val="24"/>
-        </w:rPr>
-        <w:t>mellka</w:t>
-      </w:r>
-      <w:r>
-        <w:rPr>
-          <w:rFonts w:ascii="Suzuki Pro" w:hAnsi="Suzuki Pro" w:cstheme="minorHAnsi"/>
-          <w:sz w:val="24"/>
-          <w:szCs w:val="24"/>
-        </w:rPr>
-        <w:t xml:space="preserve">s </w:t>
-      </w:r>
-      <w:r>
-        <w:rPr>
-          <w:rFonts w:ascii="Suzuki Pro" w:hAnsi="Suzuki Pro" w:cstheme="minorHAnsi"/>
-          <w:sz w:val="24"/>
-          <w:szCs w:val="24"/>
-        </w:rPr>
-        <w:t>és</w:t>
-      </w:r>
-      <w:r>
-        <w:rPr>
-          <w:rFonts w:ascii="Suzuki Pro" w:hAnsi="Suzuki Pro" w:cstheme="minorHAnsi"/>
-          <w:sz w:val="24"/>
-          <w:szCs w:val="24"/>
-        </w:rPr>
-        <w:t xml:space="preserve"> panoráma röntgent</w:t>
-      </w:r>
-      <w:r>
-        <w:rPr>
-          <w:rFonts w:ascii="Suzuki Pro" w:hAnsi="Suzuki Pro" w:cstheme="minorHAnsi"/>
-          <w:sz w:val="24"/>
-          <w:szCs w:val="24"/>
-        </w:rPr>
-        <w:t xml:space="preserve"> is tartalmaz</w:t>
-      </w:r>
-      <w:r>
-        <w:rPr>
-          <w:rFonts w:ascii="Suzuki Pro" w:hAnsi="Suzuki Pro" w:cstheme="minorHAnsi"/>
-          <w:sz w:val="24"/>
-          <w:szCs w:val="24"/>
-        </w:rPr>
-        <w:t xml:space="preserve">. </w:t>
-      </w:r>
-      <w:r>
-        <w:rPr>
-          <w:rFonts w:ascii="Suzuki Pro" w:hAnsi="Suzuki Pro" w:cstheme="minorHAnsi"/>
-          <w:sz w:val="24"/>
-          <w:szCs w:val="24"/>
-        </w:rPr>
-        <w:t>H</w:t>
-      </w:r>
-      <w:r>
-        <w:rPr>
-          <w:rFonts w:ascii="Suzuki Pro" w:hAnsi="Suzuki Pro" w:cstheme="minorHAnsi"/>
-          <w:sz w:val="24"/>
-          <w:szCs w:val="24"/>
-        </w:rPr>
-        <w:t>a ezeket a</w:t>
-      </w:r>
-      <w:r>
-        <w:rPr>
-          <w:rFonts w:ascii="Suzuki Pro" w:hAnsi="Suzuki Pro" w:cstheme="minorHAnsi"/>
-          <w:sz w:val="24"/>
-          <w:szCs w:val="24"/>
-        </w:rPr>
-        <w:t xml:space="preserve"> vizsgálatokat Önnél 1</w:t>
-      </w:r>
-      <w:r>
-        <w:rPr>
-          <w:rFonts w:ascii="Suzuki Pro" w:hAnsi="Suzuki Pro" w:cstheme="minorHAnsi"/>
-          <w:spacing w:val="-4"/>
-          <w:sz w:val="24"/>
-          <w:szCs w:val="24"/>
-        </w:rPr>
-        <w:t xml:space="preserve"> </w:t>
-      </w:r>
-      <w:r>
-        <w:rPr>
-          <w:rFonts w:ascii="Suzuki Pro" w:hAnsi="Suzuki Pro" w:cstheme="minorHAnsi"/>
-          <w:sz w:val="24"/>
-          <w:szCs w:val="24"/>
-        </w:rPr>
-        <w:t>éven belül elvégezték, k</w:t>
-      </w:r>
-      <w:r>
-        <w:rPr>
-          <w:rFonts w:ascii="Suzuki Pro" w:hAnsi="Suzuki Pro" w:cstheme="minorHAnsi"/>
-          <w:sz w:val="24"/>
-          <w:szCs w:val="24"/>
-        </w:rPr>
-        <w:t>érjük</w:t>
-      </w:r>
-      <w:r>
-        <w:rPr>
-          <w:rFonts w:ascii="Suzuki Pro" w:hAnsi="Suzuki Pro" w:cstheme="minorHAnsi"/>
-          <w:sz w:val="24"/>
-          <w:szCs w:val="24"/>
-        </w:rPr>
-        <w:t>,</w:t>
-      </w:r>
-      <w:r>
-        <w:rPr>
-          <w:rFonts w:ascii="Suzuki Pro" w:hAnsi="Suzuki Pro" w:cstheme="minorHAnsi"/>
-          <w:sz w:val="24"/>
-          <w:szCs w:val="24"/>
-        </w:rPr>
-        <w:t xml:space="preserve"> jelezze azt a </w:t>
+          <w:rFonts w:ascii="SuzukiPRORegular" w:hAnsi="SuzukiPRORegular" w:cstheme="minorHAnsi"/>
+          <w:sz w:val="24"/>
+          <w:szCs w:val="24"/>
+        </w:rPr>
+      </w:pPr>
+      <w:r>
+        <w:rPr>
+          <w:rFonts w:ascii="SuzukiPRORegular" w:hAnsi="SuzukiPRORegular" w:cstheme="minorHAnsi"/>
+          <w:sz w:val="24"/>
+          <w:szCs w:val="24"/>
+        </w:rPr>
+        <w:t xml:space="preserve">Szűrővizsgálata mellkas és fogászati panoráma röntgent is tartalmaz. Kérjük, a </w:t>
       </w:r>
       <w:hyperlink r:id="rId9" w:history="1">
         <w:r>
           <w:rPr>
             <w:rStyle w:val="Hiperhivatkozs"/>
-            <w:rFonts w:ascii="Suzuki Pro" w:hAnsi="Suzuki Pro" w:cstheme="minorHAnsi"/>
+            <w:rFonts w:ascii="SuzukiPRORegular" w:hAnsi="SuzukiPRORegular" w:cstheme="minorHAnsi"/>
+            <w:color w:val="auto"/>
             <w:sz w:val="24"/>
             <w:szCs w:val="24"/>
           </w:rPr>
@@ -2496,23 +1629,32 @@
       </w:hyperlink>
       <w:r>
         <w:rPr>
-          <w:rFonts w:ascii="Suzuki Pro" w:hAnsi="Suzuki Pro" w:cstheme="minorHAnsi"/>
-          <w:sz w:val="24"/>
-          <w:szCs w:val="24"/>
-        </w:rPr>
-        <w:t xml:space="preserve"> e-mail címre</w:t>
-      </w:r>
-      <w:r>
-        <w:rPr>
-          <w:rFonts w:ascii="Suzuki Pro" w:hAnsi="Suzuki Pro" w:cstheme="minorHAnsi"/>
-          <w:sz w:val="24"/>
-          <w:szCs w:val="24"/>
-        </w:rPr>
-        <w:t>.</w:t>
-      </w:r>
-      <w:r>
-        <w:rPr>
-          <w:rFonts w:ascii="Suzuki Pro" w:hAnsi="Suzuki Pro" w:cstheme="minorHAnsi"/>
+          <w:rFonts w:ascii="SuzukiPRORegular" w:hAnsi="SuzukiPRORegular" w:cstheme="minorHAnsi"/>
+          <w:sz w:val="24"/>
+          <w:szCs w:val="24"/>
+        </w:rPr>
+        <w:t xml:space="preserve"> e-mail címre jelezze, ha ezeket a vizsgálatokat Önnél 1</w:t>
+      </w:r>
+      <w:r>
+        <w:rPr>
+          <w:rFonts w:ascii="SuzukiPRORegular" w:hAnsi="SuzukiPRORegular" w:cstheme="minorHAnsi"/>
+          <w:spacing w:val="-4"/>
+          <w:sz w:val="24"/>
+          <w:szCs w:val="24"/>
+        </w:rPr>
+        <w:t xml:space="preserve"> </w:t>
+      </w:r>
+      <w:r>
+        <w:rPr>
+          <w:rFonts w:ascii="SuzukiPRORegular" w:hAnsi="SuzukiPRORegular" w:cstheme="minorHAnsi"/>
+          <w:sz w:val="24"/>
+          <w:szCs w:val="24"/>
+        </w:rPr>
+        <w:t>éven belül elvégezték.</w:t>
+      </w:r>
+      <w:r>
+        <w:rPr>
+          <w:rFonts w:ascii="SuzukiPRORegular" w:hAnsi="SuzukiPRORegular" w:cstheme="minorHAnsi"/>
           <w:spacing w:val="-1"/>
           <w:sz w:val="24"/>
           <w:szCs w:val="24"/>
@@ -2521,7 +1663,7 @@
       </w:r>
       <w:r>
         <w:rPr>
-          <w:rFonts w:ascii="Suzuki Pro" w:hAnsi="Suzuki Pro" w:cstheme="minorHAnsi"/>
+          <w:rFonts w:ascii="SuzukiPRORegular" w:hAnsi="SuzukiPRORegular" w:cstheme="minorHAnsi"/>
           <w:sz w:val="24"/>
           <w:szCs w:val="24"/>
         </w:rPr>
@@ -2529,7 +1671,7 @@
       </w:r>
       <w:r>
         <w:rPr>
-          <w:rFonts w:ascii="Suzuki Pro" w:hAnsi="Suzuki Pro" w:cstheme="minorHAnsi"/>
+          <w:rFonts w:ascii="SuzukiPRORegular" w:hAnsi="SuzukiPRORegular" w:cstheme="minorHAnsi"/>
           <w:spacing w:val="-4"/>
           <w:sz w:val="24"/>
           <w:szCs w:val="24"/>
@@ -2538,7 +1680,7 @@
       </w:r>
       <w:r>
         <w:rPr>
-          <w:rFonts w:ascii="Suzuki Pro" w:hAnsi="Suzuki Pro" w:cstheme="minorHAnsi"/>
+          <w:rFonts w:ascii="SuzukiPRORegular" w:hAnsi="SuzukiPRORegular" w:cstheme="minorHAnsi"/>
           <w:sz w:val="24"/>
           <w:szCs w:val="24"/>
         </w:rPr>
@@ -2546,7 +1688,7 @@
       </w:r>
       <w:r>
         <w:rPr>
-          <w:rFonts w:ascii="Suzuki Pro" w:hAnsi="Suzuki Pro" w:cstheme="minorHAnsi"/>
+          <w:rFonts w:ascii="SuzukiPRORegular" w:hAnsi="SuzukiPRORegular" w:cstheme="minorHAnsi"/>
           <w:spacing w:val="-4"/>
           <w:sz w:val="24"/>
           <w:szCs w:val="24"/>
@@ -2555,32 +1697,142 @@
       </w:r>
       <w:r>
         <w:rPr>
-          <w:rFonts w:ascii="Suzuki Pro" w:hAnsi="Suzuki Pro" w:cstheme="minorHAnsi"/>
+          <w:rFonts w:ascii="SuzukiPRORegular" w:hAnsi="SuzukiPRORegular" w:cstheme="minorHAnsi"/>
+          <w:sz w:val="24"/>
+          <w:szCs w:val="24"/>
+        </w:rPr>
+        <w:t>igaz</w:t>
+      </w:r>
+      <w:r>
+        <w:rPr>
+          <w:rFonts w:ascii="SuzukiPRORegular" w:hAnsi="SuzukiPRORegular" w:cstheme="minorHAnsi"/>
+          <w:sz w:val="24"/>
+          <w:szCs w:val="24"/>
+        </w:rPr>
+        <w:t>, hölgyek</w:t>
+      </w:r>
+      <w:r>
+        <w:rPr>
+          <w:rFonts w:ascii="SuzukiPRORegular" w:hAnsi="SuzukiPRORegular" w:cstheme="minorHAnsi"/>
+          <w:spacing w:val="-3"/>
+          <w:sz w:val="24"/>
+          <w:szCs w:val="24"/>
+        </w:rPr>
+        <w:t xml:space="preserve"> </w:t>
+      </w:r>
+      <w:r>
+        <w:rPr>
+          <w:rFonts w:ascii="SuzukiPRORegular" w:hAnsi="SuzukiPRORegular" w:cstheme="minorHAnsi"/>
+          <w:sz w:val="24"/>
+          <w:szCs w:val="24"/>
+        </w:rPr>
+        <w:t>esetében</w:t>
+      </w:r>
+      <w:r>
+        <w:rPr>
+          <w:rFonts w:ascii="SuzukiPRORegular" w:hAnsi="SuzukiPRORegular" w:cstheme="minorHAnsi"/>
+          <w:spacing w:val="-52"/>
+          <w:sz w:val="24"/>
+          <w:szCs w:val="24"/>
+        </w:rPr>
+        <w:t xml:space="preserve"> </w:t>
+      </w:r>
+      <w:r>
+        <w:rPr>
+          <w:rFonts w:ascii="SuzukiPRORegular" w:hAnsi="SuzukiPRORegular" w:cstheme="minorHAnsi"/>
+          <w:sz w:val="24"/>
+          <w:szCs w:val="24"/>
+        </w:rPr>
+        <w:t>a</w:t>
+      </w:r>
+      <w:r>
+        <w:rPr>
+          <w:rFonts w:ascii="SuzukiPRORegular" w:hAnsi="SuzukiPRORegular" w:cstheme="minorHAnsi"/>
+          <w:spacing w:val="-2"/>
+          <w:sz w:val="24"/>
+          <w:szCs w:val="24"/>
+        </w:rPr>
+        <w:t xml:space="preserve"> </w:t>
+      </w:r>
+      <w:r>
+        <w:rPr>
+          <w:rFonts w:ascii="SuzukiPRORegular" w:hAnsi="SuzukiPRORegular" w:cstheme="minorHAnsi"/>
+          <w:sz w:val="24"/>
+          <w:szCs w:val="24"/>
+        </w:rPr>
+        <w:t>mammográfia</w:t>
+      </w:r>
+      <w:r>
+        <w:rPr>
+          <w:rFonts w:ascii="SuzukiPRORegular" w:hAnsi="SuzukiPRORegular" w:cstheme="minorHAnsi"/>
           <w:spacing w:val="-4"/>
           <w:sz w:val="24"/>
           <w:szCs w:val="24"/>
         </w:rPr>
-        <w:t xml:space="preserve">a teendő </w:t>
-      </w:r>
-      <w:r>
-        <w:rPr>
-          <w:rFonts w:ascii="Suzuki Pro" w:hAnsi="Suzuki Pro" w:cstheme="minorHAnsi"/>
-          <w:sz w:val="24"/>
-          <w:szCs w:val="24"/>
-        </w:rPr>
-        <w:t xml:space="preserve">a </w:t>
-      </w:r>
-      <w:r>
-        <w:rPr>
-          <w:rFonts w:ascii="Suzuki Pro" w:hAnsi="Suzuki Pro" w:cstheme="minorHAnsi"/>
-          <w:sz w:val="24"/>
-          <w:szCs w:val="24"/>
-        </w:rPr>
-        <w:t>mammográfia</w:t>
-      </w:r>
-      <w:r>
-        <w:rPr>
-          <w:rFonts w:ascii="Suzuki Pro" w:hAnsi="Suzuki Pro" w:cstheme="minorHAnsi"/>
+        <w:t xml:space="preserve"> </w:t>
+      </w:r>
+      <w:r>
+        <w:rPr>
+          <w:rFonts w:ascii="SuzukiPRORegular" w:hAnsi="SuzukiPRORegular" w:cstheme="minorHAnsi"/>
+          <w:sz w:val="24"/>
+          <w:szCs w:val="24"/>
+        </w:rPr>
+        <w:t>vizsgálatra.</w:t>
+      </w:r>
+      <w:r>
+        <w:rPr>
+          <w:rFonts w:ascii="SuzukiPRORegular" w:hAnsi="SuzukiPRORegular" w:cstheme="minorHAnsi"/>
+          <w:spacing w:val="-1"/>
+          <w:sz w:val="24"/>
+          <w:szCs w:val="24"/>
+        </w:rPr>
+        <w:t xml:space="preserve"> </w:t>
+      </w:r>
+      <w:r>
+        <w:rPr>
+          <w:rFonts w:ascii="SuzukiPRORegular" w:hAnsi="SuzukiPRORegular" w:cstheme="minorHAnsi"/>
+          <w:sz w:val="24"/>
+          <w:szCs w:val="24"/>
+        </w:rPr>
+        <w:t>Ezen</w:t>
+      </w:r>
+      <w:r>
+        <w:rPr>
+          <w:rFonts w:ascii="SuzukiPRORegular" w:hAnsi="SuzukiPRORegular" w:cstheme="minorHAnsi"/>
+          <w:spacing w:val="-1"/>
+          <w:sz w:val="24"/>
+          <w:szCs w:val="24"/>
+        </w:rPr>
+        <w:t xml:space="preserve"> </w:t>
+      </w:r>
+      <w:r>
+        <w:rPr>
+          <w:rFonts w:ascii="SuzukiPRORegular" w:hAnsi="SuzukiPRORegular" w:cstheme="minorHAnsi"/>
+          <w:sz w:val="24"/>
+          <w:szCs w:val="24"/>
+        </w:rPr>
+        <w:t>vizsgálatokat</w:t>
+      </w:r>
+      <w:r>
+        <w:rPr>
+          <w:rFonts w:ascii="SuzukiPRORegular" w:hAnsi="SuzukiPRORegular" w:cstheme="minorHAnsi"/>
+          <w:spacing w:val="-1"/>
+          <w:sz w:val="24"/>
+          <w:szCs w:val="24"/>
+        </w:rPr>
+        <w:t xml:space="preserve"> </w:t>
+      </w:r>
+      <w:r>
+        <w:rPr>
+          <w:rFonts w:ascii="SuzukiPRORegular" w:hAnsi="SuzukiPRORegular" w:cstheme="minorHAnsi"/>
+          <w:sz w:val="24"/>
+          <w:szCs w:val="24"/>
+        </w:rPr>
+        <w:t>szakmailag</w:t>
+      </w:r>
+      <w:r>
+        <w:rPr>
+          <w:rFonts w:ascii="SuzukiPRORegular" w:hAnsi="SuzukiPRORegular" w:cstheme="minorHAnsi"/>
           <w:spacing w:val="-4"/>
           <w:sz w:val="24"/>
           <w:szCs w:val="24"/>
@@ -2589,24 +1841,16 @@
       </w:r>
       <w:r>
         <w:rPr>
-          <w:rFonts w:ascii="Suzuki Pro" w:hAnsi="Suzuki Pro" w:cstheme="minorHAnsi"/>
-          <w:sz w:val="24"/>
-          <w:szCs w:val="24"/>
-        </w:rPr>
-        <w:t>vizsgálat esetén</w:t>
-      </w:r>
-      <w:r>
-        <w:rPr>
-          <w:rFonts w:ascii="Suzuki Pro" w:hAnsi="Suzuki Pro" w:cstheme="minorHAnsi"/>
-          <w:sz w:val="24"/>
-          <w:szCs w:val="24"/>
-        </w:rPr>
-        <w:t>.</w:t>
-      </w:r>
-      <w:r>
-        <w:rPr>
-          <w:rFonts w:ascii="Suzuki Pro" w:hAnsi="Suzuki Pro" w:cstheme="minorHAnsi"/>
-          <w:spacing w:val="-1"/>
+          <w:rFonts w:ascii="SuzukiPRORegular" w:hAnsi="SuzukiPRORegular" w:cstheme="minorHAnsi"/>
+          <w:sz w:val="24"/>
+          <w:szCs w:val="24"/>
+        </w:rPr>
+        <w:t>nem</w:t>
+      </w:r>
+      <w:r>
+        <w:rPr>
+          <w:rFonts w:ascii="SuzukiPRORegular" w:hAnsi="SuzukiPRORegular" w:cstheme="minorHAnsi"/>
+          <w:spacing w:val="-4"/>
           <w:sz w:val="24"/>
           <w:szCs w:val="24"/>
         </w:rPr>
@@ -2614,16 +1858,16 @@
       </w:r>
       <w:r>
         <w:rPr>
-          <w:rFonts w:ascii="Suzuki Pro" w:hAnsi="Suzuki Pro" w:cstheme="minorHAnsi"/>
-          <w:sz w:val="24"/>
-          <w:szCs w:val="24"/>
-        </w:rPr>
-        <w:t>Ezen</w:t>
-      </w:r>
-      <w:r>
-        <w:rPr>
-          <w:rFonts w:ascii="Suzuki Pro" w:hAnsi="Suzuki Pro" w:cstheme="minorHAnsi"/>
-          <w:spacing w:val="-1"/>
+          <w:rFonts w:ascii="SuzukiPRORegular" w:hAnsi="SuzukiPRORegular" w:cstheme="minorHAnsi"/>
+          <w:sz w:val="24"/>
+          <w:szCs w:val="24"/>
+        </w:rPr>
+        <w:t>indokolt 1</w:t>
+      </w:r>
+      <w:r>
+        <w:rPr>
+          <w:rFonts w:ascii="SuzukiPRORegular" w:hAnsi="SuzukiPRORegular" w:cstheme="minorHAnsi"/>
+          <w:spacing w:val="1"/>
           <w:sz w:val="24"/>
           <w:szCs w:val="24"/>
         </w:rPr>
@@ -2631,16 +1875,16 @@
       </w:r>
       <w:r>
         <w:rPr>
-          <w:rFonts w:ascii="Suzuki Pro" w:hAnsi="Suzuki Pro" w:cstheme="minorHAnsi"/>
-          <w:sz w:val="24"/>
-          <w:szCs w:val="24"/>
-        </w:rPr>
-        <w:t>vizsgálatokat</w:t>
-      </w:r>
-      <w:r>
-        <w:rPr>
-          <w:rFonts w:ascii="Suzuki Pro" w:hAnsi="Suzuki Pro" w:cstheme="minorHAnsi"/>
-          <w:spacing w:val="-1"/>
+          <w:rFonts w:ascii="SuzukiPRORegular" w:hAnsi="SuzukiPRORegular" w:cstheme="minorHAnsi"/>
+          <w:sz w:val="24"/>
+          <w:szCs w:val="24"/>
+        </w:rPr>
+        <w:t>éven</w:t>
+      </w:r>
+      <w:r>
+        <w:rPr>
+          <w:rFonts w:ascii="SuzukiPRORegular" w:hAnsi="SuzukiPRORegular" w:cstheme="minorHAnsi"/>
+          <w:spacing w:val="1"/>
           <w:sz w:val="24"/>
           <w:szCs w:val="24"/>
         </w:rPr>
@@ -2648,16 +1892,16 @@
       </w:r>
       <w:r>
         <w:rPr>
-          <w:rFonts w:ascii="Suzuki Pro" w:hAnsi="Suzuki Pro" w:cstheme="minorHAnsi"/>
-          <w:sz w:val="24"/>
-          <w:szCs w:val="24"/>
-        </w:rPr>
-        <w:t>szakmailag</w:t>
-      </w:r>
-      <w:r>
-        <w:rPr>
-          <w:rFonts w:ascii="Suzuki Pro" w:hAnsi="Suzuki Pro" w:cstheme="minorHAnsi"/>
-          <w:spacing w:val="-4"/>
+          <w:rFonts w:ascii="SuzukiPRORegular" w:hAnsi="SuzukiPRORegular" w:cstheme="minorHAnsi"/>
+          <w:sz w:val="24"/>
+          <w:szCs w:val="24"/>
+        </w:rPr>
+        <w:t>belül</w:t>
+      </w:r>
+      <w:r>
+        <w:rPr>
+          <w:rFonts w:ascii="SuzukiPRORegular" w:hAnsi="SuzukiPRORegular" w:cstheme="minorHAnsi"/>
+          <w:spacing w:val="1"/>
           <w:sz w:val="24"/>
           <w:szCs w:val="24"/>
         </w:rPr>
@@ -2665,16 +1909,16 @@
       </w:r>
       <w:r>
         <w:rPr>
-          <w:rFonts w:ascii="Suzuki Pro" w:hAnsi="Suzuki Pro" w:cstheme="minorHAnsi"/>
-          <w:sz w:val="24"/>
-          <w:szCs w:val="24"/>
-        </w:rPr>
-        <w:t>nem</w:t>
-      </w:r>
-      <w:r>
-        <w:rPr>
-          <w:rFonts w:ascii="Suzuki Pro" w:hAnsi="Suzuki Pro" w:cstheme="minorHAnsi"/>
-          <w:spacing w:val="-4"/>
+          <w:rFonts w:ascii="SuzukiPRORegular" w:hAnsi="SuzukiPRORegular" w:cstheme="minorHAnsi"/>
+          <w:sz w:val="24"/>
+          <w:szCs w:val="24"/>
+        </w:rPr>
+        <w:t>többször</w:t>
+      </w:r>
+      <w:r>
+        <w:rPr>
+          <w:rFonts w:ascii="SuzukiPRORegular" w:hAnsi="SuzukiPRORegular" w:cstheme="minorHAnsi"/>
+          <w:spacing w:val="1"/>
           <w:sz w:val="24"/>
           <w:szCs w:val="24"/>
         </w:rPr>
@@ -2682,40 +1926,49 @@
       </w:r>
       <w:r>
         <w:rPr>
-          <w:rFonts w:ascii="Suzuki Pro" w:hAnsi="Suzuki Pro" w:cstheme="minorHAnsi"/>
-          <w:sz w:val="24"/>
-          <w:szCs w:val="24"/>
-        </w:rPr>
-        <w:t xml:space="preserve">indokolt </w:t>
-      </w:r>
-      <w:r>
-        <w:rPr>
-          <w:rFonts w:ascii="Suzuki Pro" w:hAnsi="Suzuki Pro" w:cstheme="minorHAnsi"/>
-          <w:sz w:val="24"/>
-          <w:szCs w:val="24"/>
-        </w:rPr>
-        <w:t>1</w:t>
-      </w:r>
-      <w:r>
-        <w:rPr>
-          <w:rFonts w:ascii="Suzuki Pro" w:hAnsi="Suzuki Pro" w:cstheme="minorHAnsi"/>
+          <w:rFonts w:ascii="SuzukiPRORegular" w:hAnsi="SuzukiPRORegular" w:cstheme="minorHAnsi"/>
+          <w:sz w:val="24"/>
+          <w:szCs w:val="24"/>
+        </w:rPr>
+        <w:t>elvégezni. (Kivétel</w:t>
+      </w:r>
+      <w:r>
+        <w:rPr>
+          <w:rFonts w:ascii="SuzukiPRORegular" w:hAnsi="SuzukiPRORegular" w:cstheme="minorHAnsi"/>
           <w:spacing w:val="1"/>
           <w:sz w:val="24"/>
           <w:szCs w:val="24"/>
         </w:rPr>
+        <w:t xml:space="preserve"> a </w:t>
+      </w:r>
+      <w:r>
+        <w:rPr>
+          <w:rFonts w:ascii="SuzukiPRORegular" w:hAnsi="SuzukiPRORegular" w:cstheme="minorHAnsi"/>
+          <w:sz w:val="24"/>
+          <w:szCs w:val="24"/>
+        </w:rPr>
+        <w:t>panasz</w:t>
+      </w:r>
+      <w:r>
+        <w:rPr>
+          <w:rFonts w:ascii="SuzukiPRORegular" w:hAnsi="SuzukiPRORegular" w:cstheme="minorHAnsi"/>
+          <w:spacing w:val="1"/>
+          <w:sz w:val="24"/>
+          <w:szCs w:val="24"/>
+        </w:rPr>
         <w:t xml:space="preserve"> </w:t>
       </w:r>
       <w:r>
         <w:rPr>
-          <w:rFonts w:ascii="Suzuki Pro" w:hAnsi="Suzuki Pro" w:cstheme="minorHAnsi"/>
-          <w:sz w:val="24"/>
-          <w:szCs w:val="24"/>
-        </w:rPr>
-        <w:t>éven</w:t>
-      </w:r>
-      <w:r>
-        <w:rPr>
-          <w:rFonts w:ascii="Suzuki Pro" w:hAnsi="Suzuki Pro" w:cstheme="minorHAnsi"/>
+          <w:rFonts w:ascii="SuzukiPRORegular" w:hAnsi="SuzukiPRORegular" w:cstheme="minorHAnsi"/>
+          <w:sz w:val="24"/>
+          <w:szCs w:val="24"/>
+        </w:rPr>
+        <w:t>esetén</w:t>
+      </w:r>
+      <w:r>
+        <w:rPr>
+          <w:rFonts w:ascii="SuzukiPRORegular" w:hAnsi="SuzukiPRORegular" w:cstheme="minorHAnsi"/>
           <w:spacing w:val="1"/>
           <w:sz w:val="24"/>
           <w:szCs w:val="24"/>
@@ -2724,15 +1977,15 @@
       </w:r>
       <w:r>
         <w:rPr>
-          <w:rFonts w:ascii="Suzuki Pro" w:hAnsi="Suzuki Pro" w:cstheme="minorHAnsi"/>
-          <w:sz w:val="24"/>
-          <w:szCs w:val="24"/>
-        </w:rPr>
-        <w:t>belül</w:t>
-      </w:r>
-      <w:r>
-        <w:rPr>
-          <w:rFonts w:ascii="Suzuki Pro" w:hAnsi="Suzuki Pro" w:cstheme="minorHAnsi"/>
+          <w:rFonts w:ascii="SuzukiPRORegular" w:hAnsi="SuzukiPRORegular" w:cstheme="minorHAnsi"/>
+          <w:sz w:val="24"/>
+          <w:szCs w:val="24"/>
+        </w:rPr>
+        <w:t>történő</w:t>
+      </w:r>
+      <w:r>
+        <w:rPr>
+          <w:rFonts w:ascii="SuzukiPRORegular" w:hAnsi="SuzukiPRORegular" w:cstheme="minorHAnsi"/>
           <w:spacing w:val="1"/>
           <w:sz w:val="24"/>
           <w:szCs w:val="24"/>
@@ -2741,112 +1994,11 @@
       </w:r>
       <w:r>
         <w:rPr>
-          <w:rFonts w:ascii="Suzuki Pro" w:hAnsi="Suzuki Pro" w:cstheme="minorHAnsi"/>
-          <w:sz w:val="24"/>
-          <w:szCs w:val="24"/>
-        </w:rPr>
-        <w:t>többször</w:t>
-      </w:r>
-      <w:r>
-        <w:rPr>
-          <w:rFonts w:ascii="Suzuki Pro" w:hAnsi="Suzuki Pro" w:cstheme="minorHAnsi"/>
-          <w:spacing w:val="1"/>
-          <w:sz w:val="24"/>
-          <w:szCs w:val="24"/>
-        </w:rPr>
-        <w:t xml:space="preserve"> </w:t>
-      </w:r>
-      <w:r>
-        <w:rPr>
-          <w:rFonts w:ascii="Suzuki Pro" w:hAnsi="Suzuki Pro" w:cstheme="minorHAnsi"/>
-          <w:sz w:val="24"/>
-          <w:szCs w:val="24"/>
-        </w:rPr>
-        <w:t>is</w:t>
-      </w:r>
-      <w:r>
-        <w:rPr>
-          <w:rFonts w:ascii="Suzuki Pro" w:hAnsi="Suzuki Pro" w:cstheme="minorHAnsi"/>
-          <w:spacing w:val="1"/>
-          <w:sz w:val="24"/>
-          <w:szCs w:val="24"/>
-        </w:rPr>
-        <w:t xml:space="preserve"> </w:t>
-      </w:r>
-      <w:r>
-        <w:rPr>
-          <w:rFonts w:ascii="Suzuki Pro" w:hAnsi="Suzuki Pro" w:cstheme="minorHAnsi"/>
-          <w:sz w:val="24"/>
-          <w:szCs w:val="24"/>
-        </w:rPr>
-        <w:t>elvégez</w:t>
-      </w:r>
-      <w:r>
-        <w:rPr>
-          <w:rFonts w:ascii="Suzuki Pro" w:hAnsi="Suzuki Pro" w:cstheme="minorHAnsi"/>
-          <w:sz w:val="24"/>
-          <w:szCs w:val="24"/>
-        </w:rPr>
-        <w:t>ni</w:t>
-      </w:r>
-      <w:r>
-        <w:rPr>
-          <w:rFonts w:ascii="Suzuki Pro" w:hAnsi="Suzuki Pro" w:cstheme="minorHAnsi"/>
-          <w:sz w:val="24"/>
-          <w:szCs w:val="24"/>
-        </w:rPr>
-        <w:t xml:space="preserve"> </w:t>
-      </w:r>
-      <w:r>
-        <w:rPr>
-          <w:rFonts w:ascii="Suzuki Pro" w:hAnsi="Suzuki Pro" w:cstheme="minorHAnsi"/>
-          <w:sz w:val="24"/>
-          <w:szCs w:val="24"/>
-        </w:rPr>
-        <w:t>(kivéve</w:t>
-      </w:r>
-      <w:r>
-        <w:rPr>
-          <w:rFonts w:ascii="Suzuki Pro" w:hAnsi="Suzuki Pro" w:cstheme="minorHAnsi"/>
-          <w:spacing w:val="1"/>
-          <w:sz w:val="24"/>
-          <w:szCs w:val="24"/>
-        </w:rPr>
-        <w:t xml:space="preserve"> </w:t>
-      </w:r>
-      <w:r>
-        <w:rPr>
-          <w:rFonts w:ascii="Suzuki Pro" w:hAnsi="Suzuki Pro" w:cstheme="minorHAnsi"/>
-          <w:sz w:val="24"/>
-          <w:szCs w:val="24"/>
-        </w:rPr>
-        <w:t>panasz</w:t>
-      </w:r>
-      <w:r>
-        <w:rPr>
-          <w:rFonts w:ascii="Suzuki Pro" w:hAnsi="Suzuki Pro" w:cstheme="minorHAnsi"/>
-          <w:spacing w:val="1"/>
-          <w:sz w:val="24"/>
-          <w:szCs w:val="24"/>
-        </w:rPr>
-        <w:t xml:space="preserve"> </w:t>
-      </w:r>
-      <w:r>
-        <w:rPr>
-          <w:rFonts w:ascii="Suzuki Pro" w:hAnsi="Suzuki Pro" w:cstheme="minorHAnsi"/>
-          <w:sz w:val="24"/>
-          <w:szCs w:val="24"/>
-        </w:rPr>
-        <w:t>esetén</w:t>
-      </w:r>
-      <w:r>
-        <w:rPr>
-          <w:rFonts w:ascii="Suzuki Pro" w:hAnsi="Suzuki Pro" w:cstheme="minorHAnsi"/>
-          <w:spacing w:val="1"/>
-          <w:sz w:val="24"/>
-          <w:szCs w:val="24"/>
-        </w:rPr>
-        <w:t>).</w:t>
+          <w:rFonts w:ascii="SuzukiPRORegular" w:hAnsi="SuzukiPRORegular" w:cstheme="minorHAnsi"/>
+          <w:sz w:val="24"/>
+          <w:szCs w:val="24"/>
+        </w:rPr>
+        <w:t>kivizsgálás.)</w:t>
       </w:r>
     </w:p>
     <w:p>
@@ -2859,74 +2011,39 @@
         <w:tabs>
           <w:tab w:val="left" w:pos="856"/>
         </w:tabs>
-        <w:spacing w:before="10" w:after="120"/>
+        <w:spacing w:after="120"/>
         <w:ind w:left="714" w:right="131" w:hanging="357"/>
         <w:rPr>
-          <w:rFonts w:ascii="Suzuki Pro" w:hAnsi="Suzuki Pro" w:cstheme="minorHAnsi"/>
-          <w:sz w:val="24"/>
-          <w:szCs w:val="24"/>
-        </w:rPr>
-      </w:pPr>
-      <w:r>
-        <w:rPr>
-          <w:rFonts w:ascii="Suzuki Pro" w:hAnsi="Suzuki Pro" w:cstheme="minorHAnsi"/>
-          <w:sz w:val="24"/>
-          <w:szCs w:val="24"/>
-        </w:rPr>
-        <w:t>A fogászati állapotfelmérés előtt egyszerhasználatos fogkefét biztosítunk.</w:t>
+          <w:rFonts w:ascii="SuzukiPRORegular" w:hAnsi="SuzukiPRORegular" w:cstheme="minorHAnsi"/>
+          <w:sz w:val="24"/>
+          <w:szCs w:val="24"/>
+        </w:rPr>
+      </w:pPr>
+      <w:r>
+        <w:rPr>
+          <w:rFonts w:ascii="SuzukiPRORegular" w:hAnsi="SuzukiPRORegular" w:cstheme="minorHAnsi"/>
+          <w:sz w:val="24"/>
+          <w:szCs w:val="24"/>
+        </w:rPr>
+        <w:t>A fogászati állapotfelmérés előtt egyszerhasználatos fogkefét biztosítunk</w:t>
+      </w:r>
+      <w:r>
+        <w:rPr>
+          <w:rFonts w:ascii="SuzukiPRORegular" w:hAnsi="SuzukiPRORegular" w:cstheme="minorHAnsi"/>
+          <w:sz w:val="24"/>
+          <w:szCs w:val="24"/>
+        </w:rPr>
+        <w:t>.</w:t>
       </w:r>
     </w:p>
     <w:p>
       <w:pPr>
         <w:pStyle w:val="Szvegtrzs"/>
-        <w:spacing w:before="3"/>
+        <w:spacing w:after="120"/>
         <w:ind w:left="0" w:firstLine="0"/>
         <w:jc w:val="both"/>
         <w:rPr>
-          <w:rFonts w:ascii="Suzuki Pro" w:hAnsi="Suzuki Pro" w:cstheme="minorHAnsi"/>
-        </w:rPr>
-      </w:pPr>
-    </w:p>
-    <w:p>
-      <w:pPr>
-        <w:pStyle w:val="Listaszerbekezds"/>
-        <w:tabs>
-          <w:tab w:val="left" w:pos="855"/>
-          <w:tab w:val="left" w:pos="856"/>
-        </w:tabs>
-        <w:spacing w:before="146"/>
-        <w:ind w:left="856" w:firstLine="0"/>
-        <w:rPr>
-          <w:rFonts w:ascii="Suzuki Pro" w:hAnsi="Suzuki Pro" w:cstheme="minorHAnsi"/>
-          <w:b/>
-          <w:sz w:val="24"/>
-          <w:szCs w:val="24"/>
-        </w:rPr>
-      </w:pPr>
-      <w:r>
-        <w:rPr>
-          <w:rFonts w:ascii="Suzuki Pro" w:hAnsi="Suzuki Pro" w:cstheme="minorHAnsi"/>
-          <w:b/>
-          <w:sz w:val="24"/>
-          <w:szCs w:val="24"/>
-        </w:rPr>
-        <w:t>Együttműködését köszönjük!</w:t>
-      </w:r>
-    </w:p>
-    <w:p>
-      <w:pPr>
-        <w:pStyle w:val="Listaszerbekezds"/>
-        <w:tabs>
-          <w:tab w:val="left" w:pos="855"/>
-          <w:tab w:val="left" w:pos="856"/>
-        </w:tabs>
-        <w:spacing w:before="146"/>
-        <w:ind w:left="856" w:firstLine="0"/>
-        <w:rPr>
-          <w:rFonts w:ascii="Suzuki Pro" w:hAnsi="Suzuki Pro" w:cstheme="minorHAnsi"/>
-          <w:b/>
-          <w:sz w:val="24"/>
-          <w:szCs w:val="24"/>
+          <w:rFonts w:ascii="SuzukiPRORegular" w:hAnsi="SuzukiPRORegular" w:cstheme="minorHAnsi"/>
         </w:rPr>
       </w:pPr>
     </w:p>
@@ -2936,11 +2053,10 @@
         <w:tabs>
           <w:tab w:val="left" w:pos="856"/>
         </w:tabs>
-        <w:spacing w:before="10" w:line="357" w:lineRule="auto"/>
+        <w:spacing w:after="120"/>
         <w:ind w:left="720" w:right="131" w:firstLine="0"/>
-        <w:jc w:val="center"/>
-        <w:rPr>
-          <w:rFonts w:ascii="Suzuki Pro" w:hAnsi="Suzuki Pro" w:cstheme="minorHAnsi"/>
+        <w:rPr>
+          <w:rFonts w:ascii="SuzukiPRORegular" w:hAnsi="SuzukiPRORegular" w:cstheme="minorHAnsi"/>
           <w:b/>
           <w:bCs/>
           <w:sz w:val="24"/>
@@ -2949,13 +2065,13 @@
       </w:pPr>
       <w:r>
         <w:rPr>
-          <w:rFonts w:ascii="Suzuki Pro" w:hAnsi="Suzuki Pro" w:cstheme="minorHAnsi"/>
+          <w:rFonts w:ascii="SuzukiPRORegular" w:hAnsi="SuzukiPRORegular" w:cstheme="minorHAnsi"/>
           <w:b/>
           <w:bCs/>
           <w:sz w:val="24"/>
           <w:szCs w:val="24"/>
         </w:rPr>
-        <w:t>Jó egészséget kívánunk!</w:t>
+        <w:t>Együttműködését köszönjük!</w:t>
       </w:r>
     </w:p>
     <w:p>
@@ -2964,11 +2080,28 @@
         <w:tabs>
           <w:tab w:val="left" w:pos="856"/>
         </w:tabs>
-        <w:spacing w:before="10" w:line="357" w:lineRule="auto"/>
+        <w:spacing w:after="120"/>
+        <w:ind w:left="720" w:right="131" w:firstLine="0"/>
+        <w:rPr>
+          <w:rFonts w:ascii="SuzukiPRORegular" w:hAnsi="SuzukiPRORegular" w:cstheme="minorHAnsi"/>
+          <w:b/>
+          <w:bCs/>
+          <w:sz w:val="24"/>
+          <w:szCs w:val="24"/>
+        </w:rPr>
+      </w:pPr>
+    </w:p>
+    <w:p>
+      <w:pPr>
+        <w:pStyle w:val="Listaszerbekezds"/>
+        <w:tabs>
+          <w:tab w:val="left" w:pos="856"/>
+        </w:tabs>
+        <w:spacing w:after="120"/>
         <w:ind w:left="720" w:right="131" w:firstLine="0"/>
         <w:jc w:val="center"/>
         <w:rPr>
-          <w:rFonts w:ascii="Suzuki Pro" w:hAnsi="Suzuki Pro" w:cstheme="minorHAnsi"/>
+          <w:rFonts w:ascii="SuzukiPRORegular" w:hAnsi="SuzukiPRORegular" w:cstheme="minorHAnsi"/>
           <w:b/>
           <w:bCs/>
           <w:sz w:val="24"/>
@@ -2977,82 +2110,70 @@
       </w:pPr>
       <w:r>
         <w:rPr>
-          <w:rFonts w:ascii="Suzuki Pro" w:hAnsi="Suzuki Pro" w:cstheme="minorHAnsi"/>
+          <w:rFonts w:ascii="SuzukiPRORegular" w:hAnsi="SuzukiPRORegular" w:cstheme="minorHAnsi"/>
           <w:b/>
           <w:bCs/>
           <w:sz w:val="24"/>
           <w:szCs w:val="24"/>
-          <w:shd w:val="clear" w:color="auto" w:fill="FFFFFF"/>
-        </w:rPr>
-        <w:t xml:space="preserve">Hungária </w:t>
-      </w:r>
-      <w:proofErr w:type="spellStart"/>
-      <w:r>
-        <w:rPr>
-          <w:rFonts w:ascii="Suzuki Pro" w:hAnsi="Suzuki Pro" w:cstheme="minorHAnsi"/>
+        </w:rPr>
+        <w:t>Jó egészséget kívánunk és várjuk Önt menedzser szűrésünkre!</w:t>
+      </w:r>
+    </w:p>
+    <w:p>
+      <w:pPr>
+        <w:pStyle w:val="Listaszerbekezds"/>
+        <w:tabs>
+          <w:tab w:val="left" w:pos="856"/>
+        </w:tabs>
+        <w:spacing w:after="120"/>
+        <w:ind w:left="720" w:right="131" w:firstLine="0"/>
+        <w:jc w:val="center"/>
+        <w:rPr>
+          <w:rFonts w:ascii="SuzukiPRORegular" w:hAnsi="SuzukiPRORegular" w:cstheme="minorHAnsi"/>
           <w:b/>
           <w:bCs/>
           <w:sz w:val="24"/>
           <w:szCs w:val="24"/>
-          <w:shd w:val="clear" w:color="auto" w:fill="FFFFFF"/>
-        </w:rPr>
-        <w:t>Med</w:t>
-      </w:r>
-      <w:proofErr w:type="spellEnd"/>
-      <w:r>
-        <w:rPr>
-          <w:rFonts w:ascii="Suzuki Pro" w:hAnsi="Suzuki Pro" w:cstheme="minorHAnsi"/>
+        </w:rPr>
+      </w:pPr>
+      <w:r>
+        <w:rPr>
+          <w:rFonts w:ascii="SuzukiPRORegular" w:hAnsi="SuzukiPRORegular" w:cstheme="minorHAnsi"/>
           <w:b/>
           <w:bCs/>
           <w:sz w:val="24"/>
           <w:szCs w:val="24"/>
           <w:shd w:val="clear" w:color="auto" w:fill="FFFFFF"/>
         </w:rPr>
-        <w:t xml:space="preserve">-M Kft. és a Magyar Suzuki </w:t>
+        <w:t xml:space="preserve">Hungária </w:t>
       </w:r>
       <w:proofErr w:type="spellStart"/>
       <w:r>
         <w:rPr>
-          <w:rFonts w:ascii="Suzuki Pro" w:hAnsi="Suzuki Pro" w:cstheme="minorHAnsi"/>
+          <w:rFonts w:ascii="SuzukiPRORegular" w:hAnsi="SuzukiPRORegular" w:cstheme="minorHAnsi"/>
           <w:b/>
           <w:bCs/>
           <w:sz w:val="24"/>
           <w:szCs w:val="24"/>
           <w:shd w:val="clear" w:color="auto" w:fill="FFFFFF"/>
         </w:rPr>
-        <w:t>Zrt</w:t>
+        <w:t>Med</w:t>
       </w:r>
       <w:proofErr w:type="spellEnd"/>
       <w:r>
         <w:rPr>
-          <w:rFonts w:ascii="Suzuki Pro" w:hAnsi="Suzuki Pro" w:cstheme="minorHAnsi"/>
+          <w:rFonts w:ascii="SuzukiPRORegular" w:hAnsi="SuzukiPRORegular" w:cstheme="minorHAnsi"/>
           <w:b/>
           <w:bCs/>
           <w:sz w:val="24"/>
           <w:szCs w:val="24"/>
           <w:shd w:val="clear" w:color="auto" w:fill="FFFFFF"/>
         </w:rPr>
-        <w:t>. csapata</w:t>
-      </w:r>
-    </w:p>
-    <w:p>
-      <w:pPr>
-        <w:pStyle w:val="Listaszerbekezds"/>
-        <w:tabs>
-          <w:tab w:val="left" w:pos="855"/>
-          <w:tab w:val="left" w:pos="856"/>
-        </w:tabs>
-        <w:spacing w:before="146"/>
-        <w:ind w:left="856" w:firstLine="0"/>
-        <w:rPr>
-          <w:rFonts w:ascii="Suzuki Pro" w:hAnsi="Suzuki Pro" w:cstheme="minorHAnsi"/>
-          <w:b/>
-          <w:sz w:val="24"/>
-          <w:szCs w:val="24"/>
-        </w:rPr>
-      </w:pPr>
+        <w:t>-M Kft. és a Magyar Suzuki Zrt. csapata</w:t>
+      </w:r>
     </w:p>
     <w:sectPr>
+      <w:headerReference w:type="default" r:id="rId10"/>
       <w:pgSz w:w="11910" w:h="16840"/>
       <w:pgMar w:top="940" w:right="1280" w:bottom="280" w:left="1134" w:header="708" w:footer="708" w:gutter="0"/>
       <w:cols w:space="708"/>
@@ -3121,7 +2242,7 @@
         <w:lang w:eastAsia="hu-HU"/>
       </w:rPr>
       <w:drawing>
-        <wp:anchor distT="0" distB="0" distL="114300" distR="114300" simplePos="0" relativeHeight="251660288" behindDoc="1" locked="0" layoutInCell="1" allowOverlap="1" wp14:anchorId="557D605B" wp14:editId="45E669C9">
+        <wp:anchor distT="0" distB="0" distL="114300" distR="114300" simplePos="0" relativeHeight="251663360" behindDoc="1" locked="0" layoutInCell="1" allowOverlap="1" wp14:anchorId="5E1D2261" wp14:editId="1EBCBC7B">
           <wp:simplePos x="0" y="0"/>
           <wp:positionH relativeFrom="column">
             <wp:posOffset>4519295</wp:posOffset>
@@ -3132,7 +2253,7 @@
           <wp:extent cx="1485900" cy="328930"/>
           <wp:effectExtent l="0" t="0" r="0" b="0"/>
           <wp:wrapNone/>
-          <wp:docPr id="4" name="Kép 4" descr="horizontal"/>
+          <wp:docPr id="1" name="Kép 1" descr="horizontal"/>
           <wp:cNvGraphicFramePr>
             <a:graphicFrameLocks xmlns:a="http://schemas.openxmlformats.org/drawingml/2006/main" noChangeAspect="1"/>
           </wp:cNvGraphicFramePr>
@@ -3189,7 +2310,7 @@
         <w:lang w:eastAsia="hu-HU"/>
       </w:rPr>
       <w:drawing>
-        <wp:anchor distT="0" distB="0" distL="114300" distR="114300" simplePos="0" relativeHeight="251659264" behindDoc="1" locked="0" layoutInCell="1" allowOverlap="1" wp14:anchorId="33751EFC" wp14:editId="2F3270A8">
+        <wp:anchor distT="0" distB="0" distL="114300" distR="114300" simplePos="0" relativeHeight="251662336" behindDoc="1" locked="0" layoutInCell="1" allowOverlap="1" wp14:anchorId="49977AF9" wp14:editId="53557673">
           <wp:simplePos x="0" y="0"/>
           <wp:positionH relativeFrom="column">
             <wp:posOffset>471805</wp:posOffset>
@@ -3200,7 +2321,7 @@
           <wp:extent cx="1038225" cy="419100"/>
           <wp:effectExtent l="0" t="0" r="0" b="0"/>
           <wp:wrapNone/>
-          <wp:docPr id="5" name="Kép 5" descr="HMM_logo (11)"/>
+          <wp:docPr id="2" name="Kép 2" descr="HMM_logo (11)"/>
           <wp:cNvGraphicFramePr>
             <a:graphicFrameLocks xmlns:a="http://schemas.openxmlformats.org/drawingml/2006/main" noChangeAspect="1"/>
           </wp:cNvGraphicFramePr>
@@ -3254,7 +2375,241 @@
         <w:b/>
         <w:sz w:val="28"/>
       </w:rPr>
-      <w:t xml:space="preserve">Suzuki egészségút, </w:t>
+      <w:t xml:space="preserve">Suzuki </w:t>
+    </w:r>
+    <w:r>
+      <w:rPr>
+        <w:rFonts w:ascii="Suzuki Pro" w:hAnsi="Suzuki Pro" w:cstheme="minorHAnsi"/>
+        <w:b/>
+        <w:sz w:val="28"/>
+      </w:rPr>
+      <w:t>EGÉSZSÉGÚT</w:t>
+    </w:r>
+    <w:r>
+      <w:rPr>
+        <w:rFonts w:ascii="Suzuki Pro" w:hAnsi="Suzuki Pro" w:cstheme="minorHAnsi"/>
+        <w:b/>
+        <w:sz w:val="28"/>
+      </w:rPr>
+      <w:t xml:space="preserve">, </w:t>
+    </w:r>
+  </w:p>
+  <w:p>
+    <w:pPr>
+      <w:pStyle w:val="Szvegtrzs"/>
+      <w:ind w:left="0" w:firstLine="0"/>
+      <w:jc w:val="center"/>
+      <w:rPr>
+        <w:rFonts w:ascii="Suzuki Pro" w:hAnsi="Suzuki Pro" w:cstheme="minorHAnsi"/>
+        <w:b/>
+        <w:sz w:val="28"/>
+      </w:rPr>
+    </w:pPr>
+    <w:r>
+      <w:rPr>
+        <w:rFonts w:ascii="Suzuki Pro" w:hAnsi="Suzuki Pro" w:cstheme="minorHAnsi"/>
+        <w:b/>
+        <w:sz w:val="28"/>
+      </w:rPr>
+      <w:t xml:space="preserve">az érezhető </w:t>
+    </w:r>
+    <w:r>
+      <w:rPr>
+        <w:rFonts w:ascii="Suzuki Pro" w:hAnsi="Suzuki Pro" w:cstheme="minorHAnsi"/>
+        <w:b/>
+        <w:sz w:val="28"/>
+      </w:rPr>
+      <w:t>TÖRŐDÉS</w:t>
+    </w:r>
+    <w:r>
+      <w:rPr>
+        <w:rFonts w:ascii="Suzuki Pro" w:hAnsi="Suzuki Pro" w:cstheme="minorHAnsi"/>
+        <w:b/>
+        <w:sz w:val="28"/>
+      </w:rPr>
+      <w:t>…</w:t>
+    </w:r>
+  </w:p>
+  <w:p>
+    <w:pPr>
+      <w:pStyle w:val="lfej"/>
+    </w:pPr>
+  </w:p>
+</w:hdr>
+</file>
+
+<file path=word/header2.xml><?xml version="1.0" encoding="utf-8"?>
+<w:hdr xmlns:wpc="http://schemas.microsoft.com/office/word/2010/wordprocessingCanvas" xmlns:cx="http://schemas.microsoft.com/office/drawing/2014/chartex" xmlns:mc="http://schemas.openxmlformats.org/markup-compatibility/2006" xmlns:o="urn:schemas-microsoft-com:office:office" xmlns:r="http://schemas.openxmlformats.org/officeDocument/2006/relationships" xmlns:m="http://schemas.openxmlformats.org/officeDocument/2006/math" xmlns:v="urn:schemas-microsoft-com:vml" xmlns:wp14="http://schemas.microsoft.com/office/word/2010/wordprocessingDrawing" xmlns:wp="http://schemas.openxmlformats.org/drawingml/2006/wordprocessingDrawing" xmlns:w10="urn:schemas-microsoft-com:office:word" xmlns:w="http://schemas.openxmlformats.org/wordprocessingml/2006/main" xmlns:w14="http://schemas.microsoft.com/office/word/2010/wordml" xmlns:w15="http://schemas.microsoft.com/office/word/2012/wordml" xmlns:w16se="http://schemas.microsoft.com/office/word/2015/wordml/symex" xmlns:wpg="http://schemas.microsoft.com/office/word/2010/wordprocessingGroup" xmlns:wpi="http://schemas.microsoft.com/office/word/2010/wordprocessingInk" xmlns:wne="http://schemas.microsoft.com/office/word/2006/wordml" xmlns:wps="http://schemas.microsoft.com/office/word/2010/wordprocessingShape" mc:Ignorable="w14 w15 w16se wp14">
+  <w:p>
+    <w:pPr>
+      <w:pStyle w:val="Szvegtrzs"/>
+      <w:ind w:left="0" w:firstLine="0"/>
+      <w:jc w:val="center"/>
+      <w:rPr>
+        <w:rFonts w:ascii="Suzuki Pro" w:hAnsi="Suzuki Pro" w:cstheme="minorHAnsi"/>
+        <w:b/>
+        <w:sz w:val="28"/>
+      </w:rPr>
+    </w:pPr>
+    <w:r>
+      <w:rPr>
+        <w:rFonts w:ascii="Suzuki Pro" w:hAnsi="Suzuki Pro" w:cstheme="minorHAnsi"/>
+        <w:b/>
+        <w:noProof/>
+        <w:sz w:val="28"/>
+        <w:lang w:eastAsia="hu-HU"/>
+      </w:rPr>
+      <w:drawing>
+        <wp:anchor distT="0" distB="0" distL="114300" distR="114300" simplePos="0" relativeHeight="251666432" behindDoc="1" locked="0" layoutInCell="1" allowOverlap="1" wp14:anchorId="1FC7CBBB" wp14:editId="4EDF8CB7">
+          <wp:simplePos x="0" y="0"/>
+          <wp:positionH relativeFrom="column">
+            <wp:posOffset>4519295</wp:posOffset>
+          </wp:positionH>
+          <wp:positionV relativeFrom="paragraph">
+            <wp:posOffset>31750</wp:posOffset>
+          </wp:positionV>
+          <wp:extent cx="1485900" cy="328930"/>
+          <wp:effectExtent l="0" t="0" r="0" b="0"/>
+          <wp:wrapNone/>
+          <wp:docPr id="3" name="Kép 3" descr="horizontal"/>
+          <wp:cNvGraphicFramePr>
+            <a:graphicFrameLocks xmlns:a="http://schemas.openxmlformats.org/drawingml/2006/main" noChangeAspect="1"/>
+          </wp:cNvGraphicFramePr>
+          <a:graphic xmlns:a="http://schemas.openxmlformats.org/drawingml/2006/main">
+            <a:graphicData uri="http://schemas.openxmlformats.org/drawingml/2006/picture">
+              <pic:pic xmlns:pic="http://schemas.openxmlformats.org/drawingml/2006/picture">
+                <pic:nvPicPr>
+                  <pic:cNvPr id="0" name="Picture 3" descr="horizontal"/>
+                  <pic:cNvPicPr>
+                    <a:picLocks noChangeAspect="1" noChangeArrowheads="1"/>
+                  </pic:cNvPicPr>
+                </pic:nvPicPr>
+                <pic:blipFill>
+                  <a:blip r:embed="rId1" cstate="print">
+                    <a:extLst>
+                      <a:ext uri="{28A0092B-C50C-407E-A947-70E740481C1C}">
+                        <a14:useLocalDpi xmlns:a14="http://schemas.microsoft.com/office/drawing/2010/main" val="0"/>
+                      </a:ext>
+                    </a:extLst>
+                  </a:blip>
+                  <a:srcRect/>
+                  <a:stretch>
+                    <a:fillRect/>
+                  </a:stretch>
+                </pic:blipFill>
+                <pic:spPr bwMode="auto">
+                  <a:xfrm>
+                    <a:off x="0" y="0"/>
+                    <a:ext cx="1485900" cy="328930"/>
+                  </a:xfrm>
+                  <a:prstGeom prst="rect">
+                    <a:avLst/>
+                  </a:prstGeom>
+                  <a:noFill/>
+                </pic:spPr>
+              </pic:pic>
+            </a:graphicData>
+          </a:graphic>
+          <wp14:sizeRelH relativeFrom="page">
+            <wp14:pctWidth>0</wp14:pctWidth>
+          </wp14:sizeRelH>
+          <wp14:sizeRelV relativeFrom="page">
+            <wp14:pctHeight>0</wp14:pctHeight>
+          </wp14:sizeRelV>
+        </wp:anchor>
+      </w:drawing>
+    </w:r>
+    <w:r>
+      <w:rPr>
+        <w:rFonts w:ascii="Suzuki Pro" w:hAnsi="Suzuki Pro" w:cstheme="minorHAnsi"/>
+        <w:b/>
+        <w:noProof/>
+        <w:sz w:val="28"/>
+        <w:lang w:eastAsia="hu-HU"/>
+      </w:rPr>
+      <w:drawing>
+        <wp:anchor distT="0" distB="0" distL="114300" distR="114300" simplePos="0" relativeHeight="251665408" behindDoc="1" locked="0" layoutInCell="1" allowOverlap="1" wp14:anchorId="712622C4" wp14:editId="5F10B4AF">
+          <wp:simplePos x="0" y="0"/>
+          <wp:positionH relativeFrom="column">
+            <wp:posOffset>471805</wp:posOffset>
+          </wp:positionH>
+          <wp:positionV relativeFrom="paragraph">
+            <wp:posOffset>3810</wp:posOffset>
+          </wp:positionV>
+          <wp:extent cx="1038225" cy="419100"/>
+          <wp:effectExtent l="0" t="0" r="0" b="0"/>
+          <wp:wrapNone/>
+          <wp:docPr id="6" name="Kép 6" descr="HMM_logo (11)"/>
+          <wp:cNvGraphicFramePr>
+            <a:graphicFrameLocks xmlns:a="http://schemas.openxmlformats.org/drawingml/2006/main" noChangeAspect="1"/>
+          </wp:cNvGraphicFramePr>
+          <a:graphic xmlns:a="http://schemas.openxmlformats.org/drawingml/2006/main">
+            <a:graphicData uri="http://schemas.openxmlformats.org/drawingml/2006/picture">
+              <pic:pic xmlns:pic="http://schemas.openxmlformats.org/drawingml/2006/picture">
+                <pic:nvPicPr>
+                  <pic:cNvPr id="0" name="Picture 2" descr="HMM_logo (11)"/>
+                  <pic:cNvPicPr>
+                    <a:picLocks noChangeAspect="1" noChangeArrowheads="1"/>
+                  </pic:cNvPicPr>
+                </pic:nvPicPr>
+                <pic:blipFill>
+                  <a:blip r:embed="rId2">
+                    <a:extLst>
+                      <a:ext uri="{28A0092B-C50C-407E-A947-70E740481C1C}">
+                        <a14:useLocalDpi xmlns:a14="http://schemas.microsoft.com/office/drawing/2010/main" val="0"/>
+                      </a:ext>
+                    </a:extLst>
+                  </a:blip>
+                  <a:srcRect/>
+                  <a:stretch>
+                    <a:fillRect/>
+                  </a:stretch>
+                </pic:blipFill>
+                <pic:spPr bwMode="auto">
+                  <a:xfrm>
+                    <a:off x="0" y="0"/>
+                    <a:ext cx="1038225" cy="419100"/>
+                  </a:xfrm>
+                  <a:prstGeom prst="rect">
+                    <a:avLst/>
+                  </a:prstGeom>
+                  <a:noFill/>
+                </pic:spPr>
+              </pic:pic>
+            </a:graphicData>
+          </a:graphic>
+          <wp14:sizeRelH relativeFrom="page">
+            <wp14:pctWidth>0</wp14:pctWidth>
+          </wp14:sizeRelH>
+          <wp14:sizeRelV relativeFrom="page">
+            <wp14:pctHeight>0</wp14:pctHeight>
+          </wp14:sizeRelV>
+        </wp:anchor>
+      </w:drawing>
+    </w:r>
+    <w:r>
+      <w:rPr>
+        <w:rFonts w:ascii="Suzuki Pro" w:hAnsi="Suzuki Pro" w:cstheme="minorHAnsi"/>
+        <w:b/>
+        <w:sz w:val="28"/>
+      </w:rPr>
+      <w:t xml:space="preserve">Suzuki </w:t>
+    </w:r>
+    <w:r>
+      <w:rPr>
+        <w:rFonts w:ascii="Suzuki Pro" w:hAnsi="Suzuki Pro" w:cstheme="minorHAnsi"/>
+        <w:b/>
+        <w:sz w:val="28"/>
+      </w:rPr>
+      <w:t>EGÉSZSÉGÚT</w:t>
+    </w:r>
+    <w:r>
+      <w:rPr>
+        <w:rFonts w:ascii="Suzuki Pro" w:hAnsi="Suzuki Pro" w:cstheme="minorHAnsi"/>
+        <w:b/>
+        <w:sz w:val="28"/>
+      </w:rPr>
+      <w:t xml:space="preserve">, </w:t>
     </w:r>
   </w:p>
   <w:p>
@@ -3284,7 +2639,23 @@
         <w:b/>
         <w:sz w:val="28"/>
       </w:rPr>
-      <w:t xml:space="preserve"> érezhető törődés…</w:t>
+      <w:t xml:space="preserve"> érezhető </w:t>
+    </w:r>
+    <w:r>
+      <w:rPr>
+        <w:rFonts w:ascii="Suzuki Pro" w:hAnsi="Suzuki Pro" w:cstheme="minorHAnsi"/>
+        <w:b/>
+        <w:sz w:val="28"/>
+      </w:rPr>
+      <w:t>TÖRŐDÉS</w:t>
+    </w:r>
+    <w:r>
+      <w:rPr>
+        <w:rFonts w:ascii="Suzuki Pro" w:hAnsi="Suzuki Pro" w:cstheme="minorHAnsi"/>
+        <w:b/>
+        <w:sz w:val="28"/>
+      </w:rPr>
+      <w:t>…</w:t>
     </w:r>
   </w:p>
   <w:p>
@@ -5503,8 +4874,8 @@
       <w:u w:val="single"/>
     </w:rPr>
   </w:style>
-  <w:style w:type="character" w:customStyle="1" w:styleId="UnresolvedMention">
-    <w:name w:val="Unresolved Mention"/>
+  <w:style w:type="character" w:customStyle="1" w:styleId="Feloldatlanmegemlts1">
+    <w:name w:val="Feloldatlan megemlítés1"/>
     <w:basedOn w:val="Bekezdsalapbettpusa"/>
     <w:uiPriority w:val="99"/>
     <w:semiHidden/>

</xml_diff>